<commit_message>
#66713, #66721 - corrections to batched model, network w/ multiple location, updated java version, 10.3.3 release
</commit_message>
<xml_diff>
--- a/Doc/SaTScan Version History.docx
+++ b/Doc/SaTScan Version History.docx
@@ -1,6 +1,6 @@
 
 <file path=word/document.xml><?xml version="1.0" encoding="utf-8"?>
-<w:document xmlns:wpc="http://schemas.microsoft.com/office/word/2010/wordprocessingCanvas" xmlns:cx="http://schemas.microsoft.com/office/drawing/2014/chartex" xmlns:cx1="http://schemas.microsoft.com/office/drawing/2015/9/8/chartex" xmlns:cx2="http://schemas.microsoft.com/office/drawing/2015/10/21/chartex" xmlns:cx3="http://schemas.microsoft.com/office/drawing/2016/5/9/chartex" xmlns:cx4="http://schemas.microsoft.com/office/drawing/2016/5/10/chartex" xmlns:cx5="http://schemas.microsoft.com/office/drawing/2016/5/11/chartex" xmlns:cx6="http://schemas.microsoft.com/office/drawing/2016/5/12/chartex" xmlns:cx7="http://schemas.microsoft.com/office/drawing/2016/5/13/chartex" xmlns:cx8="http://schemas.microsoft.com/office/drawing/2016/5/14/chartex" xmlns:mc="http://schemas.openxmlformats.org/markup-compatibility/2006" xmlns:aink="http://schemas.microsoft.com/office/drawing/2016/ink" xmlns:am3d="http://schemas.microsoft.com/office/drawing/2017/model3d" xmlns:o="urn:schemas-microsoft-com:office:office" xmlns:oel="http://schemas.microsoft.com/office/2019/extlst" xmlns:r="http://schemas.openxmlformats.org/officeDocument/2006/relationships" xmlns:m="http://schemas.openxmlformats.org/officeDocument/2006/math" xmlns:v="urn:schemas-microsoft-com:vml" xmlns:wp14="http://schemas.microsoft.com/office/word/2010/wordprocessingDrawing" xmlns:wp="http://schemas.openxmlformats.org/drawingml/2006/wordprocessingDrawing" xmlns:w10="urn:schemas-microsoft-com:office:word" xmlns:w="http://schemas.openxmlformats.org/wordprocessingml/2006/main" xmlns:w14="http://schemas.microsoft.com/office/word/2010/wordml" xmlns:w15="http://schemas.microsoft.com/office/word/2012/wordml" xmlns:w16cex="http://schemas.microsoft.com/office/word/2018/wordml/cex" xmlns:w16cid="http://schemas.microsoft.com/office/word/2016/wordml/cid" xmlns:w16="http://schemas.microsoft.com/office/word/2018/wordml" xmlns:w16sdtdh="http://schemas.microsoft.com/office/word/2020/wordml/sdtdatahash" xmlns:w16se="http://schemas.microsoft.com/office/word/2015/wordml/symex" xmlns:wpg="http://schemas.microsoft.com/office/word/2010/wordprocessingGroup" xmlns:wpi="http://schemas.microsoft.com/office/word/2010/wordprocessingInk" xmlns:wne="http://schemas.microsoft.com/office/word/2006/wordml" xmlns:wps="http://schemas.microsoft.com/office/word/2010/wordprocessingShape" mc:Ignorable="w14 w15 w16se w16cid w16 w16cex w16sdtdh wp14">
+<w:document xmlns:wpc="http://schemas.microsoft.com/office/word/2010/wordprocessingCanvas" xmlns:cx="http://schemas.microsoft.com/office/drawing/2014/chartex" xmlns:cx1="http://schemas.microsoft.com/office/drawing/2015/9/8/chartex" xmlns:cx2="http://schemas.microsoft.com/office/drawing/2015/10/21/chartex" xmlns:cx3="http://schemas.microsoft.com/office/drawing/2016/5/9/chartex" xmlns:cx4="http://schemas.microsoft.com/office/drawing/2016/5/10/chartex" xmlns:cx5="http://schemas.microsoft.com/office/drawing/2016/5/11/chartex" xmlns:cx6="http://schemas.microsoft.com/office/drawing/2016/5/12/chartex" xmlns:cx7="http://schemas.microsoft.com/office/drawing/2016/5/13/chartex" xmlns:cx8="http://schemas.microsoft.com/office/drawing/2016/5/14/chartex" xmlns:mc="http://schemas.openxmlformats.org/markup-compatibility/2006" xmlns:aink="http://schemas.microsoft.com/office/drawing/2016/ink" xmlns:am3d="http://schemas.microsoft.com/office/drawing/2017/model3d" xmlns:o="urn:schemas-microsoft-com:office:office" xmlns:oel="http://schemas.microsoft.com/office/2019/extlst" xmlns:r="http://schemas.openxmlformats.org/officeDocument/2006/relationships" xmlns:m="http://schemas.openxmlformats.org/officeDocument/2006/math" xmlns:v="urn:schemas-microsoft-com:vml" xmlns:wp14="http://schemas.microsoft.com/office/word/2010/wordprocessingDrawing" xmlns:wp="http://schemas.openxmlformats.org/drawingml/2006/wordprocessingDrawing" xmlns:w10="urn:schemas-microsoft-com:office:word" xmlns:w="http://schemas.openxmlformats.org/wordprocessingml/2006/main" xmlns:w14="http://schemas.microsoft.com/office/word/2010/wordml" xmlns:w15="http://schemas.microsoft.com/office/word/2012/wordml" xmlns:w16cex="http://schemas.microsoft.com/office/word/2018/wordml/cex" xmlns:w16cid="http://schemas.microsoft.com/office/word/2016/wordml/cid" xmlns:w16="http://schemas.microsoft.com/office/word/2018/wordml" xmlns:w16du="http://schemas.microsoft.com/office/word/2023/wordml/word16du" xmlns:w16sdtdh="http://schemas.microsoft.com/office/word/2020/wordml/sdtdatahash" xmlns:w16sdtfl="http://schemas.microsoft.com/office/word/2024/wordml/sdtformatlock" xmlns:w16se="http://schemas.microsoft.com/office/word/2015/wordml/symex" xmlns:wpg="http://schemas.microsoft.com/office/word/2010/wordprocessingGroup" xmlns:wpi="http://schemas.microsoft.com/office/word/2010/wordprocessingInk" xmlns:wne="http://schemas.microsoft.com/office/word/2006/wordml" xmlns:wps="http://schemas.microsoft.com/office/word/2010/wordprocessingShape" mc:Ignorable="w14 w15 w16se w16cid w16 w16cex w16sdtdh w16sdtfl w16du wp14">
   <w:body>
     <w:p>
       <w:pPr>
@@ -1618,13 +1618,25 @@
         <w:rPr>
           <w:b/>
         </w:rPr>
-        <w:t xml:space="preserve">Version 10.3.2, </w:t>
-      </w:r>
-      <w:r>
-        <w:rPr>
-          <w:b/>
-        </w:rPr>
-        <w:t>June</w:t>
+        <w:t>Version 10.3.</w:t>
+      </w:r>
+      <w:r>
+        <w:rPr>
+          <w:b/>
+        </w:rPr>
+        <w:t>3</w:t>
+      </w:r>
+      <w:r>
+        <w:rPr>
+          <w:b/>
+        </w:rPr>
+        <w:t xml:space="preserve">, </w:t>
+      </w:r>
+      <w:r>
+        <w:rPr>
+          <w:b/>
+        </w:rPr>
+        <w:t>September</w:t>
       </w:r>
       <w:r>
         <w:rPr>
@@ -1667,13 +1679,7 @@
         <w:t xml:space="preserve">Correction </w:t>
       </w:r>
       <w:r>
-        <w:t>in</w:t>
-      </w:r>
-      <w:r>
-        <w:t xml:space="preserve"> purely spatial Bernoulli drilldown</w:t>
-      </w:r>
-      <w:r>
-        <w:t xml:space="preserve"> when using line-list data</w:t>
+        <w:t>in the batched model when using multiple data sets</w:t>
       </w:r>
       <w:r>
         <w:t>.</w:t>
@@ -1684,43 +1690,53 @@
         <w:ind w:left="144" w:hanging="144"/>
       </w:pPr>
       <w:r>
-        <w:t>Correction in Google Maps with performing prospective analysis and drilldown.</w:t>
-      </w:r>
-    </w:p>
-    <w:p>
-      <w:pPr>
-        <w:ind w:left="144" w:hanging="144"/>
-      </w:pPr>
-      <w:r>
-        <w:t>Updated compression library.</w:t>
-      </w:r>
-    </w:p>
-    <w:p>
-      <w:pPr>
-        <w:ind w:left="360" w:hanging="360"/>
-        <w:rPr>
-          <w:b/>
-        </w:rPr>
-      </w:pPr>
-    </w:p>
-    <w:p>
-      <w:pPr>
-        <w:ind w:left="360" w:hanging="360"/>
-        <w:rPr>
-          <w:b/>
-        </w:rPr>
-      </w:pPr>
-      <w:r>
-        <w:rPr>
-          <w:b/>
-        </w:rPr>
-        <w:t xml:space="preserve">Version 10.3.1, </w:t>
-      </w:r>
-      <w:r>
-        <w:rPr>
-          <w:b/>
-        </w:rPr>
-        <w:t>May</w:t>
+        <w:t xml:space="preserve">Correction </w:t>
+      </w:r>
+      <w:r>
+        <w:t xml:space="preserve">when using </w:t>
+      </w:r>
+      <w:r>
+        <w:t xml:space="preserve">the </w:t>
+      </w:r>
+      <w:r>
+        <w:t xml:space="preserve">network file </w:t>
+      </w:r>
+      <w:r>
+        <w:t>with</w:t>
+      </w:r>
+      <w:r>
+        <w:t xml:space="preserve"> multiple locations</w:t>
+      </w:r>
+      <w:r>
+        <w:t>.</w:t>
+      </w:r>
+    </w:p>
+    <w:p>
+      <w:pPr>
+        <w:ind w:left="360" w:hanging="360"/>
+        <w:rPr>
+          <w:b/>
+        </w:rPr>
+      </w:pPr>
+    </w:p>
+    <w:p>
+      <w:pPr>
+        <w:ind w:left="360" w:hanging="360"/>
+        <w:rPr>
+          <w:b/>
+        </w:rPr>
+      </w:pPr>
+      <w:r>
+        <w:rPr>
+          <w:b/>
+        </w:rPr>
+        <w:t xml:space="preserve">Version 10.3.2, </w:t>
+      </w:r>
+      <w:r>
+        <w:rPr>
+          <w:b/>
+        </w:rPr>
+        <w:t>June</w:t>
       </w:r>
       <w:r>
         <w:rPr>
@@ -1760,7 +1776,14 @@
         <w:ind w:left="144" w:hanging="144"/>
       </w:pPr>
       <w:r>
-        <w:t>Removed mistaken hardcode in purely spatial Bernoulli drilldown.</w:t>
+        <w:lastRenderedPageBreak/>
+        <w:t xml:space="preserve">Correction </w:t>
+      </w:r>
+      <w:r>
+        <w:t>in</w:t>
+      </w:r>
+      <w:r>
+        <w:t xml:space="preserve"> purely spatial Bernoulli drilldown when using line-list data.</w:t>
       </w:r>
     </w:p>
     <w:p>
@@ -1768,7 +1791,7 @@
         <w:ind w:left="144" w:hanging="144"/>
       </w:pPr>
       <w:r>
-        <w:t>Day of week adjustment with purely spatial Bernoulli drilldown made automatic.</w:t>
+        <w:t>Correction in Google Maps with performing prospective analysis and drilldown.</w:t>
       </w:r>
     </w:p>
     <w:p>
@@ -1776,69 +1799,35 @@
         <w:ind w:left="144" w:hanging="144"/>
       </w:pPr>
       <w:r>
-        <w:t xml:space="preserve">Corrected </w:t>
-      </w:r>
-      <w:r>
-        <w:t>location dot</w:t>
-      </w:r>
-      <w:r>
-        <w:t xml:space="preserve"> color in Google Maps output.</w:t>
-      </w:r>
-    </w:p>
-    <w:p>
-      <w:pPr>
-        <w:ind w:left="144" w:hanging="144"/>
-      </w:pPr>
-      <w:r>
-        <w:t>Update</w:t>
-      </w:r>
-      <w:r>
-        <w:t>d</w:t>
-      </w:r>
-      <w:r>
-        <w:t xml:space="preserve"> temporal graph to use user specified data set names.</w:t>
-      </w:r>
-    </w:p>
-    <w:p>
-      <w:pPr>
-        <w:ind w:left="144" w:hanging="144"/>
-      </w:pPr>
-      <w:r>
-        <w:t xml:space="preserve">Corrected disabling error in </w:t>
-      </w:r>
-      <w:r>
-        <w:t>graphical interface</w:t>
-      </w:r>
-      <w:r>
-        <w:t xml:space="preserve"> for GINI option.</w:t>
-      </w:r>
-    </w:p>
-    <w:p>
-      <w:pPr>
-        <w:ind w:left="360" w:hanging="360"/>
-        <w:rPr>
-          <w:b/>
-        </w:rPr>
-      </w:pPr>
-    </w:p>
-    <w:p>
-      <w:pPr>
-        <w:ind w:left="360" w:hanging="360"/>
-        <w:rPr>
-          <w:b/>
-        </w:rPr>
-      </w:pPr>
-      <w:r>
-        <w:rPr>
-          <w:b/>
-        </w:rPr>
-        <w:t xml:space="preserve">Version 10.3, </w:t>
-      </w:r>
-      <w:r>
-        <w:rPr>
-          <w:b/>
-        </w:rPr>
-        <w:t>March</w:t>
+        <w:t>Updated compression library.</w:t>
+      </w:r>
+    </w:p>
+    <w:p>
+      <w:pPr>
+        <w:ind w:left="360" w:hanging="360"/>
+        <w:rPr>
+          <w:b/>
+        </w:rPr>
+      </w:pPr>
+    </w:p>
+    <w:p>
+      <w:pPr>
+        <w:ind w:left="360" w:hanging="360"/>
+        <w:rPr>
+          <w:b/>
+        </w:rPr>
+      </w:pPr>
+      <w:r>
+        <w:rPr>
+          <w:b/>
+        </w:rPr>
+        <w:t xml:space="preserve">Version 10.3.1, </w:t>
+      </w:r>
+      <w:r>
+        <w:rPr>
+          <w:b/>
+        </w:rPr>
+        <w:t>May</w:t>
       </w:r>
       <w:r>
         <w:rPr>
@@ -1870,7 +1859,7 @@
           <w:i/>
           <w:iCs/>
         </w:rPr>
-        <w:t>New Analytical Features</w:t>
+        <w:t>Fixes</w:t>
       </w:r>
     </w:p>
     <w:p>
@@ -1878,90 +1867,29 @@
         <w:ind w:left="144" w:hanging="144"/>
       </w:pPr>
       <w:r>
-        <w:t>Probability model for batched data, where it is only known whether there is zero or at least one positive observation in each batch.</w:t>
-      </w:r>
-    </w:p>
-    <w:p>
-      <w:pPr>
-        <w:ind w:left="360" w:hanging="360"/>
-        <w:rPr>
-          <w:i/>
-        </w:rPr>
-      </w:pPr>
-    </w:p>
-    <w:p>
-      <w:pPr>
-        <w:ind w:left="360" w:hanging="360"/>
-        <w:rPr>
-          <w:bCs/>
-        </w:rPr>
-      </w:pPr>
-      <w:r>
-        <w:rPr>
-          <w:i/>
-        </w:rPr>
-        <w:t xml:space="preserve">Other </w:t>
-      </w:r>
-      <w:r>
-        <w:rPr>
-          <w:i/>
-        </w:rPr>
-        <w:t>Improvements</w:t>
-      </w:r>
-      <w:r>
-        <w:rPr>
-          <w:bCs/>
-        </w:rPr>
-        <w:t xml:space="preserve"> </w:t>
+        <w:t>Removed mistaken hardcode in purely spatial Bernoulli drilldown.</w:t>
       </w:r>
     </w:p>
     <w:p>
       <w:pPr>
         <w:ind w:left="144" w:hanging="144"/>
-        <w:rPr>
-          <w:bCs/>
-        </w:rPr>
-      </w:pPr>
-      <w:r>
-        <w:t>Better display of location and line-list data in Google Maps output.</w:t>
+      </w:pPr>
+      <w:r>
+        <w:t>Day of week adjustment with purely spatial Bernoulli drilldown made automatic.</w:t>
       </w:r>
     </w:p>
     <w:p>
       <w:pPr>
         <w:ind w:left="144" w:hanging="144"/>
-        <w:rPr>
-          <w:bCs/>
-        </w:rPr>
-      </w:pPr>
-      <w:r>
-        <w:rPr>
-          <w:bCs/>
-        </w:rPr>
-        <w:t>Ability to name data sets when using multiple data sets.</w:t>
-      </w:r>
-    </w:p>
-    <w:p>
-      <w:pPr>
-        <w:ind w:left="360" w:hanging="360"/>
-        <w:rPr>
-          <w:bCs/>
-        </w:rPr>
-      </w:pPr>
-    </w:p>
-    <w:p>
-      <w:pPr>
-        <w:ind w:left="360" w:hanging="360"/>
-        <w:rPr>
-          <w:i/>
-          <w:iCs/>
-        </w:rPr>
-      </w:pPr>
-      <w:r>
-        <w:rPr>
-          <w:i/>
-          <w:iCs/>
-        </w:rPr>
-        <w:t>Minor Fixes</w:t>
+      </w:pPr>
+      <w:r>
+        <w:t xml:space="preserve">Corrected </w:t>
+      </w:r>
+      <w:r>
+        <w:t>location dot</w:t>
+      </w:r>
+      <w:r>
+        <w:t xml:space="preserve"> color in Google Maps output.</w:t>
       </w:r>
     </w:p>
     <w:p>
@@ -1969,7 +1897,13 @@
         <w:ind w:left="144" w:hanging="144"/>
       </w:pPr>
       <w:r>
-        <w:t>Recurrence intervals partly reported with words when greater than one thousand years.</w:t>
+        <w:t>Update</w:t>
+      </w:r>
+      <w:r>
+        <w:t>d</w:t>
+      </w:r>
+      <w:r>
+        <w:t xml:space="preserve"> temporal graph to use user specified data set names.</w:t>
       </w:r>
     </w:p>
     <w:p>
@@ -1977,69 +1911,47 @@
         <w:ind w:left="144" w:hanging="144"/>
       </w:pPr>
       <w:r>
-        <w:t>Improved layout of the main results file regarding additional output files, iterative scan statistic, and multiple data sets,</w:t>
-      </w:r>
-    </w:p>
-    <w:p>
-      <w:pPr>
-        <w:ind w:left="360" w:hanging="360"/>
-      </w:pPr>
-      <w:r>
-        <w:t>Corrected problem when including purely spatial clusters in a time-stratified adjusted analysis.</w:t>
-      </w:r>
-    </w:p>
-    <w:p>
-      <w:pPr>
-        <w:ind w:left="360" w:hanging="360"/>
-      </w:pPr>
-      <w:r>
-        <w:t>Avoids rarely occurring program crash for continuous Poisson model analyses.</w:t>
-      </w:r>
-    </w:p>
-    <w:p>
-      <w:pPr>
-        <w:ind w:left="360" w:hanging="360"/>
-      </w:pPr>
-      <w:r>
-        <w:t>Proper handling when cancelling jobs on the multiple analyses interface.</w:t>
-      </w:r>
-    </w:p>
-    <w:p>
-      <w:pPr>
-        <w:ind w:left="360" w:hanging="360"/>
-      </w:pPr>
-      <w:r>
-        <w:t>For temporal graphs, fixed export functionality and which clusters to report.</w:t>
-      </w:r>
-    </w:p>
-    <w:p>
-      <w:pPr>
-        <w:ind w:left="360" w:hanging="360"/>
-      </w:pPr>
-      <w:r>
-        <w:t>Restored run history functionality that was mistakenly removed in version 10.0.</w:t>
-      </w:r>
-    </w:p>
-    <w:p>
-      <w:pPr>
-        <w:ind w:left="360" w:hanging="360"/>
-        <w:rPr>
-          <w:b/>
-        </w:rPr>
-      </w:pPr>
-    </w:p>
-    <w:p>
-      <w:pPr>
-        <w:ind w:left="360" w:hanging="360"/>
-        <w:rPr>
-          <w:b/>
-        </w:rPr>
-      </w:pPr>
-      <w:r>
-        <w:rPr>
-          <w:b/>
-        </w:rPr>
-        <w:t>Version 10.2.5, September 2024</w:t>
+        <w:t xml:space="preserve">Corrected disabling error in </w:t>
+      </w:r>
+      <w:r>
+        <w:t>graphical interface</w:t>
+      </w:r>
+      <w:r>
+        <w:t xml:space="preserve"> for GINI option.</w:t>
+      </w:r>
+    </w:p>
+    <w:p>
+      <w:pPr>
+        <w:ind w:left="360" w:hanging="360"/>
+        <w:rPr>
+          <w:b/>
+        </w:rPr>
+      </w:pPr>
+    </w:p>
+    <w:p>
+      <w:pPr>
+        <w:ind w:left="360" w:hanging="360"/>
+        <w:rPr>
+          <w:b/>
+        </w:rPr>
+      </w:pPr>
+      <w:r>
+        <w:rPr>
+          <w:b/>
+        </w:rPr>
+        <w:t xml:space="preserve">Version 10.3, </w:t>
+      </w:r>
+      <w:r>
+        <w:rPr>
+          <w:b/>
+        </w:rPr>
+        <w:t>March</w:t>
+      </w:r>
+      <w:r>
+        <w:rPr>
+          <w:b/>
+        </w:rPr>
+        <w:t xml:space="preserve"> 2025</w:t>
       </w:r>
     </w:p>
     <w:p>
@@ -2065,7 +1977,7 @@
           <w:i/>
           <w:iCs/>
         </w:rPr>
-        <w:t>Fixes</w:t>
+        <w:t>New Analytical Features</w:t>
       </w:r>
     </w:p>
     <w:p>
@@ -2073,29 +1985,168 @@
         <w:ind w:left="144" w:hanging="144"/>
       </w:pPr>
       <w:r>
-        <w:t>Disable the Gumbel approximation when scanning for low rates or for high or low rates. When using the Default P-value option, while scanning for low rates or for high or low rates, the Gumbel approximation is no longer used to calculate cluster p-values.</w:t>
-      </w:r>
-    </w:p>
-    <w:p>
-      <w:pPr>
-        <w:ind w:left="360" w:hanging="360"/>
-        <w:rPr>
-          <w:b/>
-        </w:rPr>
-      </w:pPr>
-    </w:p>
-    <w:p>
-      <w:pPr>
-        <w:ind w:left="360" w:hanging="360"/>
-        <w:rPr>
-          <w:b/>
-        </w:rPr>
-      </w:pPr>
-      <w:r>
-        <w:rPr>
-          <w:b/>
-        </w:rPr>
-        <w:t>Version 10.2.4, August 2024</w:t>
+        <w:t>Probability model for batched data, where it is only known whether there is zero or at least one positive observation in each batch.</w:t>
+      </w:r>
+    </w:p>
+    <w:p>
+      <w:pPr>
+        <w:ind w:left="360" w:hanging="360"/>
+        <w:rPr>
+          <w:i/>
+        </w:rPr>
+      </w:pPr>
+    </w:p>
+    <w:p>
+      <w:pPr>
+        <w:ind w:left="360" w:hanging="360"/>
+        <w:rPr>
+          <w:bCs/>
+        </w:rPr>
+      </w:pPr>
+      <w:r>
+        <w:rPr>
+          <w:i/>
+        </w:rPr>
+        <w:t xml:space="preserve">Other </w:t>
+      </w:r>
+      <w:r>
+        <w:rPr>
+          <w:i/>
+        </w:rPr>
+        <w:t>Improvements</w:t>
+      </w:r>
+      <w:r>
+        <w:rPr>
+          <w:bCs/>
+        </w:rPr>
+        <w:t xml:space="preserve"> </w:t>
+      </w:r>
+    </w:p>
+    <w:p>
+      <w:pPr>
+        <w:ind w:left="144" w:hanging="144"/>
+        <w:rPr>
+          <w:bCs/>
+        </w:rPr>
+      </w:pPr>
+      <w:r>
+        <w:t>Better display of location and line-list data in Google Maps output.</w:t>
+      </w:r>
+    </w:p>
+    <w:p>
+      <w:pPr>
+        <w:ind w:left="144" w:hanging="144"/>
+        <w:rPr>
+          <w:bCs/>
+        </w:rPr>
+      </w:pPr>
+      <w:r>
+        <w:rPr>
+          <w:bCs/>
+        </w:rPr>
+        <w:t>Ability to name data sets when using multiple data sets.</w:t>
+      </w:r>
+    </w:p>
+    <w:p>
+      <w:pPr>
+        <w:ind w:left="360" w:hanging="360"/>
+        <w:rPr>
+          <w:bCs/>
+        </w:rPr>
+      </w:pPr>
+    </w:p>
+    <w:p>
+      <w:pPr>
+        <w:ind w:left="360" w:hanging="360"/>
+        <w:rPr>
+          <w:i/>
+          <w:iCs/>
+        </w:rPr>
+      </w:pPr>
+      <w:r>
+        <w:rPr>
+          <w:i/>
+          <w:iCs/>
+        </w:rPr>
+        <w:t>Minor Fixes</w:t>
+      </w:r>
+    </w:p>
+    <w:p>
+      <w:pPr>
+        <w:ind w:left="144" w:hanging="144"/>
+      </w:pPr>
+      <w:r>
+        <w:t>Recurrence intervals partly reported with words when greater than one thousand years.</w:t>
+      </w:r>
+    </w:p>
+    <w:p>
+      <w:pPr>
+        <w:ind w:left="144" w:hanging="144"/>
+      </w:pPr>
+      <w:r>
+        <w:t>Improved layout of the main results file regarding additional output files, iterative scan statistic, and multiple data sets,</w:t>
+      </w:r>
+    </w:p>
+    <w:p>
+      <w:pPr>
+        <w:ind w:left="360" w:hanging="360"/>
+      </w:pPr>
+      <w:r>
+        <w:t>Corrected problem when including purely spatial clusters in a time-stratified adjusted analysis.</w:t>
+      </w:r>
+    </w:p>
+    <w:p>
+      <w:pPr>
+        <w:ind w:left="360" w:hanging="360"/>
+      </w:pPr>
+      <w:r>
+        <w:t>Avoids rarely occurring program crash for continuous Poisson model analyses.</w:t>
+      </w:r>
+    </w:p>
+    <w:p>
+      <w:pPr>
+        <w:ind w:left="360" w:hanging="360"/>
+      </w:pPr>
+      <w:r>
+        <w:t>Proper handling when cancelling jobs on the multiple analyses interface.</w:t>
+      </w:r>
+    </w:p>
+    <w:p>
+      <w:pPr>
+        <w:ind w:left="360" w:hanging="360"/>
+      </w:pPr>
+      <w:r>
+        <w:t>For temporal graphs, fixed export functionality and which clusters to report.</w:t>
+      </w:r>
+    </w:p>
+    <w:p>
+      <w:pPr>
+        <w:ind w:left="360" w:hanging="360"/>
+      </w:pPr>
+      <w:r>
+        <w:t>Restored run history functionality that was mistakenly removed in version 10.0.</w:t>
+      </w:r>
+    </w:p>
+    <w:p>
+      <w:pPr>
+        <w:ind w:left="360" w:hanging="360"/>
+        <w:rPr>
+          <w:b/>
+        </w:rPr>
+      </w:pPr>
+    </w:p>
+    <w:p>
+      <w:pPr>
+        <w:ind w:left="360" w:hanging="360"/>
+        <w:rPr>
+          <w:b/>
+        </w:rPr>
+      </w:pPr>
+      <w:r>
+        <w:rPr>
+          <w:b/>
+        </w:rPr>
+        <w:t>Version 10.2.5, September 2024</w:t>
       </w:r>
     </w:p>
     <w:p>
@@ -2129,35 +2180,29 @@
         <w:ind w:left="144" w:hanging="144"/>
       </w:pPr>
       <w:r>
-        <w:t>Correction to the Location Information file when using the Multiple Locations Per Observation File</w:t>
-      </w:r>
-      <w:r>
-        <w:t xml:space="preserve"> (correction related to 10.2.2 update)</w:t>
-      </w:r>
-      <w:r>
-        <w:t>.</w:t>
-      </w:r>
-    </w:p>
-    <w:p>
-      <w:pPr>
-        <w:ind w:left="360" w:hanging="360"/>
-        <w:rPr>
-          <w:b/>
-        </w:rPr>
-      </w:pPr>
-    </w:p>
-    <w:p>
-      <w:pPr>
-        <w:ind w:left="360" w:hanging="360"/>
-        <w:rPr>
-          <w:b/>
-        </w:rPr>
-      </w:pPr>
-      <w:r>
-        <w:rPr>
-          <w:b/>
-        </w:rPr>
-        <w:t>Version 10.2.3, August 2024</w:t>
+        <w:t>Disable the Gumbel approximation when scanning for low rates or for high or low rates. When using the Default P-value option, while scanning for low rates or for high or low rates, the Gumbel approximation is no longer used to calculate cluster p-values.</w:t>
+      </w:r>
+    </w:p>
+    <w:p>
+      <w:pPr>
+        <w:ind w:left="360" w:hanging="360"/>
+        <w:rPr>
+          <w:b/>
+        </w:rPr>
+      </w:pPr>
+    </w:p>
+    <w:p>
+      <w:pPr>
+        <w:ind w:left="360" w:hanging="360"/>
+        <w:rPr>
+          <w:b/>
+        </w:rPr>
+      </w:pPr>
+      <w:r>
+        <w:rPr>
+          <w:b/>
+        </w:rPr>
+        <w:t>Version 10.2.4, August 2024</w:t>
       </w:r>
     </w:p>
     <w:p>
@@ -2191,29 +2236,35 @@
         <w:ind w:left="144" w:hanging="144"/>
       </w:pPr>
       <w:r>
-        <w:t>Updated graphical user interface to address 508 compliance issues.</w:t>
-      </w:r>
-    </w:p>
-    <w:p>
-      <w:pPr>
-        <w:ind w:left="360" w:hanging="360"/>
-        <w:rPr>
-          <w:b/>
-        </w:rPr>
-      </w:pPr>
-    </w:p>
-    <w:p>
-      <w:pPr>
-        <w:ind w:left="360" w:hanging="360"/>
-        <w:rPr>
-          <w:b/>
-        </w:rPr>
-      </w:pPr>
-      <w:r>
-        <w:rPr>
-          <w:b/>
-        </w:rPr>
-        <w:t>Version 10.2.2, July 2024</w:t>
+        <w:t>Correction to the Location Information file when using the Multiple Locations Per Observation File</w:t>
+      </w:r>
+      <w:r>
+        <w:t xml:space="preserve"> (correction related to 10.2.2 update)</w:t>
+      </w:r>
+      <w:r>
+        <w:t>.</w:t>
+      </w:r>
+    </w:p>
+    <w:p>
+      <w:pPr>
+        <w:ind w:left="360" w:hanging="360"/>
+        <w:rPr>
+          <w:b/>
+        </w:rPr>
+      </w:pPr>
+    </w:p>
+    <w:p>
+      <w:pPr>
+        <w:ind w:left="360" w:hanging="360"/>
+        <w:rPr>
+          <w:b/>
+        </w:rPr>
+      </w:pPr>
+      <w:r>
+        <w:rPr>
+          <w:b/>
+        </w:rPr>
+        <w:t>Version 10.2.3, August 2024</w:t>
       </w:r>
     </w:p>
     <w:p>
@@ -2239,6 +2290,7 @@
           <w:i/>
           <w:iCs/>
         </w:rPr>
+        <w:lastRenderedPageBreak/>
         <w:t>Fixes</w:t>
       </w:r>
     </w:p>
@@ -2247,46 +2299,29 @@
         <w:ind w:left="144" w:hanging="144"/>
       </w:pPr>
       <w:r>
-        <w:t xml:space="preserve">Correction to </w:t>
-      </w:r>
-      <w:r>
-        <w:t xml:space="preserve">the </w:t>
-      </w:r>
-      <w:r>
-        <w:t>Location Information file when using the Multiple Locations Per Observation File.</w:t>
-      </w:r>
-    </w:p>
-    <w:p>
-      <w:pPr>
-        <w:ind w:left="144" w:hanging="144"/>
-      </w:pPr>
-      <w:r>
-        <w:t>Correction to Google Earth/Maps to escape reserved characters</w:t>
-      </w:r>
-      <w:r>
-        <w:t>.</w:t>
-      </w:r>
-    </w:p>
-    <w:p>
-      <w:pPr>
-        <w:ind w:left="360" w:hanging="360"/>
-        <w:rPr>
-          <w:b/>
-        </w:rPr>
-      </w:pPr>
-    </w:p>
-    <w:p>
-      <w:pPr>
-        <w:ind w:left="360" w:hanging="360"/>
-        <w:rPr>
-          <w:b/>
-        </w:rPr>
-      </w:pPr>
-      <w:r>
-        <w:rPr>
-          <w:b/>
-        </w:rPr>
-        <w:t>Version 10.2.1, July 2024</w:t>
+        <w:t>Updated graphical user interface to address 508 compliance issues.</w:t>
+      </w:r>
+    </w:p>
+    <w:p>
+      <w:pPr>
+        <w:ind w:left="360" w:hanging="360"/>
+        <w:rPr>
+          <w:b/>
+        </w:rPr>
+      </w:pPr>
+    </w:p>
+    <w:p>
+      <w:pPr>
+        <w:ind w:left="360" w:hanging="360"/>
+        <w:rPr>
+          <w:b/>
+        </w:rPr>
+      </w:pPr>
+      <w:r>
+        <w:rPr>
+          <w:b/>
+        </w:rPr>
+        <w:t>Version 10.2.2, July 2024</w:t>
       </w:r>
     </w:p>
     <w:p>
@@ -2317,7 +2352,7 @@
     </w:p>
     <w:p>
       <w:pPr>
-        <w:ind w:left="360" w:hanging="360"/>
+        <w:ind w:left="144" w:hanging="144"/>
       </w:pPr>
       <w:r>
         <w:t xml:space="preserve">Correction to </w:t>
@@ -2326,22 +2361,15 @@
         <w:t xml:space="preserve">the </w:t>
       </w:r>
       <w:r>
-        <w:t xml:space="preserve">percentage of the cases </w:t>
-      </w:r>
-      <w:r>
-        <w:t xml:space="preserve">reported </w:t>
-      </w:r>
-      <w:r>
-        <w:t xml:space="preserve">in </w:t>
-      </w:r>
-      <w:r>
-        <w:t xml:space="preserve">the </w:t>
-      </w:r>
-      <w:r>
-        <w:t>temporal graphs</w:t>
-      </w:r>
-      <w:r>
-        <w:t xml:space="preserve"> output</w:t>
+        <w:t>Location Information file when using the Multiple Locations Per Observation File.</w:t>
+      </w:r>
+    </w:p>
+    <w:p>
+      <w:pPr>
+        <w:ind w:left="144" w:hanging="144"/>
+      </w:pPr>
+      <w:r>
+        <w:t>Correction to Google Earth/Maps to escape reserved characters</w:t>
       </w:r>
       <w:r>
         <w:t>.</w:t>
@@ -2349,47 +2377,24 @@
     </w:p>
     <w:p>
       <w:pPr>
-        <w:ind w:left="144" w:hanging="144"/>
-      </w:pPr>
-      <w:r>
-        <w:t xml:space="preserve">Correction to </w:t>
-      </w:r>
-      <w:r>
-        <w:t xml:space="preserve">Google Maps </w:t>
-      </w:r>
-      <w:r>
-        <w:t xml:space="preserve">HTML and </w:t>
-      </w:r>
-      <w:r>
-        <w:t>JavaScript</w:t>
-      </w:r>
-      <w:r>
-        <w:t xml:space="preserve"> to escape reserved characters</w:t>
-      </w:r>
-      <w:r>
-        <w:t>.</w:t>
-      </w:r>
-    </w:p>
-    <w:p>
-      <w:pPr>
-        <w:ind w:left="360" w:hanging="360"/>
-        <w:rPr>
-          <w:b/>
-        </w:rPr>
-      </w:pPr>
-    </w:p>
-    <w:p>
-      <w:pPr>
-        <w:ind w:left="360" w:hanging="360"/>
-        <w:rPr>
-          <w:b/>
-        </w:rPr>
-      </w:pPr>
-      <w:r>
-        <w:rPr>
-          <w:b/>
-        </w:rPr>
-        <w:t>Version 10.2, June 2024</w:t>
+        <w:ind w:left="360" w:hanging="360"/>
+        <w:rPr>
+          <w:b/>
+        </w:rPr>
+      </w:pPr>
+    </w:p>
+    <w:p>
+      <w:pPr>
+        <w:ind w:left="360" w:hanging="360"/>
+        <w:rPr>
+          <w:b/>
+        </w:rPr>
+      </w:pPr>
+      <w:r>
+        <w:rPr>
+          <w:b/>
+        </w:rPr>
+        <w:t>Version 10.2.1, July 2024</w:t>
       </w:r>
     </w:p>
     <w:p>
@@ -2415,26 +2420,39 @@
           <w:i/>
           <w:iCs/>
         </w:rPr>
-        <w:t>Improvements</w:t>
-      </w:r>
-    </w:p>
-    <w:p>
-      <w:pPr>
-        <w:ind w:left="360" w:hanging="360"/>
-      </w:pPr>
-      <w:r>
-        <w:t xml:space="preserve">Ability to use </w:t>
-      </w:r>
-      <w:r>
-        <w:t>multiple coordinates per location when scanning on a network.</w:t>
-      </w:r>
-    </w:p>
-    <w:p>
-      <w:pPr>
-        <w:ind w:left="360" w:hanging="360"/>
-      </w:pPr>
-      <w:r>
-        <w:t xml:space="preserve">Improved wizard for importing case files with descriptive line list data about individuals. </w:t>
+        <w:t>Fixes</w:t>
+      </w:r>
+    </w:p>
+    <w:p>
+      <w:pPr>
+        <w:ind w:left="360" w:hanging="360"/>
+      </w:pPr>
+      <w:r>
+        <w:t xml:space="preserve">Correction to </w:t>
+      </w:r>
+      <w:r>
+        <w:t xml:space="preserve">the </w:t>
+      </w:r>
+      <w:r>
+        <w:t xml:space="preserve">percentage of the cases </w:t>
+      </w:r>
+      <w:r>
+        <w:t xml:space="preserve">reported </w:t>
+      </w:r>
+      <w:r>
+        <w:t xml:space="preserve">in </w:t>
+      </w:r>
+      <w:r>
+        <w:t xml:space="preserve">the </w:t>
+      </w:r>
+      <w:r>
+        <w:t>temporal graphs</w:t>
+      </w:r>
+      <w:r>
+        <w:t xml:space="preserve"> output</w:t>
+      </w:r>
+      <w:r>
+        <w:t>.</w:t>
       </w:r>
     </w:p>
     <w:p>
@@ -2442,137 +2460,19 @@
         <w:ind w:left="144" w:hanging="144"/>
       </w:pPr>
       <w:r>
-        <w:t xml:space="preserve">Results file report the cluster </w:t>
-      </w:r>
-      <w:r>
-        <w:rPr>
-          <w:i/>
-          <w:iCs/>
-        </w:rPr>
-        <w:t>‘span’</w:t>
-      </w:r>
-      <w:r>
-        <w:t xml:space="preserve">, defined as the distance between the two cluster locations furthest away. Especially useful when scanning on a network. </w:t>
-      </w:r>
-    </w:p>
-    <w:p>
-      <w:pPr>
-        <w:ind w:left="144" w:hanging="144"/>
-      </w:pPr>
-      <w:r>
-        <w:t>For prospective analyses, user specified cut-offs for performing or reporting analyses are defined in terms of recurrence intervals instead of p-values.</w:t>
-      </w:r>
-    </w:p>
-    <w:p>
-      <w:pPr>
-        <w:ind w:left="144" w:hanging="144"/>
-      </w:pPr>
-      <w:r>
-        <w:t>For the Poisson probability model, time stratified adjustments are implemented in the same manner as for the Bernoulli model.</w:t>
-      </w:r>
-    </w:p>
-    <w:p>
-      <w:pPr>
-        <w:ind w:left="360" w:hanging="360"/>
-      </w:pPr>
-      <w:r>
-        <w:t xml:space="preserve">For space-time analyses, the </w:t>
-      </w:r>
-      <w:r>
-        <w:t xml:space="preserve">Bernoulli drilldown </w:t>
-      </w:r>
-      <w:r>
-        <w:t xml:space="preserve">uses </w:t>
-      </w:r>
-      <w:r>
-        <w:t>the iterative scan.</w:t>
-      </w:r>
-    </w:p>
-    <w:p>
-      <w:pPr>
-        <w:ind w:left="144" w:hanging="144"/>
-      </w:pPr>
-      <w:r>
-        <w:t>When reporting clusters for space-time analyses, cluster overlap in not only defined geographically but also temporally, so that two non-overlapping clusters may both be reported when they are in the same place but at different times.</w:t>
-      </w:r>
-    </w:p>
-    <w:p>
-      <w:pPr>
-        <w:ind w:left="144" w:hanging="144"/>
-      </w:pPr>
-      <w:r>
-        <w:t>Google Maps and Google Earth output can display line-list information for individuals in detected clusters, to be used in cluster investigations.</w:t>
-      </w:r>
-    </w:p>
-    <w:p>
-      <w:pPr>
-        <w:ind w:left="144" w:hanging="144"/>
-      </w:pPr>
-      <w:r>
-        <w:t>For network analyses, ability to visualize the entire network in in Google Maps, Google Earth, or for Cartesian graphs.</w:t>
-      </w:r>
-    </w:p>
-    <w:p>
-      <w:pPr>
-        <w:ind w:left="144" w:hanging="144"/>
-      </w:pPr>
-      <w:r>
-        <w:t xml:space="preserve">For temporal graphs depicting detected clusters, it now reports the percentage of the cases in the geographical cluster area that are also in the temporal cluster window, while comparing that percentage to outside the cluster. </w:t>
-      </w:r>
-    </w:p>
-    <w:p>
-      <w:pPr>
-        <w:ind w:left="360" w:hanging="360"/>
-      </w:pPr>
-      <w:r>
-        <w:t>For the space-time permutation model, temporal graphs report observed/expected.</w:t>
-      </w:r>
-    </w:p>
-    <w:p>
-      <w:pPr>
-        <w:ind w:left="144" w:hanging="144"/>
-      </w:pPr>
-      <w:r>
-        <w:t>Option to send email notifications with summary information when using the multiple analysis feature.</w:t>
-      </w:r>
-    </w:p>
-    <w:p>
-      <w:pPr>
-        <w:ind w:left="360" w:hanging="360"/>
-        <w:rPr>
-          <w:bCs/>
-        </w:rPr>
-      </w:pPr>
-    </w:p>
-    <w:p>
-      <w:pPr>
-        <w:ind w:left="360" w:hanging="360"/>
-        <w:rPr>
-          <w:i/>
-          <w:iCs/>
-        </w:rPr>
-      </w:pPr>
-      <w:r>
-        <w:rPr>
-          <w:i/>
-          <w:iCs/>
-        </w:rPr>
-        <w:t>Minor Fixes</w:t>
-      </w:r>
-    </w:p>
-    <w:p>
-      <w:pPr>
-        <w:ind w:left="360" w:hanging="360"/>
-        <w:rPr>
-          <w:i/>
-          <w:iCs/>
-        </w:rPr>
-      </w:pPr>
-      <w:r>
-        <w:t>Faster file browsing</w:t>
-      </w:r>
-      <w:r>
-        <w:t xml:space="preserve"> for certain complex situations</w:t>
+        <w:t xml:space="preserve">Correction to </w:t>
+      </w:r>
+      <w:r>
+        <w:t xml:space="preserve">Google Maps </w:t>
+      </w:r>
+      <w:r>
+        <w:t xml:space="preserve">HTML and </w:t>
+      </w:r>
+      <w:r>
+        <w:t>JavaScript</w:t>
+      </w:r>
+      <w:r>
+        <w:t xml:space="preserve"> to escape reserved characters</w:t>
       </w:r>
       <w:r>
         <w:t>.</w:t>
@@ -2581,139 +2481,23 @@
     <w:p>
       <w:pPr>
         <w:ind w:left="360" w:hanging="360"/>
-      </w:pPr>
-      <w:r>
-        <w:t xml:space="preserve">Import file wizard estimates the number of columns by sampling up to </w:t>
-      </w:r>
-      <w:r>
-        <w:t>200</w:t>
-      </w:r>
-      <w:r>
-        <w:t xml:space="preserve"> records.</w:t>
-      </w:r>
-    </w:p>
-    <w:p>
-      <w:pPr>
-        <w:ind w:left="144" w:hanging="144"/>
-      </w:pPr>
-      <w:r>
-        <w:t>M</w:t>
-      </w:r>
-      <w:r>
-        <w:t>ultiple analyses window is refreshed when the user leave</w:t>
-      </w:r>
-      <w:r>
-        <w:t>s</w:t>
-      </w:r>
-      <w:r>
-        <w:t xml:space="preserve"> it open while a background process runs the multiple analyses (crontab, scheduler, etc.).</w:t>
-      </w:r>
-    </w:p>
-    <w:p>
-      <w:pPr>
-        <w:ind w:left="360" w:hanging="360"/>
-      </w:pPr>
-      <w:r>
-        <w:t>Fixed program crash when weighted normal model was used with covariates.</w:t>
-      </w:r>
-    </w:p>
-    <w:p>
-      <w:pPr>
-        <w:ind w:left="144" w:hanging="144"/>
-      </w:pPr>
-      <w:r>
-        <w:t xml:space="preserve">Updated </w:t>
-      </w:r>
-      <w:r>
-        <w:t>results</w:t>
-      </w:r>
-      <w:r>
-        <w:t xml:space="preserve"> file to report cluster population </w:t>
-      </w:r>
-      <w:r>
-        <w:t>with</w:t>
-      </w:r>
-      <w:r>
-        <w:t xml:space="preserve">in </w:t>
-      </w:r>
-      <w:r>
-        <w:t xml:space="preserve">each </w:t>
-      </w:r>
-      <w:r>
-        <w:t xml:space="preserve">data set section when using multiple data </w:t>
-      </w:r>
-      <w:r>
-        <w:t>sets.</w:t>
-      </w:r>
-    </w:p>
-    <w:p>
-      <w:pPr>
-        <w:ind w:left="144" w:hanging="144"/>
-      </w:pPr>
-      <w:r>
-        <w:t>Updated the Cartesian graph to correctly display clusters when there are multiple data sets.</w:t>
-      </w:r>
-    </w:p>
-    <w:p>
-      <w:pPr>
-        <w:ind w:left="144" w:hanging="144"/>
-      </w:pPr>
-      <w:r>
-        <w:t xml:space="preserve">Reworded </w:t>
-      </w:r>
-      <w:r>
-        <w:t>warning</w:t>
-      </w:r>
-      <w:r>
-        <w:t>s</w:t>
-      </w:r>
-      <w:r>
-        <w:t xml:space="preserve"> printed to </w:t>
-      </w:r>
-      <w:r>
-        <w:t xml:space="preserve">the </w:t>
-      </w:r>
-      <w:r>
-        <w:t>results</w:t>
-      </w:r>
-      <w:r>
-        <w:t xml:space="preserve"> file when a data set has been excluded</w:t>
-      </w:r>
-      <w:r>
-        <w:t xml:space="preserve"> from the analysis</w:t>
-      </w:r>
-      <w:r>
-        <w:t>.</w:t>
-      </w:r>
-    </w:p>
-    <w:p>
-      <w:pPr>
-        <w:ind w:left="360" w:hanging="360"/>
-      </w:pPr>
-      <w:r>
-        <w:t>Temporal graphs load quicker.</w:t>
-      </w:r>
-    </w:p>
-    <w:p>
-      <w:pPr>
-        <w:ind w:left="360" w:hanging="360"/>
-        <w:rPr>
-          <w:b/>
-        </w:rPr>
-      </w:pPr>
-    </w:p>
-    <w:p>
-      <w:pPr>
-        <w:ind w:left="360" w:hanging="360"/>
-        <w:rPr>
-          <w:b/>
-        </w:rPr>
-      </w:pPr>
-      <w:r>
-        <w:rPr>
-          <w:b/>
-        </w:rPr>
-        <w:t>Version 10.1.3, February 2024</w:t>
+        <w:rPr>
+          <w:b/>
+        </w:rPr>
+      </w:pPr>
+    </w:p>
+    <w:p>
+      <w:pPr>
+        <w:ind w:left="360" w:hanging="360"/>
+        <w:rPr>
+          <w:b/>
+        </w:rPr>
+      </w:pPr>
+      <w:r>
+        <w:rPr>
+          <w:b/>
+        </w:rPr>
+        <w:t>Version 10.2, June 2024</w:t>
       </w:r>
     </w:p>
     <w:p>
@@ -2728,6 +2512,331 @@
     </w:p>
     <w:p>
       <w:pPr>
+        <w:ind w:left="360" w:hanging="360"/>
+        <w:rPr>
+          <w:i/>
+          <w:iCs/>
+        </w:rPr>
+      </w:pPr>
+      <w:r>
+        <w:rPr>
+          <w:i/>
+          <w:iCs/>
+        </w:rPr>
+        <w:t>Improvements</w:t>
+      </w:r>
+    </w:p>
+    <w:p>
+      <w:pPr>
+        <w:ind w:left="360" w:hanging="360"/>
+      </w:pPr>
+      <w:r>
+        <w:t xml:space="preserve">Ability to use </w:t>
+      </w:r>
+      <w:r>
+        <w:t>multiple coordinates per location when scanning on a network.</w:t>
+      </w:r>
+    </w:p>
+    <w:p>
+      <w:pPr>
+        <w:ind w:left="360" w:hanging="360"/>
+      </w:pPr>
+      <w:r>
+        <w:t xml:space="preserve">Improved wizard for importing case files with descriptive line list data about individuals. </w:t>
+      </w:r>
+    </w:p>
+    <w:p>
+      <w:pPr>
+        <w:ind w:left="144" w:hanging="144"/>
+      </w:pPr>
+      <w:r>
+        <w:t xml:space="preserve">Results file report the cluster </w:t>
+      </w:r>
+      <w:r>
+        <w:rPr>
+          <w:i/>
+          <w:iCs/>
+        </w:rPr>
+        <w:t>‘span’</w:t>
+      </w:r>
+      <w:r>
+        <w:t xml:space="preserve">, defined as the distance between the two cluster locations furthest away. Especially useful when scanning on a network. </w:t>
+      </w:r>
+    </w:p>
+    <w:p>
+      <w:pPr>
+        <w:ind w:left="144" w:hanging="144"/>
+      </w:pPr>
+      <w:r>
+        <w:t>For prospective analyses, user specified cut-offs for performing or reporting analyses are defined in terms of recurrence intervals instead of p-values.</w:t>
+      </w:r>
+    </w:p>
+    <w:p>
+      <w:pPr>
+        <w:ind w:left="144" w:hanging="144"/>
+      </w:pPr>
+      <w:r>
+        <w:t>For the Poisson probability model, time stratified adjustments are implemented in the same manner as for the Bernoulli model.</w:t>
+      </w:r>
+    </w:p>
+    <w:p>
+      <w:pPr>
+        <w:ind w:left="360" w:hanging="360"/>
+      </w:pPr>
+      <w:r>
+        <w:t xml:space="preserve">For space-time analyses, the </w:t>
+      </w:r>
+      <w:r>
+        <w:t xml:space="preserve">Bernoulli drilldown </w:t>
+      </w:r>
+      <w:r>
+        <w:t xml:space="preserve">uses </w:t>
+      </w:r>
+      <w:r>
+        <w:t>the iterative scan.</w:t>
+      </w:r>
+    </w:p>
+    <w:p>
+      <w:pPr>
+        <w:ind w:left="144" w:hanging="144"/>
+      </w:pPr>
+      <w:r>
+        <w:t>When reporting clusters for space-time analyses, cluster overlap in not only defined geographically but also temporally, so that two non-overlapping clusters may both be reported when they are in the same place but at different times.</w:t>
+      </w:r>
+    </w:p>
+    <w:p>
+      <w:pPr>
+        <w:ind w:left="144" w:hanging="144"/>
+      </w:pPr>
+      <w:r>
+        <w:t>Google Maps and Google Earth output can display line-list information for individuals in detected clusters, to be used in cluster investigations.</w:t>
+      </w:r>
+    </w:p>
+    <w:p>
+      <w:pPr>
+        <w:ind w:left="144" w:hanging="144"/>
+      </w:pPr>
+      <w:r>
+        <w:t>For network analyses, ability to visualize the entire network in in Google Maps, Google Earth, or for Cartesian graphs.</w:t>
+      </w:r>
+    </w:p>
+    <w:p>
+      <w:pPr>
+        <w:ind w:left="144" w:hanging="144"/>
+      </w:pPr>
+      <w:r>
+        <w:t xml:space="preserve">For temporal graphs depicting detected clusters, it now reports the percentage of the cases in the geographical cluster area that are also in the temporal cluster window, while comparing that percentage to outside the cluster. </w:t>
+      </w:r>
+    </w:p>
+    <w:p>
+      <w:pPr>
+        <w:ind w:left="360" w:hanging="360"/>
+      </w:pPr>
+      <w:r>
+        <w:t>For the space-time permutation model, temporal graphs report observed/expected.</w:t>
+      </w:r>
+    </w:p>
+    <w:p>
+      <w:pPr>
+        <w:ind w:left="144" w:hanging="144"/>
+      </w:pPr>
+      <w:r>
+        <w:t>Option to send email notifications with summary information when using the multiple analysis feature.</w:t>
+      </w:r>
+    </w:p>
+    <w:p>
+      <w:pPr>
+        <w:ind w:left="360" w:hanging="360"/>
+        <w:rPr>
+          <w:bCs/>
+        </w:rPr>
+      </w:pPr>
+    </w:p>
+    <w:p>
+      <w:pPr>
+        <w:ind w:left="360" w:hanging="360"/>
+        <w:rPr>
+          <w:i/>
+          <w:iCs/>
+        </w:rPr>
+      </w:pPr>
+      <w:r>
+        <w:rPr>
+          <w:i/>
+          <w:iCs/>
+        </w:rPr>
+        <w:t>Minor Fixes</w:t>
+      </w:r>
+    </w:p>
+    <w:p>
+      <w:pPr>
+        <w:ind w:left="360" w:hanging="360"/>
+        <w:rPr>
+          <w:i/>
+          <w:iCs/>
+        </w:rPr>
+      </w:pPr>
+      <w:r>
+        <w:t>Faster file browsing</w:t>
+      </w:r>
+      <w:r>
+        <w:t xml:space="preserve"> for certain complex situations</w:t>
+      </w:r>
+      <w:r>
+        <w:t>.</w:t>
+      </w:r>
+    </w:p>
+    <w:p>
+      <w:pPr>
+        <w:ind w:left="360" w:hanging="360"/>
+      </w:pPr>
+      <w:r>
+        <w:t xml:space="preserve">Import file wizard estimates the number of columns by sampling up to </w:t>
+      </w:r>
+      <w:r>
+        <w:t>200</w:t>
+      </w:r>
+      <w:r>
+        <w:t xml:space="preserve"> records.</w:t>
+      </w:r>
+    </w:p>
+    <w:p>
+      <w:pPr>
+        <w:ind w:left="144" w:hanging="144"/>
+      </w:pPr>
+      <w:r>
+        <w:t>M</w:t>
+      </w:r>
+      <w:r>
+        <w:t>ultiple analyses window is refreshed when the user leave</w:t>
+      </w:r>
+      <w:r>
+        <w:t>s</w:t>
+      </w:r>
+      <w:r>
+        <w:t xml:space="preserve"> it open while a background process runs the multiple analyses (crontab, scheduler, etc.).</w:t>
+      </w:r>
+    </w:p>
+    <w:p>
+      <w:pPr>
+        <w:ind w:left="360" w:hanging="360"/>
+      </w:pPr>
+      <w:r>
+        <w:t>Fixed program crash when weighted normal model was used with covariates.</w:t>
+      </w:r>
+    </w:p>
+    <w:p>
+      <w:pPr>
+        <w:ind w:left="144" w:hanging="144"/>
+      </w:pPr>
+      <w:r>
+        <w:lastRenderedPageBreak/>
+        <w:t xml:space="preserve">Updated </w:t>
+      </w:r>
+      <w:r>
+        <w:t>results</w:t>
+      </w:r>
+      <w:r>
+        <w:t xml:space="preserve"> file to report cluster population </w:t>
+      </w:r>
+      <w:r>
+        <w:t>with</w:t>
+      </w:r>
+      <w:r>
+        <w:t xml:space="preserve">in </w:t>
+      </w:r>
+      <w:r>
+        <w:t xml:space="preserve">each </w:t>
+      </w:r>
+      <w:r>
+        <w:t xml:space="preserve">data set section when using multiple data </w:t>
+      </w:r>
+      <w:r>
+        <w:t>sets.</w:t>
+      </w:r>
+    </w:p>
+    <w:p>
+      <w:pPr>
+        <w:ind w:left="144" w:hanging="144"/>
+      </w:pPr>
+      <w:r>
+        <w:t>Updated the Cartesian graph to correctly display clusters when there are multiple data sets.</w:t>
+      </w:r>
+    </w:p>
+    <w:p>
+      <w:pPr>
+        <w:ind w:left="144" w:hanging="144"/>
+      </w:pPr>
+      <w:r>
+        <w:t xml:space="preserve">Reworded </w:t>
+      </w:r>
+      <w:r>
+        <w:t>warning</w:t>
+      </w:r>
+      <w:r>
+        <w:t>s</w:t>
+      </w:r>
+      <w:r>
+        <w:t xml:space="preserve"> printed to </w:t>
+      </w:r>
+      <w:r>
+        <w:t xml:space="preserve">the </w:t>
+      </w:r>
+      <w:r>
+        <w:t>results</w:t>
+      </w:r>
+      <w:r>
+        <w:t xml:space="preserve"> file when a data set has been excluded</w:t>
+      </w:r>
+      <w:r>
+        <w:t xml:space="preserve"> from the analysis</w:t>
+      </w:r>
+      <w:r>
+        <w:t>.</w:t>
+      </w:r>
+    </w:p>
+    <w:p>
+      <w:pPr>
+        <w:ind w:left="360" w:hanging="360"/>
+      </w:pPr>
+      <w:r>
+        <w:t>Temporal graphs load quicker.</w:t>
+      </w:r>
+    </w:p>
+    <w:p>
+      <w:pPr>
+        <w:ind w:left="360" w:hanging="360"/>
+        <w:rPr>
+          <w:b/>
+        </w:rPr>
+      </w:pPr>
+    </w:p>
+    <w:p>
+      <w:pPr>
+        <w:ind w:left="360" w:hanging="360"/>
+        <w:rPr>
+          <w:b/>
+        </w:rPr>
+      </w:pPr>
+      <w:r>
+        <w:rPr>
+          <w:b/>
+        </w:rPr>
+        <w:t>Version 10.1.3, February 2024</w:t>
+      </w:r>
+    </w:p>
+    <w:p>
+      <w:pPr>
+        <w:ind w:left="360" w:hanging="360"/>
+        <w:rPr>
+          <w:b/>
+          <w:sz w:val="12"/>
+          <w:szCs w:val="12"/>
+        </w:rPr>
+      </w:pPr>
+    </w:p>
+    <w:p>
+      <w:pPr>
         <w:rPr>
           <w:i/>
         </w:rPr>
@@ -4257,6 +4366,7 @@
         <w:ind w:left="360" w:hanging="360"/>
       </w:pPr>
       <w:r>
+        <w:lastRenderedPageBreak/>
         <w:t xml:space="preserve">Spatial output graph </w:t>
       </w:r>
       <w:r>
@@ -5279,6 +5389,7 @@
         <w:rPr>
           <w:bCs/>
         </w:rPr>
+        <w:lastRenderedPageBreak/>
         <w:t>Select command-line overrides caused ambiguous parameter error.</w:t>
       </w:r>
     </w:p>
@@ -6127,6 +6238,7 @@
         <w:rPr>
           <w:color w:val="000000"/>
         </w:rPr>
+        <w:lastRenderedPageBreak/>
         <w:t>Total population reported with Iterative Scan Statistic was not adjusted for earlier iterations when using the Poisson model</w:t>
       </w:r>
       <w:r>
@@ -7087,8 +7199,8 @@
       <w:r>
         <w:t xml:space="preserve">Sequential </w:t>
       </w:r>
-      <w:smartTag w:uri="urn:schemas-microsoft-com:office:smarttags" w:element="place">
-        <w:smartTag w:uri="urn:schemas-microsoft-com:office:smarttags" w:element="City">
+      <w:smartTag w:uri="urn:schemas-microsoft-com:office:smarttags" w:element="City">
+        <w:smartTag w:uri="urn:schemas-microsoft-com:office:smarttags" w:element="place">
           <w:r>
             <w:t>Monte Carlo</w:t>
           </w:r>
@@ -7530,6 +7642,7 @@
         <w:rPr>
           <w:b/>
         </w:rPr>
+        <w:lastRenderedPageBreak/>
         <w:t>Version 8.0.2, November 9, 2009</w:t>
       </w:r>
     </w:p>
@@ -8563,6 +8676,7 @@
         <w:ind w:left="144" w:hanging="144"/>
       </w:pPr>
       <w:r>
+        <w:lastRenderedPageBreak/>
         <w:t xml:space="preserve">Updated main file output to report cluster population in data set section, when using multiple data </w:t>
       </w:r>
       <w:r>
@@ -8962,6 +9076,7 @@
         <w:rPr>
           <w:bCs/>
         </w:rPr>
+        <w:lastRenderedPageBreak/>
         <w:t>Revised reporting of cluster information multivariate analyses with multiple data sets.</w:t>
       </w:r>
     </w:p>
@@ -9821,6 +9936,7 @@
         <w:ind w:left="144" w:hanging="144"/>
       </w:pPr>
       <w:r>
+        <w:lastRenderedPageBreak/>
         <w:t xml:space="preserve">Option not to adjust for previous analyses when doing prospective analyses. This replaces the alive cluster option, which did the same thing but with more limited output information. </w:t>
       </w:r>
     </w:p>
@@ -10235,6 +10351,7 @@
         <w:ind w:left="144" w:hanging="144"/>
       </w:pPr>
       <w:r>
+        <w:lastRenderedPageBreak/>
         <w:t>Analysis history file created with brief information about each analysis run performed. It is automatically generated in dBase format.</w:t>
       </w:r>
     </w:p>
@@ -11018,6 +11135,7 @@
         <w:rPr>
           <w:b/>
         </w:rPr>
+        <w:lastRenderedPageBreak/>
         <w:t>Version 2.1, July 29, 1998</w:t>
       </w:r>
     </w:p>
@@ -11583,8 +11701,8 @@
         </w:rPr>
         <w:t xml:space="preserve">Sample data: Brain cancer incidence in </w:t>
       </w:r>
-      <w:smartTag w:uri="urn:schemas-microsoft-com:office:smarttags" w:element="State">
-        <w:smartTag w:uri="urn:schemas-microsoft-com:office:smarttags" w:element="place">
+      <w:smartTag w:uri="urn:schemas-microsoft-com:office:smarttags" w:element="place">
+        <w:smartTag w:uri="urn:schemas-microsoft-com:office:smarttags" w:element="State">
           <w:r>
             <w:rPr>
               <w:bCs/>
@@ -11711,7 +11829,7 @@
 </file>
 
 <file path=word/numbering.xml><?xml version="1.0" encoding="utf-8"?>
-<w:numbering xmlns:wpc="http://schemas.microsoft.com/office/word/2010/wordprocessingCanvas" xmlns:cx="http://schemas.microsoft.com/office/drawing/2014/chartex" xmlns:cx1="http://schemas.microsoft.com/office/drawing/2015/9/8/chartex" xmlns:cx2="http://schemas.microsoft.com/office/drawing/2015/10/21/chartex" xmlns:cx3="http://schemas.microsoft.com/office/drawing/2016/5/9/chartex" xmlns:cx4="http://schemas.microsoft.com/office/drawing/2016/5/10/chartex" xmlns:cx5="http://schemas.microsoft.com/office/drawing/2016/5/11/chartex" xmlns:cx6="http://schemas.microsoft.com/office/drawing/2016/5/12/chartex" xmlns:cx7="http://schemas.microsoft.com/office/drawing/2016/5/13/chartex" xmlns:cx8="http://schemas.microsoft.com/office/drawing/2016/5/14/chartex" xmlns:mc="http://schemas.openxmlformats.org/markup-compatibility/2006" xmlns:aink="http://schemas.microsoft.com/office/drawing/2016/ink" xmlns:am3d="http://schemas.microsoft.com/office/drawing/2017/model3d" xmlns:o="urn:schemas-microsoft-com:office:office" xmlns:oel="http://schemas.microsoft.com/office/2019/extlst" xmlns:r="http://schemas.openxmlformats.org/officeDocument/2006/relationships" xmlns:m="http://schemas.openxmlformats.org/officeDocument/2006/math" xmlns:v="urn:schemas-microsoft-com:vml" xmlns:wp14="http://schemas.microsoft.com/office/word/2010/wordprocessingDrawing" xmlns:wp="http://schemas.openxmlformats.org/drawingml/2006/wordprocessingDrawing" xmlns:w10="urn:schemas-microsoft-com:office:word" xmlns:w="http://schemas.openxmlformats.org/wordprocessingml/2006/main" xmlns:w14="http://schemas.microsoft.com/office/word/2010/wordml" xmlns:w15="http://schemas.microsoft.com/office/word/2012/wordml" xmlns:w16cex="http://schemas.microsoft.com/office/word/2018/wordml/cex" xmlns:w16cid="http://schemas.microsoft.com/office/word/2016/wordml/cid" xmlns:w16="http://schemas.microsoft.com/office/word/2018/wordml" xmlns:w16sdtdh="http://schemas.microsoft.com/office/word/2020/wordml/sdtdatahash" xmlns:w16se="http://schemas.microsoft.com/office/word/2015/wordml/symex" xmlns:wpg="http://schemas.microsoft.com/office/word/2010/wordprocessingGroup" xmlns:wpi="http://schemas.microsoft.com/office/word/2010/wordprocessingInk" xmlns:wne="http://schemas.microsoft.com/office/word/2006/wordml" xmlns:wps="http://schemas.microsoft.com/office/word/2010/wordprocessingShape" mc:Ignorable="w14 w15 w16se w16cid w16 w16cex w16sdtdh wp14">
+<w:numbering xmlns:wpc="http://schemas.microsoft.com/office/word/2010/wordprocessingCanvas" xmlns:cx="http://schemas.microsoft.com/office/drawing/2014/chartex" xmlns:cx1="http://schemas.microsoft.com/office/drawing/2015/9/8/chartex" xmlns:cx2="http://schemas.microsoft.com/office/drawing/2015/10/21/chartex" xmlns:cx3="http://schemas.microsoft.com/office/drawing/2016/5/9/chartex" xmlns:cx4="http://schemas.microsoft.com/office/drawing/2016/5/10/chartex" xmlns:cx5="http://schemas.microsoft.com/office/drawing/2016/5/11/chartex" xmlns:cx6="http://schemas.microsoft.com/office/drawing/2016/5/12/chartex" xmlns:cx7="http://schemas.microsoft.com/office/drawing/2016/5/13/chartex" xmlns:cx8="http://schemas.microsoft.com/office/drawing/2016/5/14/chartex" xmlns:mc="http://schemas.openxmlformats.org/markup-compatibility/2006" xmlns:aink="http://schemas.microsoft.com/office/drawing/2016/ink" xmlns:am3d="http://schemas.microsoft.com/office/drawing/2017/model3d" xmlns:o="urn:schemas-microsoft-com:office:office" xmlns:oel="http://schemas.microsoft.com/office/2019/extlst" xmlns:r="http://schemas.openxmlformats.org/officeDocument/2006/relationships" xmlns:m="http://schemas.openxmlformats.org/officeDocument/2006/math" xmlns:v="urn:schemas-microsoft-com:vml" xmlns:wp14="http://schemas.microsoft.com/office/word/2010/wordprocessingDrawing" xmlns:wp="http://schemas.openxmlformats.org/drawingml/2006/wordprocessingDrawing" xmlns:w10="urn:schemas-microsoft-com:office:word" xmlns:w="http://schemas.openxmlformats.org/wordprocessingml/2006/main" xmlns:w14="http://schemas.microsoft.com/office/word/2010/wordml" xmlns:w15="http://schemas.microsoft.com/office/word/2012/wordml" xmlns:w16cex="http://schemas.microsoft.com/office/word/2018/wordml/cex" xmlns:w16cid="http://schemas.microsoft.com/office/word/2016/wordml/cid" xmlns:w16="http://schemas.microsoft.com/office/word/2018/wordml" xmlns:w16du="http://schemas.microsoft.com/office/word/2023/wordml/word16du" xmlns:w16sdtdh="http://schemas.microsoft.com/office/word/2020/wordml/sdtdatahash" xmlns:w16sdtfl="http://schemas.microsoft.com/office/word/2024/wordml/sdtformatlock" xmlns:w16se="http://schemas.microsoft.com/office/word/2015/wordml/symex" xmlns:wpg="http://schemas.microsoft.com/office/word/2010/wordprocessingGroup" xmlns:wpi="http://schemas.microsoft.com/office/word/2010/wordprocessingInk" xmlns:wne="http://schemas.microsoft.com/office/word/2006/wordml" xmlns:wps="http://schemas.microsoft.com/office/word/2010/wordprocessingShape" mc:Ignorable="w14 w15 w16se w16cid w16 w16cex w16sdtdh w16sdtfl w16du wp14">
   <w:abstractNum w:abstractNumId="0" w15:restartNumberingAfterBreak="0">
     <w:nsid w:val="FFFFFF89"/>
     <w:multiLevelType w:val="singleLevel"/>
@@ -11971,7 +12089,7 @@
 </file>
 
 <file path=word/styles.xml><?xml version="1.0" encoding="utf-8"?>
-<w:styles xmlns:mc="http://schemas.openxmlformats.org/markup-compatibility/2006" xmlns:r="http://schemas.openxmlformats.org/officeDocument/2006/relationships" xmlns:w="http://schemas.openxmlformats.org/wordprocessingml/2006/main" xmlns:w14="http://schemas.microsoft.com/office/word/2010/wordml" xmlns:w15="http://schemas.microsoft.com/office/word/2012/wordml" xmlns:w16cex="http://schemas.microsoft.com/office/word/2018/wordml/cex" xmlns:w16cid="http://schemas.microsoft.com/office/word/2016/wordml/cid" xmlns:w16="http://schemas.microsoft.com/office/word/2018/wordml" xmlns:w16sdtdh="http://schemas.microsoft.com/office/word/2020/wordml/sdtdatahash" xmlns:w16se="http://schemas.microsoft.com/office/word/2015/wordml/symex" mc:Ignorable="w14 w15 w16se w16cid w16 w16cex w16sdtdh">
+<w:styles xmlns:mc="http://schemas.openxmlformats.org/markup-compatibility/2006" xmlns:r="http://schemas.openxmlformats.org/officeDocument/2006/relationships" xmlns:w="http://schemas.openxmlformats.org/wordprocessingml/2006/main" xmlns:w14="http://schemas.microsoft.com/office/word/2010/wordml" xmlns:w15="http://schemas.microsoft.com/office/word/2012/wordml" xmlns:w16cex="http://schemas.microsoft.com/office/word/2018/wordml/cex" xmlns:w16cid="http://schemas.microsoft.com/office/word/2016/wordml/cid" xmlns:w16="http://schemas.microsoft.com/office/word/2018/wordml" xmlns:w16du="http://schemas.microsoft.com/office/word/2023/wordml/word16du" xmlns:w16sdtdh="http://schemas.microsoft.com/office/word/2020/wordml/sdtdatahash" xmlns:w16sdtfl="http://schemas.microsoft.com/office/word/2024/wordml/sdtformatlock" xmlns:w16se="http://schemas.microsoft.com/office/word/2015/wordml/symex" mc:Ignorable="w14 w15 w16se w16cid w16 w16cex w16sdtdh w16sdtfl w16du">
   <w:docDefaults>
     <w:rPrDefault>
       <w:rPr>

</xml_diff>

<commit_message>
#66713 - merge 10.3.3 change to master branch
</commit_message>
<xml_diff>
--- a/Doc/SaTScan Version History.docx
+++ b/Doc/SaTScan Version History.docx
@@ -1,6 +1,6 @@
 
 <file path=word/document.xml><?xml version="1.0" encoding="utf-8"?>
-<w:document xmlns:wpc="http://schemas.microsoft.com/office/word/2010/wordprocessingCanvas" xmlns:cx="http://schemas.microsoft.com/office/drawing/2014/chartex" xmlns:cx1="http://schemas.microsoft.com/office/drawing/2015/9/8/chartex" xmlns:cx2="http://schemas.microsoft.com/office/drawing/2015/10/21/chartex" xmlns:cx3="http://schemas.microsoft.com/office/drawing/2016/5/9/chartex" xmlns:cx4="http://schemas.microsoft.com/office/drawing/2016/5/10/chartex" xmlns:cx5="http://schemas.microsoft.com/office/drawing/2016/5/11/chartex" xmlns:cx6="http://schemas.microsoft.com/office/drawing/2016/5/12/chartex" xmlns:cx7="http://schemas.microsoft.com/office/drawing/2016/5/13/chartex" xmlns:cx8="http://schemas.microsoft.com/office/drawing/2016/5/14/chartex" xmlns:mc="http://schemas.openxmlformats.org/markup-compatibility/2006" xmlns:aink="http://schemas.microsoft.com/office/drawing/2016/ink" xmlns:am3d="http://schemas.microsoft.com/office/drawing/2017/model3d" xmlns:o="urn:schemas-microsoft-com:office:office" xmlns:oel="http://schemas.microsoft.com/office/2019/extlst" xmlns:r="http://schemas.openxmlformats.org/officeDocument/2006/relationships" xmlns:m="http://schemas.openxmlformats.org/officeDocument/2006/math" xmlns:v="urn:schemas-microsoft-com:vml" xmlns:wp14="http://schemas.microsoft.com/office/word/2010/wordprocessingDrawing" xmlns:wp="http://schemas.openxmlformats.org/drawingml/2006/wordprocessingDrawing" xmlns:w10="urn:schemas-microsoft-com:office:word" xmlns:w="http://schemas.openxmlformats.org/wordprocessingml/2006/main" xmlns:w14="http://schemas.microsoft.com/office/word/2010/wordml" xmlns:w15="http://schemas.microsoft.com/office/word/2012/wordml" xmlns:w16cex="http://schemas.microsoft.com/office/word/2018/wordml/cex" xmlns:w16cid="http://schemas.microsoft.com/office/word/2016/wordml/cid" xmlns:w16="http://schemas.microsoft.com/office/word/2018/wordml" xmlns:w16sdtdh="http://schemas.microsoft.com/office/word/2020/wordml/sdtdatahash" xmlns:w16se="http://schemas.microsoft.com/office/word/2015/wordml/symex" xmlns:wpg="http://schemas.microsoft.com/office/word/2010/wordprocessingGroup" xmlns:wpi="http://schemas.microsoft.com/office/word/2010/wordprocessingInk" xmlns:wne="http://schemas.microsoft.com/office/word/2006/wordml" xmlns:wps="http://schemas.microsoft.com/office/word/2010/wordprocessingShape" mc:Ignorable="w14 w15 w16se w16cid w16 w16cex w16sdtdh wp14">
+<w:document xmlns:wpc="http://schemas.microsoft.com/office/word/2010/wordprocessingCanvas" xmlns:cx="http://schemas.microsoft.com/office/drawing/2014/chartex" xmlns:cx1="http://schemas.microsoft.com/office/drawing/2015/9/8/chartex" xmlns:cx2="http://schemas.microsoft.com/office/drawing/2015/10/21/chartex" xmlns:cx3="http://schemas.microsoft.com/office/drawing/2016/5/9/chartex" xmlns:cx4="http://schemas.microsoft.com/office/drawing/2016/5/10/chartex" xmlns:cx5="http://schemas.microsoft.com/office/drawing/2016/5/11/chartex" xmlns:cx6="http://schemas.microsoft.com/office/drawing/2016/5/12/chartex" xmlns:cx7="http://schemas.microsoft.com/office/drawing/2016/5/13/chartex" xmlns:cx8="http://schemas.microsoft.com/office/drawing/2016/5/14/chartex" xmlns:mc="http://schemas.openxmlformats.org/markup-compatibility/2006" xmlns:aink="http://schemas.microsoft.com/office/drawing/2016/ink" xmlns:am3d="http://schemas.microsoft.com/office/drawing/2017/model3d" xmlns:o="urn:schemas-microsoft-com:office:office" xmlns:oel="http://schemas.microsoft.com/office/2019/extlst" xmlns:r="http://schemas.openxmlformats.org/officeDocument/2006/relationships" xmlns:m="http://schemas.openxmlformats.org/officeDocument/2006/math" xmlns:v="urn:schemas-microsoft-com:vml" xmlns:wp14="http://schemas.microsoft.com/office/word/2010/wordprocessingDrawing" xmlns:wp="http://schemas.openxmlformats.org/drawingml/2006/wordprocessingDrawing" xmlns:w10="urn:schemas-microsoft-com:office:word" xmlns:w="http://schemas.openxmlformats.org/wordprocessingml/2006/main" xmlns:w14="http://schemas.microsoft.com/office/word/2010/wordml" xmlns:w15="http://schemas.microsoft.com/office/word/2012/wordml" xmlns:w16cex="http://schemas.microsoft.com/office/word/2018/wordml/cex" xmlns:w16cid="http://schemas.microsoft.com/office/word/2016/wordml/cid" xmlns:w16="http://schemas.microsoft.com/office/word/2018/wordml" xmlns:w16du="http://schemas.microsoft.com/office/word/2023/wordml/word16du" xmlns:w16sdtdh="http://schemas.microsoft.com/office/word/2020/wordml/sdtdatahash" xmlns:w16sdtfl="http://schemas.microsoft.com/office/word/2024/wordml/sdtformatlock" xmlns:w16se="http://schemas.microsoft.com/office/word/2015/wordml/symex" xmlns:wpg="http://schemas.microsoft.com/office/word/2010/wordprocessingGroup" xmlns:wpi="http://schemas.microsoft.com/office/word/2010/wordprocessingInk" xmlns:wne="http://schemas.microsoft.com/office/word/2006/wordml" xmlns:wps="http://schemas.microsoft.com/office/word/2010/wordprocessingShape" mc:Ignorable="w14 w15 w16se w16cid w16 w16cex w16sdtdh w16sdtfl w16du wp14">
   <w:body>
     <w:p>
       <w:pPr>
@@ -1618,13 +1618,25 @@
         <w:rPr>
           <w:b/>
         </w:rPr>
-        <w:t xml:space="preserve">Version 10.3.2, </w:t>
-      </w:r>
-      <w:r>
-        <w:rPr>
-          <w:b/>
-        </w:rPr>
-        <w:t>June</w:t>
+        <w:t>Version 10.3.</w:t>
+      </w:r>
+      <w:r>
+        <w:rPr>
+          <w:b/>
+        </w:rPr>
+        <w:t>3</w:t>
+      </w:r>
+      <w:r>
+        <w:rPr>
+          <w:b/>
+        </w:rPr>
+        <w:t xml:space="preserve">, </w:t>
+      </w:r>
+      <w:r>
+        <w:rPr>
+          <w:b/>
+        </w:rPr>
+        <w:t>September</w:t>
       </w:r>
       <w:r>
         <w:rPr>
@@ -1667,13 +1679,7 @@
         <w:t xml:space="preserve">Correction </w:t>
       </w:r>
       <w:r>
-        <w:t>in</w:t>
-      </w:r>
-      <w:r>
-        <w:t xml:space="preserve"> purely spatial Bernoulli drilldown</w:t>
-      </w:r>
-      <w:r>
-        <w:t xml:space="preserve"> when using line-list data</w:t>
+        <w:t>in the batched model when using multiple data sets</w:t>
       </w:r>
       <w:r>
         <w:t>.</w:t>
@@ -1684,43 +1690,53 @@
         <w:ind w:left="144" w:hanging="144"/>
       </w:pPr>
       <w:r>
-        <w:t>Correction in Google Maps with performing prospective analysis and drilldown.</w:t>
-      </w:r>
-    </w:p>
-    <w:p>
-      <w:pPr>
-        <w:ind w:left="144" w:hanging="144"/>
-      </w:pPr>
-      <w:r>
-        <w:t>Updated compression library.</w:t>
-      </w:r>
-    </w:p>
-    <w:p>
-      <w:pPr>
-        <w:ind w:left="360" w:hanging="360"/>
-        <w:rPr>
-          <w:b/>
-        </w:rPr>
-      </w:pPr>
-    </w:p>
-    <w:p>
-      <w:pPr>
-        <w:ind w:left="360" w:hanging="360"/>
-        <w:rPr>
-          <w:b/>
-        </w:rPr>
-      </w:pPr>
-      <w:r>
-        <w:rPr>
-          <w:b/>
-        </w:rPr>
-        <w:t xml:space="preserve">Version 10.3.1, </w:t>
-      </w:r>
-      <w:r>
-        <w:rPr>
-          <w:b/>
-        </w:rPr>
-        <w:t>May</w:t>
+        <w:t xml:space="preserve">Correction </w:t>
+      </w:r>
+      <w:r>
+        <w:t xml:space="preserve">when using </w:t>
+      </w:r>
+      <w:r>
+        <w:t xml:space="preserve">the </w:t>
+      </w:r>
+      <w:r>
+        <w:t xml:space="preserve">network file </w:t>
+      </w:r>
+      <w:r>
+        <w:t>with</w:t>
+      </w:r>
+      <w:r>
+        <w:t xml:space="preserve"> multiple locations</w:t>
+      </w:r>
+      <w:r>
+        <w:t>.</w:t>
+      </w:r>
+    </w:p>
+    <w:p>
+      <w:pPr>
+        <w:ind w:left="360" w:hanging="360"/>
+        <w:rPr>
+          <w:b/>
+        </w:rPr>
+      </w:pPr>
+    </w:p>
+    <w:p>
+      <w:pPr>
+        <w:ind w:left="360" w:hanging="360"/>
+        <w:rPr>
+          <w:b/>
+        </w:rPr>
+      </w:pPr>
+      <w:r>
+        <w:rPr>
+          <w:b/>
+        </w:rPr>
+        <w:t xml:space="preserve">Version 10.3.2, </w:t>
+      </w:r>
+      <w:r>
+        <w:rPr>
+          <w:b/>
+        </w:rPr>
+        <w:t>June</w:t>
       </w:r>
       <w:r>
         <w:rPr>
@@ -1760,7 +1776,14 @@
         <w:ind w:left="144" w:hanging="144"/>
       </w:pPr>
       <w:r>
-        <w:t>Removed mistaken hardcode in purely spatial Bernoulli drilldown.</w:t>
+        <w:lastRenderedPageBreak/>
+        <w:t xml:space="preserve">Correction </w:t>
+      </w:r>
+      <w:r>
+        <w:t>in</w:t>
+      </w:r>
+      <w:r>
+        <w:t xml:space="preserve"> purely spatial Bernoulli drilldown when using line-list data.</w:t>
       </w:r>
     </w:p>
     <w:p>
@@ -1768,7 +1791,7 @@
         <w:ind w:left="144" w:hanging="144"/>
       </w:pPr>
       <w:r>
-        <w:t>Day of week adjustment with purely spatial Bernoulli drilldown made automatic.</w:t>
+        <w:t>Correction in Google Maps with performing prospective analysis and drilldown.</w:t>
       </w:r>
     </w:p>
     <w:p>
@@ -1776,69 +1799,35 @@
         <w:ind w:left="144" w:hanging="144"/>
       </w:pPr>
       <w:r>
-        <w:t xml:space="preserve">Corrected </w:t>
-      </w:r>
-      <w:r>
-        <w:t>location dot</w:t>
-      </w:r>
-      <w:r>
-        <w:t xml:space="preserve"> color in Google Maps output.</w:t>
-      </w:r>
-    </w:p>
-    <w:p>
-      <w:pPr>
-        <w:ind w:left="144" w:hanging="144"/>
-      </w:pPr>
-      <w:r>
-        <w:t>Update</w:t>
-      </w:r>
-      <w:r>
-        <w:t>d</w:t>
-      </w:r>
-      <w:r>
-        <w:t xml:space="preserve"> temporal graph to use user specified data set names.</w:t>
-      </w:r>
-    </w:p>
-    <w:p>
-      <w:pPr>
-        <w:ind w:left="144" w:hanging="144"/>
-      </w:pPr>
-      <w:r>
-        <w:t xml:space="preserve">Corrected disabling error in </w:t>
-      </w:r>
-      <w:r>
-        <w:t>graphical interface</w:t>
-      </w:r>
-      <w:r>
-        <w:t xml:space="preserve"> for GINI option.</w:t>
-      </w:r>
-    </w:p>
-    <w:p>
-      <w:pPr>
-        <w:ind w:left="360" w:hanging="360"/>
-        <w:rPr>
-          <w:b/>
-        </w:rPr>
-      </w:pPr>
-    </w:p>
-    <w:p>
-      <w:pPr>
-        <w:ind w:left="360" w:hanging="360"/>
-        <w:rPr>
-          <w:b/>
-        </w:rPr>
-      </w:pPr>
-      <w:r>
-        <w:rPr>
-          <w:b/>
-        </w:rPr>
-        <w:t xml:space="preserve">Version 10.3, </w:t>
-      </w:r>
-      <w:r>
-        <w:rPr>
-          <w:b/>
-        </w:rPr>
-        <w:t>March</w:t>
+        <w:t>Updated compression library.</w:t>
+      </w:r>
+    </w:p>
+    <w:p>
+      <w:pPr>
+        <w:ind w:left="360" w:hanging="360"/>
+        <w:rPr>
+          <w:b/>
+        </w:rPr>
+      </w:pPr>
+    </w:p>
+    <w:p>
+      <w:pPr>
+        <w:ind w:left="360" w:hanging="360"/>
+        <w:rPr>
+          <w:b/>
+        </w:rPr>
+      </w:pPr>
+      <w:r>
+        <w:rPr>
+          <w:b/>
+        </w:rPr>
+        <w:t xml:space="preserve">Version 10.3.1, </w:t>
+      </w:r>
+      <w:r>
+        <w:rPr>
+          <w:b/>
+        </w:rPr>
+        <w:t>May</w:t>
       </w:r>
       <w:r>
         <w:rPr>
@@ -1870,7 +1859,7 @@
           <w:i/>
           <w:iCs/>
         </w:rPr>
-        <w:t>New Analytical Features</w:t>
+        <w:t>Fixes</w:t>
       </w:r>
     </w:p>
     <w:p>
@@ -1878,90 +1867,29 @@
         <w:ind w:left="144" w:hanging="144"/>
       </w:pPr>
       <w:r>
-        <w:t>Probability model for batched data, where it is only known whether there is zero or at least one positive observation in each batch.</w:t>
-      </w:r>
-    </w:p>
-    <w:p>
-      <w:pPr>
-        <w:ind w:left="360" w:hanging="360"/>
-        <w:rPr>
-          <w:i/>
-        </w:rPr>
-      </w:pPr>
-    </w:p>
-    <w:p>
-      <w:pPr>
-        <w:ind w:left="360" w:hanging="360"/>
-        <w:rPr>
-          <w:bCs/>
-        </w:rPr>
-      </w:pPr>
-      <w:r>
-        <w:rPr>
-          <w:i/>
-        </w:rPr>
-        <w:t xml:space="preserve">Other </w:t>
-      </w:r>
-      <w:r>
-        <w:rPr>
-          <w:i/>
-        </w:rPr>
-        <w:t>Improvements</w:t>
-      </w:r>
-      <w:r>
-        <w:rPr>
-          <w:bCs/>
-        </w:rPr>
-        <w:t xml:space="preserve"> </w:t>
+        <w:t>Removed mistaken hardcode in purely spatial Bernoulli drilldown.</w:t>
       </w:r>
     </w:p>
     <w:p>
       <w:pPr>
         <w:ind w:left="144" w:hanging="144"/>
-        <w:rPr>
-          <w:bCs/>
-        </w:rPr>
-      </w:pPr>
-      <w:r>
-        <w:t>Better display of location and line-list data in Google Maps output.</w:t>
+      </w:pPr>
+      <w:r>
+        <w:t>Day of week adjustment with purely spatial Bernoulli drilldown made automatic.</w:t>
       </w:r>
     </w:p>
     <w:p>
       <w:pPr>
         <w:ind w:left="144" w:hanging="144"/>
-        <w:rPr>
-          <w:bCs/>
-        </w:rPr>
-      </w:pPr>
-      <w:r>
-        <w:rPr>
-          <w:bCs/>
-        </w:rPr>
-        <w:t>Ability to name data sets when using multiple data sets.</w:t>
-      </w:r>
-    </w:p>
-    <w:p>
-      <w:pPr>
-        <w:ind w:left="360" w:hanging="360"/>
-        <w:rPr>
-          <w:bCs/>
-        </w:rPr>
-      </w:pPr>
-    </w:p>
-    <w:p>
-      <w:pPr>
-        <w:ind w:left="360" w:hanging="360"/>
-        <w:rPr>
-          <w:i/>
-          <w:iCs/>
-        </w:rPr>
-      </w:pPr>
-      <w:r>
-        <w:rPr>
-          <w:i/>
-          <w:iCs/>
-        </w:rPr>
-        <w:t>Minor Fixes</w:t>
+      </w:pPr>
+      <w:r>
+        <w:t xml:space="preserve">Corrected </w:t>
+      </w:r>
+      <w:r>
+        <w:t>location dot</w:t>
+      </w:r>
+      <w:r>
+        <w:t xml:space="preserve"> color in Google Maps output.</w:t>
       </w:r>
     </w:p>
     <w:p>
@@ -1969,7 +1897,13 @@
         <w:ind w:left="144" w:hanging="144"/>
       </w:pPr>
       <w:r>
-        <w:t>Recurrence intervals partly reported with words when greater than one thousand years.</w:t>
+        <w:t>Update</w:t>
+      </w:r>
+      <w:r>
+        <w:t>d</w:t>
+      </w:r>
+      <w:r>
+        <w:t xml:space="preserve"> temporal graph to use user specified data set names.</w:t>
       </w:r>
     </w:p>
     <w:p>
@@ -1977,69 +1911,47 @@
         <w:ind w:left="144" w:hanging="144"/>
       </w:pPr>
       <w:r>
-        <w:t>Improved layout of the main results file regarding additional output files, iterative scan statistic, and multiple data sets,</w:t>
-      </w:r>
-    </w:p>
-    <w:p>
-      <w:pPr>
-        <w:ind w:left="360" w:hanging="360"/>
-      </w:pPr>
-      <w:r>
-        <w:t>Corrected problem when including purely spatial clusters in a time-stratified adjusted analysis.</w:t>
-      </w:r>
-    </w:p>
-    <w:p>
-      <w:pPr>
-        <w:ind w:left="360" w:hanging="360"/>
-      </w:pPr>
-      <w:r>
-        <w:t>Avoids rarely occurring program crash for continuous Poisson model analyses.</w:t>
-      </w:r>
-    </w:p>
-    <w:p>
-      <w:pPr>
-        <w:ind w:left="360" w:hanging="360"/>
-      </w:pPr>
-      <w:r>
-        <w:t>Proper handling when cancelling jobs on the multiple analyses interface.</w:t>
-      </w:r>
-    </w:p>
-    <w:p>
-      <w:pPr>
-        <w:ind w:left="360" w:hanging="360"/>
-      </w:pPr>
-      <w:r>
-        <w:t>For temporal graphs, fixed export functionality and which clusters to report.</w:t>
-      </w:r>
-    </w:p>
-    <w:p>
-      <w:pPr>
-        <w:ind w:left="360" w:hanging="360"/>
-      </w:pPr>
-      <w:r>
-        <w:t>Restored run history functionality that was mistakenly removed in version 10.0.</w:t>
-      </w:r>
-    </w:p>
-    <w:p>
-      <w:pPr>
-        <w:ind w:left="360" w:hanging="360"/>
-        <w:rPr>
-          <w:b/>
-        </w:rPr>
-      </w:pPr>
-    </w:p>
-    <w:p>
-      <w:pPr>
-        <w:ind w:left="360" w:hanging="360"/>
-        <w:rPr>
-          <w:b/>
-        </w:rPr>
-      </w:pPr>
-      <w:r>
-        <w:rPr>
-          <w:b/>
-        </w:rPr>
-        <w:t>Version 10.2.5, September 2024</w:t>
+        <w:t xml:space="preserve">Corrected disabling error in </w:t>
+      </w:r>
+      <w:r>
+        <w:t>graphical interface</w:t>
+      </w:r>
+      <w:r>
+        <w:t xml:space="preserve"> for GINI option.</w:t>
+      </w:r>
+    </w:p>
+    <w:p>
+      <w:pPr>
+        <w:ind w:left="360" w:hanging="360"/>
+        <w:rPr>
+          <w:b/>
+        </w:rPr>
+      </w:pPr>
+    </w:p>
+    <w:p>
+      <w:pPr>
+        <w:ind w:left="360" w:hanging="360"/>
+        <w:rPr>
+          <w:b/>
+        </w:rPr>
+      </w:pPr>
+      <w:r>
+        <w:rPr>
+          <w:b/>
+        </w:rPr>
+        <w:t xml:space="preserve">Version 10.3, </w:t>
+      </w:r>
+      <w:r>
+        <w:rPr>
+          <w:b/>
+        </w:rPr>
+        <w:t>March</w:t>
+      </w:r>
+      <w:r>
+        <w:rPr>
+          <w:b/>
+        </w:rPr>
+        <w:t xml:space="preserve"> 2025</w:t>
       </w:r>
     </w:p>
     <w:p>
@@ -2065,7 +1977,7 @@
           <w:i/>
           <w:iCs/>
         </w:rPr>
-        <w:t>Fixes</w:t>
+        <w:t>New Analytical Features</w:t>
       </w:r>
     </w:p>
     <w:p>
@@ -2073,29 +1985,168 @@
         <w:ind w:left="144" w:hanging="144"/>
       </w:pPr>
       <w:r>
-        <w:t>Disable the Gumbel approximation when scanning for low rates or for high or low rates. When using the Default P-value option, while scanning for low rates or for high or low rates, the Gumbel approximation is no longer used to calculate cluster p-values.</w:t>
-      </w:r>
-    </w:p>
-    <w:p>
-      <w:pPr>
-        <w:ind w:left="360" w:hanging="360"/>
-        <w:rPr>
-          <w:b/>
-        </w:rPr>
-      </w:pPr>
-    </w:p>
-    <w:p>
-      <w:pPr>
-        <w:ind w:left="360" w:hanging="360"/>
-        <w:rPr>
-          <w:b/>
-        </w:rPr>
-      </w:pPr>
-      <w:r>
-        <w:rPr>
-          <w:b/>
-        </w:rPr>
-        <w:t>Version 10.2.4, August 2024</w:t>
+        <w:t>Probability model for batched data, where it is only known whether there is zero or at least one positive observation in each batch.</w:t>
+      </w:r>
+    </w:p>
+    <w:p>
+      <w:pPr>
+        <w:ind w:left="360" w:hanging="360"/>
+        <w:rPr>
+          <w:i/>
+        </w:rPr>
+      </w:pPr>
+    </w:p>
+    <w:p>
+      <w:pPr>
+        <w:ind w:left="360" w:hanging="360"/>
+        <w:rPr>
+          <w:bCs/>
+        </w:rPr>
+      </w:pPr>
+      <w:r>
+        <w:rPr>
+          <w:i/>
+        </w:rPr>
+        <w:t xml:space="preserve">Other </w:t>
+      </w:r>
+      <w:r>
+        <w:rPr>
+          <w:i/>
+        </w:rPr>
+        <w:t>Improvements</w:t>
+      </w:r>
+      <w:r>
+        <w:rPr>
+          <w:bCs/>
+        </w:rPr>
+        <w:t xml:space="preserve"> </w:t>
+      </w:r>
+    </w:p>
+    <w:p>
+      <w:pPr>
+        <w:ind w:left="144" w:hanging="144"/>
+        <w:rPr>
+          <w:bCs/>
+        </w:rPr>
+      </w:pPr>
+      <w:r>
+        <w:t>Better display of location and line-list data in Google Maps output.</w:t>
+      </w:r>
+    </w:p>
+    <w:p>
+      <w:pPr>
+        <w:ind w:left="144" w:hanging="144"/>
+        <w:rPr>
+          <w:bCs/>
+        </w:rPr>
+      </w:pPr>
+      <w:r>
+        <w:rPr>
+          <w:bCs/>
+        </w:rPr>
+        <w:t>Ability to name data sets when using multiple data sets.</w:t>
+      </w:r>
+    </w:p>
+    <w:p>
+      <w:pPr>
+        <w:ind w:left="360" w:hanging="360"/>
+        <w:rPr>
+          <w:bCs/>
+        </w:rPr>
+      </w:pPr>
+    </w:p>
+    <w:p>
+      <w:pPr>
+        <w:ind w:left="360" w:hanging="360"/>
+        <w:rPr>
+          <w:i/>
+          <w:iCs/>
+        </w:rPr>
+      </w:pPr>
+      <w:r>
+        <w:rPr>
+          <w:i/>
+          <w:iCs/>
+        </w:rPr>
+        <w:t>Minor Fixes</w:t>
+      </w:r>
+    </w:p>
+    <w:p>
+      <w:pPr>
+        <w:ind w:left="144" w:hanging="144"/>
+      </w:pPr>
+      <w:r>
+        <w:t>Recurrence intervals partly reported with words when greater than one thousand years.</w:t>
+      </w:r>
+    </w:p>
+    <w:p>
+      <w:pPr>
+        <w:ind w:left="144" w:hanging="144"/>
+      </w:pPr>
+      <w:r>
+        <w:t>Improved layout of the main results file regarding additional output files, iterative scan statistic, and multiple data sets,</w:t>
+      </w:r>
+    </w:p>
+    <w:p>
+      <w:pPr>
+        <w:ind w:left="360" w:hanging="360"/>
+      </w:pPr>
+      <w:r>
+        <w:t>Corrected problem when including purely spatial clusters in a time-stratified adjusted analysis.</w:t>
+      </w:r>
+    </w:p>
+    <w:p>
+      <w:pPr>
+        <w:ind w:left="360" w:hanging="360"/>
+      </w:pPr>
+      <w:r>
+        <w:t>Avoids rarely occurring program crash for continuous Poisson model analyses.</w:t>
+      </w:r>
+    </w:p>
+    <w:p>
+      <w:pPr>
+        <w:ind w:left="360" w:hanging="360"/>
+      </w:pPr>
+      <w:r>
+        <w:t>Proper handling when cancelling jobs on the multiple analyses interface.</w:t>
+      </w:r>
+    </w:p>
+    <w:p>
+      <w:pPr>
+        <w:ind w:left="360" w:hanging="360"/>
+      </w:pPr>
+      <w:r>
+        <w:t>For temporal graphs, fixed export functionality and which clusters to report.</w:t>
+      </w:r>
+    </w:p>
+    <w:p>
+      <w:pPr>
+        <w:ind w:left="360" w:hanging="360"/>
+      </w:pPr>
+      <w:r>
+        <w:t>Restored run history functionality that was mistakenly removed in version 10.0.</w:t>
+      </w:r>
+    </w:p>
+    <w:p>
+      <w:pPr>
+        <w:ind w:left="360" w:hanging="360"/>
+        <w:rPr>
+          <w:b/>
+        </w:rPr>
+      </w:pPr>
+    </w:p>
+    <w:p>
+      <w:pPr>
+        <w:ind w:left="360" w:hanging="360"/>
+        <w:rPr>
+          <w:b/>
+        </w:rPr>
+      </w:pPr>
+      <w:r>
+        <w:rPr>
+          <w:b/>
+        </w:rPr>
+        <w:t>Version 10.2.5, September 2024</w:t>
       </w:r>
     </w:p>
     <w:p>
@@ -2129,35 +2180,29 @@
         <w:ind w:left="144" w:hanging="144"/>
       </w:pPr>
       <w:r>
-        <w:t>Correction to the Location Information file when using the Multiple Locations Per Observation File</w:t>
-      </w:r>
-      <w:r>
-        <w:t xml:space="preserve"> (correction related to 10.2.2 update)</w:t>
-      </w:r>
-      <w:r>
-        <w:t>.</w:t>
-      </w:r>
-    </w:p>
-    <w:p>
-      <w:pPr>
-        <w:ind w:left="360" w:hanging="360"/>
-        <w:rPr>
-          <w:b/>
-        </w:rPr>
-      </w:pPr>
-    </w:p>
-    <w:p>
-      <w:pPr>
-        <w:ind w:left="360" w:hanging="360"/>
-        <w:rPr>
-          <w:b/>
-        </w:rPr>
-      </w:pPr>
-      <w:r>
-        <w:rPr>
-          <w:b/>
-        </w:rPr>
-        <w:t>Version 10.2.3, August 2024</w:t>
+        <w:t>Disable the Gumbel approximation when scanning for low rates or for high or low rates. When using the Default P-value option, while scanning for low rates or for high or low rates, the Gumbel approximation is no longer used to calculate cluster p-values.</w:t>
+      </w:r>
+    </w:p>
+    <w:p>
+      <w:pPr>
+        <w:ind w:left="360" w:hanging="360"/>
+        <w:rPr>
+          <w:b/>
+        </w:rPr>
+      </w:pPr>
+    </w:p>
+    <w:p>
+      <w:pPr>
+        <w:ind w:left="360" w:hanging="360"/>
+        <w:rPr>
+          <w:b/>
+        </w:rPr>
+      </w:pPr>
+      <w:r>
+        <w:rPr>
+          <w:b/>
+        </w:rPr>
+        <w:t>Version 10.2.4, August 2024</w:t>
       </w:r>
     </w:p>
     <w:p>
@@ -2191,29 +2236,35 @@
         <w:ind w:left="144" w:hanging="144"/>
       </w:pPr>
       <w:r>
-        <w:t>Updated graphical user interface to address 508 compliance issues.</w:t>
-      </w:r>
-    </w:p>
-    <w:p>
-      <w:pPr>
-        <w:ind w:left="360" w:hanging="360"/>
-        <w:rPr>
-          <w:b/>
-        </w:rPr>
-      </w:pPr>
-    </w:p>
-    <w:p>
-      <w:pPr>
-        <w:ind w:left="360" w:hanging="360"/>
-        <w:rPr>
-          <w:b/>
-        </w:rPr>
-      </w:pPr>
-      <w:r>
-        <w:rPr>
-          <w:b/>
-        </w:rPr>
-        <w:t>Version 10.2.2, July 2024</w:t>
+        <w:t>Correction to the Location Information file when using the Multiple Locations Per Observation File</w:t>
+      </w:r>
+      <w:r>
+        <w:t xml:space="preserve"> (correction related to 10.2.2 update)</w:t>
+      </w:r>
+      <w:r>
+        <w:t>.</w:t>
+      </w:r>
+    </w:p>
+    <w:p>
+      <w:pPr>
+        <w:ind w:left="360" w:hanging="360"/>
+        <w:rPr>
+          <w:b/>
+        </w:rPr>
+      </w:pPr>
+    </w:p>
+    <w:p>
+      <w:pPr>
+        <w:ind w:left="360" w:hanging="360"/>
+        <w:rPr>
+          <w:b/>
+        </w:rPr>
+      </w:pPr>
+      <w:r>
+        <w:rPr>
+          <w:b/>
+        </w:rPr>
+        <w:t>Version 10.2.3, August 2024</w:t>
       </w:r>
     </w:p>
     <w:p>
@@ -2239,6 +2290,7 @@
           <w:i/>
           <w:iCs/>
         </w:rPr>
+        <w:lastRenderedPageBreak/>
         <w:t>Fixes</w:t>
       </w:r>
     </w:p>
@@ -2247,46 +2299,29 @@
         <w:ind w:left="144" w:hanging="144"/>
       </w:pPr>
       <w:r>
-        <w:t xml:space="preserve">Correction to </w:t>
-      </w:r>
-      <w:r>
-        <w:t xml:space="preserve">the </w:t>
-      </w:r>
-      <w:r>
-        <w:t>Location Information file when using the Multiple Locations Per Observation File.</w:t>
-      </w:r>
-    </w:p>
-    <w:p>
-      <w:pPr>
-        <w:ind w:left="144" w:hanging="144"/>
-      </w:pPr>
-      <w:r>
-        <w:t>Correction to Google Earth/Maps to escape reserved characters</w:t>
-      </w:r>
-      <w:r>
-        <w:t>.</w:t>
-      </w:r>
-    </w:p>
-    <w:p>
-      <w:pPr>
-        <w:ind w:left="360" w:hanging="360"/>
-        <w:rPr>
-          <w:b/>
-        </w:rPr>
-      </w:pPr>
-    </w:p>
-    <w:p>
-      <w:pPr>
-        <w:ind w:left="360" w:hanging="360"/>
-        <w:rPr>
-          <w:b/>
-        </w:rPr>
-      </w:pPr>
-      <w:r>
-        <w:rPr>
-          <w:b/>
-        </w:rPr>
-        <w:t>Version 10.2.1, July 2024</w:t>
+        <w:t>Updated graphical user interface to address 508 compliance issues.</w:t>
+      </w:r>
+    </w:p>
+    <w:p>
+      <w:pPr>
+        <w:ind w:left="360" w:hanging="360"/>
+        <w:rPr>
+          <w:b/>
+        </w:rPr>
+      </w:pPr>
+    </w:p>
+    <w:p>
+      <w:pPr>
+        <w:ind w:left="360" w:hanging="360"/>
+        <w:rPr>
+          <w:b/>
+        </w:rPr>
+      </w:pPr>
+      <w:r>
+        <w:rPr>
+          <w:b/>
+        </w:rPr>
+        <w:t>Version 10.2.2, July 2024</w:t>
       </w:r>
     </w:p>
     <w:p>
@@ -2317,7 +2352,7 @@
     </w:p>
     <w:p>
       <w:pPr>
-        <w:ind w:left="360" w:hanging="360"/>
+        <w:ind w:left="144" w:hanging="144"/>
       </w:pPr>
       <w:r>
         <w:t xml:space="preserve">Correction to </w:t>
@@ -2326,22 +2361,15 @@
         <w:t xml:space="preserve">the </w:t>
       </w:r>
       <w:r>
-        <w:t xml:space="preserve">percentage of the cases </w:t>
-      </w:r>
-      <w:r>
-        <w:t xml:space="preserve">reported </w:t>
-      </w:r>
-      <w:r>
-        <w:t xml:space="preserve">in </w:t>
-      </w:r>
-      <w:r>
-        <w:t xml:space="preserve">the </w:t>
-      </w:r>
-      <w:r>
-        <w:t>temporal graphs</w:t>
-      </w:r>
-      <w:r>
-        <w:t xml:space="preserve"> output</w:t>
+        <w:t>Location Information file when using the Multiple Locations Per Observation File.</w:t>
+      </w:r>
+    </w:p>
+    <w:p>
+      <w:pPr>
+        <w:ind w:left="144" w:hanging="144"/>
+      </w:pPr>
+      <w:r>
+        <w:t>Correction to Google Earth/Maps to escape reserved characters</w:t>
       </w:r>
       <w:r>
         <w:t>.</w:t>
@@ -2349,47 +2377,24 @@
     </w:p>
     <w:p>
       <w:pPr>
-        <w:ind w:left="144" w:hanging="144"/>
-      </w:pPr>
-      <w:r>
-        <w:t xml:space="preserve">Correction to </w:t>
-      </w:r>
-      <w:r>
-        <w:t xml:space="preserve">Google Maps </w:t>
-      </w:r>
-      <w:r>
-        <w:t xml:space="preserve">HTML and </w:t>
-      </w:r>
-      <w:r>
-        <w:t>JavaScript</w:t>
-      </w:r>
-      <w:r>
-        <w:t xml:space="preserve"> to escape reserved characters</w:t>
-      </w:r>
-      <w:r>
-        <w:t>.</w:t>
-      </w:r>
-    </w:p>
-    <w:p>
-      <w:pPr>
-        <w:ind w:left="360" w:hanging="360"/>
-        <w:rPr>
-          <w:b/>
-        </w:rPr>
-      </w:pPr>
-    </w:p>
-    <w:p>
-      <w:pPr>
-        <w:ind w:left="360" w:hanging="360"/>
-        <w:rPr>
-          <w:b/>
-        </w:rPr>
-      </w:pPr>
-      <w:r>
-        <w:rPr>
-          <w:b/>
-        </w:rPr>
-        <w:t>Version 10.2, June 2024</w:t>
+        <w:ind w:left="360" w:hanging="360"/>
+        <w:rPr>
+          <w:b/>
+        </w:rPr>
+      </w:pPr>
+    </w:p>
+    <w:p>
+      <w:pPr>
+        <w:ind w:left="360" w:hanging="360"/>
+        <w:rPr>
+          <w:b/>
+        </w:rPr>
+      </w:pPr>
+      <w:r>
+        <w:rPr>
+          <w:b/>
+        </w:rPr>
+        <w:t>Version 10.2.1, July 2024</w:t>
       </w:r>
     </w:p>
     <w:p>
@@ -2415,26 +2420,39 @@
           <w:i/>
           <w:iCs/>
         </w:rPr>
-        <w:t>Improvements</w:t>
-      </w:r>
-    </w:p>
-    <w:p>
-      <w:pPr>
-        <w:ind w:left="360" w:hanging="360"/>
-      </w:pPr>
-      <w:r>
-        <w:t xml:space="preserve">Ability to use </w:t>
-      </w:r>
-      <w:r>
-        <w:t>multiple coordinates per location when scanning on a network.</w:t>
-      </w:r>
-    </w:p>
-    <w:p>
-      <w:pPr>
-        <w:ind w:left="360" w:hanging="360"/>
-      </w:pPr>
-      <w:r>
-        <w:t xml:space="preserve">Improved wizard for importing case files with descriptive line list data about individuals. </w:t>
+        <w:t>Fixes</w:t>
+      </w:r>
+    </w:p>
+    <w:p>
+      <w:pPr>
+        <w:ind w:left="360" w:hanging="360"/>
+      </w:pPr>
+      <w:r>
+        <w:t xml:space="preserve">Correction to </w:t>
+      </w:r>
+      <w:r>
+        <w:t xml:space="preserve">the </w:t>
+      </w:r>
+      <w:r>
+        <w:t xml:space="preserve">percentage of the cases </w:t>
+      </w:r>
+      <w:r>
+        <w:t xml:space="preserve">reported </w:t>
+      </w:r>
+      <w:r>
+        <w:t xml:space="preserve">in </w:t>
+      </w:r>
+      <w:r>
+        <w:t xml:space="preserve">the </w:t>
+      </w:r>
+      <w:r>
+        <w:t>temporal graphs</w:t>
+      </w:r>
+      <w:r>
+        <w:t xml:space="preserve"> output</w:t>
+      </w:r>
+      <w:r>
+        <w:t>.</w:t>
       </w:r>
     </w:p>
     <w:p>
@@ -2442,137 +2460,19 @@
         <w:ind w:left="144" w:hanging="144"/>
       </w:pPr>
       <w:r>
-        <w:t xml:space="preserve">Results file report the cluster </w:t>
-      </w:r>
-      <w:r>
-        <w:rPr>
-          <w:i/>
-          <w:iCs/>
-        </w:rPr>
-        <w:t>‘span’</w:t>
-      </w:r>
-      <w:r>
-        <w:t xml:space="preserve">, defined as the distance between the two cluster locations furthest away. Especially useful when scanning on a network. </w:t>
-      </w:r>
-    </w:p>
-    <w:p>
-      <w:pPr>
-        <w:ind w:left="144" w:hanging="144"/>
-      </w:pPr>
-      <w:r>
-        <w:t>For prospective analyses, user specified cut-offs for performing or reporting analyses are defined in terms of recurrence intervals instead of p-values.</w:t>
-      </w:r>
-    </w:p>
-    <w:p>
-      <w:pPr>
-        <w:ind w:left="144" w:hanging="144"/>
-      </w:pPr>
-      <w:r>
-        <w:t>For the Poisson probability model, time stratified adjustments are implemented in the same manner as for the Bernoulli model.</w:t>
-      </w:r>
-    </w:p>
-    <w:p>
-      <w:pPr>
-        <w:ind w:left="360" w:hanging="360"/>
-      </w:pPr>
-      <w:r>
-        <w:t xml:space="preserve">For space-time analyses, the </w:t>
-      </w:r>
-      <w:r>
-        <w:t xml:space="preserve">Bernoulli drilldown </w:t>
-      </w:r>
-      <w:r>
-        <w:t xml:space="preserve">uses </w:t>
-      </w:r>
-      <w:r>
-        <w:t>the iterative scan.</w:t>
-      </w:r>
-    </w:p>
-    <w:p>
-      <w:pPr>
-        <w:ind w:left="144" w:hanging="144"/>
-      </w:pPr>
-      <w:r>
-        <w:t>When reporting clusters for space-time analyses, cluster overlap in not only defined geographically but also temporally, so that two non-overlapping clusters may both be reported when they are in the same place but at different times.</w:t>
-      </w:r>
-    </w:p>
-    <w:p>
-      <w:pPr>
-        <w:ind w:left="144" w:hanging="144"/>
-      </w:pPr>
-      <w:r>
-        <w:t>Google Maps and Google Earth output can display line-list information for individuals in detected clusters, to be used in cluster investigations.</w:t>
-      </w:r>
-    </w:p>
-    <w:p>
-      <w:pPr>
-        <w:ind w:left="144" w:hanging="144"/>
-      </w:pPr>
-      <w:r>
-        <w:t>For network analyses, ability to visualize the entire network in in Google Maps, Google Earth, or for Cartesian graphs.</w:t>
-      </w:r>
-    </w:p>
-    <w:p>
-      <w:pPr>
-        <w:ind w:left="144" w:hanging="144"/>
-      </w:pPr>
-      <w:r>
-        <w:t xml:space="preserve">For temporal graphs depicting detected clusters, it now reports the percentage of the cases in the geographical cluster area that are also in the temporal cluster window, while comparing that percentage to outside the cluster. </w:t>
-      </w:r>
-    </w:p>
-    <w:p>
-      <w:pPr>
-        <w:ind w:left="360" w:hanging="360"/>
-      </w:pPr>
-      <w:r>
-        <w:t>For the space-time permutation model, temporal graphs report observed/expected.</w:t>
-      </w:r>
-    </w:p>
-    <w:p>
-      <w:pPr>
-        <w:ind w:left="144" w:hanging="144"/>
-      </w:pPr>
-      <w:r>
-        <w:t>Option to send email notifications with summary information when using the multiple analysis feature.</w:t>
-      </w:r>
-    </w:p>
-    <w:p>
-      <w:pPr>
-        <w:ind w:left="360" w:hanging="360"/>
-        <w:rPr>
-          <w:bCs/>
-        </w:rPr>
-      </w:pPr>
-    </w:p>
-    <w:p>
-      <w:pPr>
-        <w:ind w:left="360" w:hanging="360"/>
-        <w:rPr>
-          <w:i/>
-          <w:iCs/>
-        </w:rPr>
-      </w:pPr>
-      <w:r>
-        <w:rPr>
-          <w:i/>
-          <w:iCs/>
-        </w:rPr>
-        <w:t>Minor Fixes</w:t>
-      </w:r>
-    </w:p>
-    <w:p>
-      <w:pPr>
-        <w:ind w:left="360" w:hanging="360"/>
-        <w:rPr>
-          <w:i/>
-          <w:iCs/>
-        </w:rPr>
-      </w:pPr>
-      <w:r>
-        <w:t>Faster file browsing</w:t>
-      </w:r>
-      <w:r>
-        <w:t xml:space="preserve"> for certain complex situations</w:t>
+        <w:t xml:space="preserve">Correction to </w:t>
+      </w:r>
+      <w:r>
+        <w:t xml:space="preserve">Google Maps </w:t>
+      </w:r>
+      <w:r>
+        <w:t xml:space="preserve">HTML and </w:t>
+      </w:r>
+      <w:r>
+        <w:t>JavaScript</w:t>
+      </w:r>
+      <w:r>
+        <w:t xml:space="preserve"> to escape reserved characters</w:t>
       </w:r>
       <w:r>
         <w:t>.</w:t>
@@ -2581,139 +2481,23 @@
     <w:p>
       <w:pPr>
         <w:ind w:left="360" w:hanging="360"/>
-      </w:pPr>
-      <w:r>
-        <w:t xml:space="preserve">Import file wizard estimates the number of columns by sampling up to </w:t>
-      </w:r>
-      <w:r>
-        <w:t>200</w:t>
-      </w:r>
-      <w:r>
-        <w:t xml:space="preserve"> records.</w:t>
-      </w:r>
-    </w:p>
-    <w:p>
-      <w:pPr>
-        <w:ind w:left="144" w:hanging="144"/>
-      </w:pPr>
-      <w:r>
-        <w:t>M</w:t>
-      </w:r>
-      <w:r>
-        <w:t>ultiple analyses window is refreshed when the user leave</w:t>
-      </w:r>
-      <w:r>
-        <w:t>s</w:t>
-      </w:r>
-      <w:r>
-        <w:t xml:space="preserve"> it open while a background process runs the multiple analyses (crontab, scheduler, etc.).</w:t>
-      </w:r>
-    </w:p>
-    <w:p>
-      <w:pPr>
-        <w:ind w:left="360" w:hanging="360"/>
-      </w:pPr>
-      <w:r>
-        <w:t>Fixed program crash when weighted normal model was used with covariates.</w:t>
-      </w:r>
-    </w:p>
-    <w:p>
-      <w:pPr>
-        <w:ind w:left="144" w:hanging="144"/>
-      </w:pPr>
-      <w:r>
-        <w:t xml:space="preserve">Updated </w:t>
-      </w:r>
-      <w:r>
-        <w:t>results</w:t>
-      </w:r>
-      <w:r>
-        <w:t xml:space="preserve"> file to report cluster population </w:t>
-      </w:r>
-      <w:r>
-        <w:t>with</w:t>
-      </w:r>
-      <w:r>
-        <w:t xml:space="preserve">in </w:t>
-      </w:r>
-      <w:r>
-        <w:t xml:space="preserve">each </w:t>
-      </w:r>
-      <w:r>
-        <w:t xml:space="preserve">data set section when using multiple data </w:t>
-      </w:r>
-      <w:r>
-        <w:t>sets.</w:t>
-      </w:r>
-    </w:p>
-    <w:p>
-      <w:pPr>
-        <w:ind w:left="144" w:hanging="144"/>
-      </w:pPr>
-      <w:r>
-        <w:t>Updated the Cartesian graph to correctly display clusters when there are multiple data sets.</w:t>
-      </w:r>
-    </w:p>
-    <w:p>
-      <w:pPr>
-        <w:ind w:left="144" w:hanging="144"/>
-      </w:pPr>
-      <w:r>
-        <w:t xml:space="preserve">Reworded </w:t>
-      </w:r>
-      <w:r>
-        <w:t>warning</w:t>
-      </w:r>
-      <w:r>
-        <w:t>s</w:t>
-      </w:r>
-      <w:r>
-        <w:t xml:space="preserve"> printed to </w:t>
-      </w:r>
-      <w:r>
-        <w:t xml:space="preserve">the </w:t>
-      </w:r>
-      <w:r>
-        <w:t>results</w:t>
-      </w:r>
-      <w:r>
-        <w:t xml:space="preserve"> file when a data set has been excluded</w:t>
-      </w:r>
-      <w:r>
-        <w:t xml:space="preserve"> from the analysis</w:t>
-      </w:r>
-      <w:r>
-        <w:t>.</w:t>
-      </w:r>
-    </w:p>
-    <w:p>
-      <w:pPr>
-        <w:ind w:left="360" w:hanging="360"/>
-      </w:pPr>
-      <w:r>
-        <w:t>Temporal graphs load quicker.</w:t>
-      </w:r>
-    </w:p>
-    <w:p>
-      <w:pPr>
-        <w:ind w:left="360" w:hanging="360"/>
-        <w:rPr>
-          <w:b/>
-        </w:rPr>
-      </w:pPr>
-    </w:p>
-    <w:p>
-      <w:pPr>
-        <w:ind w:left="360" w:hanging="360"/>
-        <w:rPr>
-          <w:b/>
-        </w:rPr>
-      </w:pPr>
-      <w:r>
-        <w:rPr>
-          <w:b/>
-        </w:rPr>
-        <w:t>Version 10.1.3, February 2024</w:t>
+        <w:rPr>
+          <w:b/>
+        </w:rPr>
+      </w:pPr>
+    </w:p>
+    <w:p>
+      <w:pPr>
+        <w:ind w:left="360" w:hanging="360"/>
+        <w:rPr>
+          <w:b/>
+        </w:rPr>
+      </w:pPr>
+      <w:r>
+        <w:rPr>
+          <w:b/>
+        </w:rPr>
+        <w:t>Version 10.2, June 2024</w:t>
       </w:r>
     </w:p>
     <w:p>
@@ -2728,6 +2512,331 @@
     </w:p>
     <w:p>
       <w:pPr>
+        <w:ind w:left="360" w:hanging="360"/>
+        <w:rPr>
+          <w:i/>
+          <w:iCs/>
+        </w:rPr>
+      </w:pPr>
+      <w:r>
+        <w:rPr>
+          <w:i/>
+          <w:iCs/>
+        </w:rPr>
+        <w:t>Improvements</w:t>
+      </w:r>
+    </w:p>
+    <w:p>
+      <w:pPr>
+        <w:ind w:left="360" w:hanging="360"/>
+      </w:pPr>
+      <w:r>
+        <w:t xml:space="preserve">Ability to use </w:t>
+      </w:r>
+      <w:r>
+        <w:t>multiple coordinates per location when scanning on a network.</w:t>
+      </w:r>
+    </w:p>
+    <w:p>
+      <w:pPr>
+        <w:ind w:left="360" w:hanging="360"/>
+      </w:pPr>
+      <w:r>
+        <w:t xml:space="preserve">Improved wizard for importing case files with descriptive line list data about individuals. </w:t>
+      </w:r>
+    </w:p>
+    <w:p>
+      <w:pPr>
+        <w:ind w:left="144" w:hanging="144"/>
+      </w:pPr>
+      <w:r>
+        <w:t xml:space="preserve">Results file report the cluster </w:t>
+      </w:r>
+      <w:r>
+        <w:rPr>
+          <w:i/>
+          <w:iCs/>
+        </w:rPr>
+        <w:t>‘span’</w:t>
+      </w:r>
+      <w:r>
+        <w:t xml:space="preserve">, defined as the distance between the two cluster locations furthest away. Especially useful when scanning on a network. </w:t>
+      </w:r>
+    </w:p>
+    <w:p>
+      <w:pPr>
+        <w:ind w:left="144" w:hanging="144"/>
+      </w:pPr>
+      <w:r>
+        <w:t>For prospective analyses, user specified cut-offs for performing or reporting analyses are defined in terms of recurrence intervals instead of p-values.</w:t>
+      </w:r>
+    </w:p>
+    <w:p>
+      <w:pPr>
+        <w:ind w:left="144" w:hanging="144"/>
+      </w:pPr>
+      <w:r>
+        <w:t>For the Poisson probability model, time stratified adjustments are implemented in the same manner as for the Bernoulli model.</w:t>
+      </w:r>
+    </w:p>
+    <w:p>
+      <w:pPr>
+        <w:ind w:left="360" w:hanging="360"/>
+      </w:pPr>
+      <w:r>
+        <w:t xml:space="preserve">For space-time analyses, the </w:t>
+      </w:r>
+      <w:r>
+        <w:t xml:space="preserve">Bernoulli drilldown </w:t>
+      </w:r>
+      <w:r>
+        <w:t xml:space="preserve">uses </w:t>
+      </w:r>
+      <w:r>
+        <w:t>the iterative scan.</w:t>
+      </w:r>
+    </w:p>
+    <w:p>
+      <w:pPr>
+        <w:ind w:left="144" w:hanging="144"/>
+      </w:pPr>
+      <w:r>
+        <w:t>When reporting clusters for space-time analyses, cluster overlap in not only defined geographically but also temporally, so that two non-overlapping clusters may both be reported when they are in the same place but at different times.</w:t>
+      </w:r>
+    </w:p>
+    <w:p>
+      <w:pPr>
+        <w:ind w:left="144" w:hanging="144"/>
+      </w:pPr>
+      <w:r>
+        <w:t>Google Maps and Google Earth output can display line-list information for individuals in detected clusters, to be used in cluster investigations.</w:t>
+      </w:r>
+    </w:p>
+    <w:p>
+      <w:pPr>
+        <w:ind w:left="144" w:hanging="144"/>
+      </w:pPr>
+      <w:r>
+        <w:t>For network analyses, ability to visualize the entire network in in Google Maps, Google Earth, or for Cartesian graphs.</w:t>
+      </w:r>
+    </w:p>
+    <w:p>
+      <w:pPr>
+        <w:ind w:left="144" w:hanging="144"/>
+      </w:pPr>
+      <w:r>
+        <w:t xml:space="preserve">For temporal graphs depicting detected clusters, it now reports the percentage of the cases in the geographical cluster area that are also in the temporal cluster window, while comparing that percentage to outside the cluster. </w:t>
+      </w:r>
+    </w:p>
+    <w:p>
+      <w:pPr>
+        <w:ind w:left="360" w:hanging="360"/>
+      </w:pPr>
+      <w:r>
+        <w:t>For the space-time permutation model, temporal graphs report observed/expected.</w:t>
+      </w:r>
+    </w:p>
+    <w:p>
+      <w:pPr>
+        <w:ind w:left="144" w:hanging="144"/>
+      </w:pPr>
+      <w:r>
+        <w:t>Option to send email notifications with summary information when using the multiple analysis feature.</w:t>
+      </w:r>
+    </w:p>
+    <w:p>
+      <w:pPr>
+        <w:ind w:left="360" w:hanging="360"/>
+        <w:rPr>
+          <w:bCs/>
+        </w:rPr>
+      </w:pPr>
+    </w:p>
+    <w:p>
+      <w:pPr>
+        <w:ind w:left="360" w:hanging="360"/>
+        <w:rPr>
+          <w:i/>
+          <w:iCs/>
+        </w:rPr>
+      </w:pPr>
+      <w:r>
+        <w:rPr>
+          <w:i/>
+          <w:iCs/>
+        </w:rPr>
+        <w:t>Minor Fixes</w:t>
+      </w:r>
+    </w:p>
+    <w:p>
+      <w:pPr>
+        <w:ind w:left="360" w:hanging="360"/>
+        <w:rPr>
+          <w:i/>
+          <w:iCs/>
+        </w:rPr>
+      </w:pPr>
+      <w:r>
+        <w:t>Faster file browsing</w:t>
+      </w:r>
+      <w:r>
+        <w:t xml:space="preserve"> for certain complex situations</w:t>
+      </w:r>
+      <w:r>
+        <w:t>.</w:t>
+      </w:r>
+    </w:p>
+    <w:p>
+      <w:pPr>
+        <w:ind w:left="360" w:hanging="360"/>
+      </w:pPr>
+      <w:r>
+        <w:t xml:space="preserve">Import file wizard estimates the number of columns by sampling up to </w:t>
+      </w:r>
+      <w:r>
+        <w:t>200</w:t>
+      </w:r>
+      <w:r>
+        <w:t xml:space="preserve"> records.</w:t>
+      </w:r>
+    </w:p>
+    <w:p>
+      <w:pPr>
+        <w:ind w:left="144" w:hanging="144"/>
+      </w:pPr>
+      <w:r>
+        <w:t>M</w:t>
+      </w:r>
+      <w:r>
+        <w:t>ultiple analyses window is refreshed when the user leave</w:t>
+      </w:r>
+      <w:r>
+        <w:t>s</w:t>
+      </w:r>
+      <w:r>
+        <w:t xml:space="preserve"> it open while a background process runs the multiple analyses (crontab, scheduler, etc.).</w:t>
+      </w:r>
+    </w:p>
+    <w:p>
+      <w:pPr>
+        <w:ind w:left="360" w:hanging="360"/>
+      </w:pPr>
+      <w:r>
+        <w:t>Fixed program crash when weighted normal model was used with covariates.</w:t>
+      </w:r>
+    </w:p>
+    <w:p>
+      <w:pPr>
+        <w:ind w:left="144" w:hanging="144"/>
+      </w:pPr>
+      <w:r>
+        <w:lastRenderedPageBreak/>
+        <w:t xml:space="preserve">Updated </w:t>
+      </w:r>
+      <w:r>
+        <w:t>results</w:t>
+      </w:r>
+      <w:r>
+        <w:t xml:space="preserve"> file to report cluster population </w:t>
+      </w:r>
+      <w:r>
+        <w:t>with</w:t>
+      </w:r>
+      <w:r>
+        <w:t xml:space="preserve">in </w:t>
+      </w:r>
+      <w:r>
+        <w:t xml:space="preserve">each </w:t>
+      </w:r>
+      <w:r>
+        <w:t xml:space="preserve">data set section when using multiple data </w:t>
+      </w:r>
+      <w:r>
+        <w:t>sets.</w:t>
+      </w:r>
+    </w:p>
+    <w:p>
+      <w:pPr>
+        <w:ind w:left="144" w:hanging="144"/>
+      </w:pPr>
+      <w:r>
+        <w:t>Updated the Cartesian graph to correctly display clusters when there are multiple data sets.</w:t>
+      </w:r>
+    </w:p>
+    <w:p>
+      <w:pPr>
+        <w:ind w:left="144" w:hanging="144"/>
+      </w:pPr>
+      <w:r>
+        <w:t xml:space="preserve">Reworded </w:t>
+      </w:r>
+      <w:r>
+        <w:t>warning</w:t>
+      </w:r>
+      <w:r>
+        <w:t>s</w:t>
+      </w:r>
+      <w:r>
+        <w:t xml:space="preserve"> printed to </w:t>
+      </w:r>
+      <w:r>
+        <w:t xml:space="preserve">the </w:t>
+      </w:r>
+      <w:r>
+        <w:t>results</w:t>
+      </w:r>
+      <w:r>
+        <w:t xml:space="preserve"> file when a data set has been excluded</w:t>
+      </w:r>
+      <w:r>
+        <w:t xml:space="preserve"> from the analysis</w:t>
+      </w:r>
+      <w:r>
+        <w:t>.</w:t>
+      </w:r>
+    </w:p>
+    <w:p>
+      <w:pPr>
+        <w:ind w:left="360" w:hanging="360"/>
+      </w:pPr>
+      <w:r>
+        <w:t>Temporal graphs load quicker.</w:t>
+      </w:r>
+    </w:p>
+    <w:p>
+      <w:pPr>
+        <w:ind w:left="360" w:hanging="360"/>
+        <w:rPr>
+          <w:b/>
+        </w:rPr>
+      </w:pPr>
+    </w:p>
+    <w:p>
+      <w:pPr>
+        <w:ind w:left="360" w:hanging="360"/>
+        <w:rPr>
+          <w:b/>
+        </w:rPr>
+      </w:pPr>
+      <w:r>
+        <w:rPr>
+          <w:b/>
+        </w:rPr>
+        <w:t>Version 10.1.3, February 2024</w:t>
+      </w:r>
+    </w:p>
+    <w:p>
+      <w:pPr>
+        <w:ind w:left="360" w:hanging="360"/>
+        <w:rPr>
+          <w:b/>
+          <w:sz w:val="12"/>
+          <w:szCs w:val="12"/>
+        </w:rPr>
+      </w:pPr>
+    </w:p>
+    <w:p>
+      <w:pPr>
         <w:rPr>
           <w:i/>
         </w:rPr>
@@ -4257,6 +4366,7 @@
         <w:ind w:left="360" w:hanging="360"/>
       </w:pPr>
       <w:r>
+        <w:lastRenderedPageBreak/>
         <w:t xml:space="preserve">Spatial output graph </w:t>
       </w:r>
       <w:r>
@@ -5279,6 +5389,7 @@
         <w:rPr>
           <w:bCs/>
         </w:rPr>
+        <w:lastRenderedPageBreak/>
         <w:t>Select command-line overrides caused ambiguous parameter error.</w:t>
       </w:r>
     </w:p>
@@ -6127,6 +6238,7 @@
         <w:rPr>
           <w:color w:val="000000"/>
         </w:rPr>
+        <w:lastRenderedPageBreak/>
         <w:t>Total population reported with Iterative Scan Statistic was not adjusted for earlier iterations when using the Poisson model</w:t>
       </w:r>
       <w:r>
@@ -7087,8 +7199,8 @@
       <w:r>
         <w:t xml:space="preserve">Sequential </w:t>
       </w:r>
-      <w:smartTag w:uri="urn:schemas-microsoft-com:office:smarttags" w:element="place">
-        <w:smartTag w:uri="urn:schemas-microsoft-com:office:smarttags" w:element="City">
+      <w:smartTag w:uri="urn:schemas-microsoft-com:office:smarttags" w:element="City">
+        <w:smartTag w:uri="urn:schemas-microsoft-com:office:smarttags" w:element="place">
           <w:r>
             <w:t>Monte Carlo</w:t>
           </w:r>
@@ -7530,6 +7642,7 @@
         <w:rPr>
           <w:b/>
         </w:rPr>
+        <w:lastRenderedPageBreak/>
         <w:t>Version 8.0.2, November 9, 2009</w:t>
       </w:r>
     </w:p>
@@ -8563,6 +8676,7 @@
         <w:ind w:left="144" w:hanging="144"/>
       </w:pPr>
       <w:r>
+        <w:lastRenderedPageBreak/>
         <w:t xml:space="preserve">Updated main file output to report cluster population in data set section, when using multiple data </w:t>
       </w:r>
       <w:r>
@@ -8962,6 +9076,7 @@
         <w:rPr>
           <w:bCs/>
         </w:rPr>
+        <w:lastRenderedPageBreak/>
         <w:t>Revised reporting of cluster information multivariate analyses with multiple data sets.</w:t>
       </w:r>
     </w:p>
@@ -9821,6 +9936,7 @@
         <w:ind w:left="144" w:hanging="144"/>
       </w:pPr>
       <w:r>
+        <w:lastRenderedPageBreak/>
         <w:t xml:space="preserve">Option not to adjust for previous analyses when doing prospective analyses. This replaces the alive cluster option, which did the same thing but with more limited output information. </w:t>
       </w:r>
     </w:p>
@@ -10235,6 +10351,7 @@
         <w:ind w:left="144" w:hanging="144"/>
       </w:pPr>
       <w:r>
+        <w:lastRenderedPageBreak/>
         <w:t>Analysis history file created with brief information about each analysis run performed. It is automatically generated in dBase format.</w:t>
       </w:r>
     </w:p>
@@ -11018,6 +11135,7 @@
         <w:rPr>
           <w:b/>
         </w:rPr>
+        <w:lastRenderedPageBreak/>
         <w:t>Version 2.1, July 29, 1998</w:t>
       </w:r>
     </w:p>
@@ -11583,8 +11701,8 @@
         </w:rPr>
         <w:t xml:space="preserve">Sample data: Brain cancer incidence in </w:t>
       </w:r>
-      <w:smartTag w:uri="urn:schemas-microsoft-com:office:smarttags" w:element="State">
-        <w:smartTag w:uri="urn:schemas-microsoft-com:office:smarttags" w:element="place">
+      <w:smartTag w:uri="urn:schemas-microsoft-com:office:smarttags" w:element="place">
+        <w:smartTag w:uri="urn:schemas-microsoft-com:office:smarttags" w:element="State">
           <w:r>
             <w:rPr>
               <w:bCs/>
@@ -11711,7 +11829,7 @@
 </file>
 
 <file path=word/numbering.xml><?xml version="1.0" encoding="utf-8"?>
-<w:numbering xmlns:wpc="http://schemas.microsoft.com/office/word/2010/wordprocessingCanvas" xmlns:cx="http://schemas.microsoft.com/office/drawing/2014/chartex" xmlns:cx1="http://schemas.microsoft.com/office/drawing/2015/9/8/chartex" xmlns:cx2="http://schemas.microsoft.com/office/drawing/2015/10/21/chartex" xmlns:cx3="http://schemas.microsoft.com/office/drawing/2016/5/9/chartex" xmlns:cx4="http://schemas.microsoft.com/office/drawing/2016/5/10/chartex" xmlns:cx5="http://schemas.microsoft.com/office/drawing/2016/5/11/chartex" xmlns:cx6="http://schemas.microsoft.com/office/drawing/2016/5/12/chartex" xmlns:cx7="http://schemas.microsoft.com/office/drawing/2016/5/13/chartex" xmlns:cx8="http://schemas.microsoft.com/office/drawing/2016/5/14/chartex" xmlns:mc="http://schemas.openxmlformats.org/markup-compatibility/2006" xmlns:aink="http://schemas.microsoft.com/office/drawing/2016/ink" xmlns:am3d="http://schemas.microsoft.com/office/drawing/2017/model3d" xmlns:o="urn:schemas-microsoft-com:office:office" xmlns:oel="http://schemas.microsoft.com/office/2019/extlst" xmlns:r="http://schemas.openxmlformats.org/officeDocument/2006/relationships" xmlns:m="http://schemas.openxmlformats.org/officeDocument/2006/math" xmlns:v="urn:schemas-microsoft-com:vml" xmlns:wp14="http://schemas.microsoft.com/office/word/2010/wordprocessingDrawing" xmlns:wp="http://schemas.openxmlformats.org/drawingml/2006/wordprocessingDrawing" xmlns:w10="urn:schemas-microsoft-com:office:word" xmlns:w="http://schemas.openxmlformats.org/wordprocessingml/2006/main" xmlns:w14="http://schemas.microsoft.com/office/word/2010/wordml" xmlns:w15="http://schemas.microsoft.com/office/word/2012/wordml" xmlns:w16cex="http://schemas.microsoft.com/office/word/2018/wordml/cex" xmlns:w16cid="http://schemas.microsoft.com/office/word/2016/wordml/cid" xmlns:w16="http://schemas.microsoft.com/office/word/2018/wordml" xmlns:w16sdtdh="http://schemas.microsoft.com/office/word/2020/wordml/sdtdatahash" xmlns:w16se="http://schemas.microsoft.com/office/word/2015/wordml/symex" xmlns:wpg="http://schemas.microsoft.com/office/word/2010/wordprocessingGroup" xmlns:wpi="http://schemas.microsoft.com/office/word/2010/wordprocessingInk" xmlns:wne="http://schemas.microsoft.com/office/word/2006/wordml" xmlns:wps="http://schemas.microsoft.com/office/word/2010/wordprocessingShape" mc:Ignorable="w14 w15 w16se w16cid w16 w16cex w16sdtdh wp14">
+<w:numbering xmlns:wpc="http://schemas.microsoft.com/office/word/2010/wordprocessingCanvas" xmlns:cx="http://schemas.microsoft.com/office/drawing/2014/chartex" xmlns:cx1="http://schemas.microsoft.com/office/drawing/2015/9/8/chartex" xmlns:cx2="http://schemas.microsoft.com/office/drawing/2015/10/21/chartex" xmlns:cx3="http://schemas.microsoft.com/office/drawing/2016/5/9/chartex" xmlns:cx4="http://schemas.microsoft.com/office/drawing/2016/5/10/chartex" xmlns:cx5="http://schemas.microsoft.com/office/drawing/2016/5/11/chartex" xmlns:cx6="http://schemas.microsoft.com/office/drawing/2016/5/12/chartex" xmlns:cx7="http://schemas.microsoft.com/office/drawing/2016/5/13/chartex" xmlns:cx8="http://schemas.microsoft.com/office/drawing/2016/5/14/chartex" xmlns:mc="http://schemas.openxmlformats.org/markup-compatibility/2006" xmlns:aink="http://schemas.microsoft.com/office/drawing/2016/ink" xmlns:am3d="http://schemas.microsoft.com/office/drawing/2017/model3d" xmlns:o="urn:schemas-microsoft-com:office:office" xmlns:oel="http://schemas.microsoft.com/office/2019/extlst" xmlns:r="http://schemas.openxmlformats.org/officeDocument/2006/relationships" xmlns:m="http://schemas.openxmlformats.org/officeDocument/2006/math" xmlns:v="urn:schemas-microsoft-com:vml" xmlns:wp14="http://schemas.microsoft.com/office/word/2010/wordprocessingDrawing" xmlns:wp="http://schemas.openxmlformats.org/drawingml/2006/wordprocessingDrawing" xmlns:w10="urn:schemas-microsoft-com:office:word" xmlns:w="http://schemas.openxmlformats.org/wordprocessingml/2006/main" xmlns:w14="http://schemas.microsoft.com/office/word/2010/wordml" xmlns:w15="http://schemas.microsoft.com/office/word/2012/wordml" xmlns:w16cex="http://schemas.microsoft.com/office/word/2018/wordml/cex" xmlns:w16cid="http://schemas.microsoft.com/office/word/2016/wordml/cid" xmlns:w16="http://schemas.microsoft.com/office/word/2018/wordml" xmlns:w16du="http://schemas.microsoft.com/office/word/2023/wordml/word16du" xmlns:w16sdtdh="http://schemas.microsoft.com/office/word/2020/wordml/sdtdatahash" xmlns:w16sdtfl="http://schemas.microsoft.com/office/word/2024/wordml/sdtformatlock" xmlns:w16se="http://schemas.microsoft.com/office/word/2015/wordml/symex" xmlns:wpg="http://schemas.microsoft.com/office/word/2010/wordprocessingGroup" xmlns:wpi="http://schemas.microsoft.com/office/word/2010/wordprocessingInk" xmlns:wne="http://schemas.microsoft.com/office/word/2006/wordml" xmlns:wps="http://schemas.microsoft.com/office/word/2010/wordprocessingShape" mc:Ignorable="w14 w15 w16se w16cid w16 w16cex w16sdtdh w16sdtfl w16du wp14">
   <w:abstractNum w:abstractNumId="0" w15:restartNumberingAfterBreak="0">
     <w:nsid w:val="FFFFFF89"/>
     <w:multiLevelType w:val="singleLevel"/>
@@ -11971,7 +12089,7 @@
 </file>
 
 <file path=word/styles.xml><?xml version="1.0" encoding="utf-8"?>
-<w:styles xmlns:mc="http://schemas.openxmlformats.org/markup-compatibility/2006" xmlns:r="http://schemas.openxmlformats.org/officeDocument/2006/relationships" xmlns:w="http://schemas.openxmlformats.org/wordprocessingml/2006/main" xmlns:w14="http://schemas.microsoft.com/office/word/2010/wordml" xmlns:w15="http://schemas.microsoft.com/office/word/2012/wordml" xmlns:w16cex="http://schemas.microsoft.com/office/word/2018/wordml/cex" xmlns:w16cid="http://schemas.microsoft.com/office/word/2016/wordml/cid" xmlns:w16="http://schemas.microsoft.com/office/word/2018/wordml" xmlns:w16sdtdh="http://schemas.microsoft.com/office/word/2020/wordml/sdtdatahash" xmlns:w16se="http://schemas.microsoft.com/office/word/2015/wordml/symex" mc:Ignorable="w14 w15 w16se w16cid w16 w16cex w16sdtdh">
+<w:styles xmlns:mc="http://schemas.openxmlformats.org/markup-compatibility/2006" xmlns:r="http://schemas.openxmlformats.org/officeDocument/2006/relationships" xmlns:w="http://schemas.openxmlformats.org/wordprocessingml/2006/main" xmlns:w14="http://schemas.microsoft.com/office/word/2010/wordml" xmlns:w15="http://schemas.microsoft.com/office/word/2012/wordml" xmlns:w16cex="http://schemas.microsoft.com/office/word/2018/wordml/cex" xmlns:w16cid="http://schemas.microsoft.com/office/word/2016/wordml/cid" xmlns:w16="http://schemas.microsoft.com/office/word/2018/wordml" xmlns:w16du="http://schemas.microsoft.com/office/word/2023/wordml/word16du" xmlns:w16sdtdh="http://schemas.microsoft.com/office/word/2020/wordml/sdtdatahash" xmlns:w16sdtfl="http://schemas.microsoft.com/office/word/2024/wordml/sdtformatlock" xmlns:w16se="http://schemas.microsoft.com/office/word/2015/wordml/symex" mc:Ignorable="w14 w15 w16se w16cid w16 w16cex w16sdtdh w16sdtfl w16du">
   <w:docDefaults>
     <w:rPrDefault>
       <w:rPr>

</xml_diff>

<commit_message>
#66730 - added docker files, and updates, to build Linux using gcc 11 from containers
</commit_message>
<xml_diff>
--- a/Doc/SaTScan Version History.docx
+++ b/Doc/SaTScan Version History.docx
@@ -1591,6 +1591,92 @@
     </w:p>
     <w:p>
       <w:pPr>
+        <w:pStyle w:val="Heading1"/>
+        <w:ind w:left="720" w:hanging="720"/>
+        <w:jc w:val="left"/>
+        <w:rPr>
+          <w:i w:val="0"/>
+        </w:rPr>
+      </w:pPr>
+      <w:r>
+        <w:rPr>
+          <w:i w:val="0"/>
+        </w:rPr>
+        <w:t>20</w:t>
+      </w:r>
+      <w:r>
+        <w:rPr>
+          <w:i w:val="0"/>
+        </w:rPr>
+        <w:t>2</w:t>
+      </w:r>
+      <w:r>
+        <w:rPr>
+          <w:i w:val="0"/>
+        </w:rPr>
+        <w:t>6</w:t>
+      </w:r>
+      <w:r>
+        <w:rPr>
+          <w:i w:val="0"/>
+        </w:rPr>
+        <w:t xml:space="preserve"> </w:t>
+      </w:r>
+      <w:r>
+        <w:rPr>
+          <w:i w:val="0"/>
+        </w:rPr>
+        <w:tab/>
+      </w:r>
+      <w:r>
+        <w:rPr>
+          <w:b/>
+          <w:i w:val="0"/>
+        </w:rPr>
+        <w:t xml:space="preserve">Version </w:t>
+      </w:r>
+      <w:r>
+        <w:rPr>
+          <w:b/>
+          <w:i w:val="0"/>
+        </w:rPr>
+        <w:t>10.</w:t>
+      </w:r>
+      <w:r>
+        <w:rPr>
+          <w:b/>
+          <w:i w:val="0"/>
+        </w:rPr>
+        <w:t>4</w:t>
+      </w:r>
+      <w:r>
+        <w:rPr>
+          <w:b/>
+          <w:i w:val="0"/>
+        </w:rPr>
+        <w:t>:</w:t>
+      </w:r>
+      <w:r>
+        <w:rPr>
+          <w:i w:val="0"/>
+        </w:rPr>
+        <w:t xml:space="preserve"> </w:t>
+      </w:r>
+      <w:r>
+        <w:rPr>
+          <w:i w:val="0"/>
+        </w:rPr>
+        <w:t>Major feature</w:t>
+      </w:r>
+      <w:r>
+        <w:rPr>
+          <w:i w:val="0"/>
+        </w:rPr>
+        <w:t>.</w:t>
+      </w:r>
+    </w:p>
+    <w:p>
+      <w:pPr>
         <w:ind w:left="720" w:hanging="720"/>
         <w:rPr>
           <w:bCs/>
@@ -1618,13 +1704,13 @@
         <w:rPr>
           <w:b/>
         </w:rPr>
-        <w:t>Version 10.3.</w:t>
-      </w:r>
-      <w:r>
-        <w:rPr>
-          <w:b/>
-        </w:rPr>
-        <w:t>3</w:t>
+        <w:t>Version 10.</w:t>
+      </w:r>
+      <w:r>
+        <w:rPr>
+          <w:b/>
+        </w:rPr>
+        <w:t>4</w:t>
       </w:r>
       <w:r>
         <w:rPr>
@@ -1636,13 +1722,19 @@
         <w:rPr>
           <w:b/>
         </w:rPr>
-        <w:t>September</w:t>
-      </w:r>
-      <w:r>
-        <w:rPr>
-          <w:b/>
-        </w:rPr>
-        <w:t xml:space="preserve"> 2025</w:t>
+        <w:t>July</w:t>
+      </w:r>
+      <w:r>
+        <w:rPr>
+          <w:b/>
+        </w:rPr>
+        <w:t xml:space="preserve"> 202</w:t>
+      </w:r>
+      <w:r>
+        <w:rPr>
+          <w:b/>
+        </w:rPr>
+        <w:t>6</w:t>
       </w:r>
     </w:p>
     <w:p>
@@ -1668,81 +1760,126 @@
           <w:i/>
           <w:iCs/>
         </w:rPr>
-        <w:t>Fixes</w:t>
+        <w:t>New Analytical Features</w:t>
       </w:r>
     </w:p>
     <w:p>
       <w:pPr>
         <w:ind w:left="144" w:hanging="144"/>
       </w:pPr>
-      <w:r>
-        <w:t xml:space="preserve">Correction </w:t>
-      </w:r>
-      <w:r>
-        <w:t>in the batched model when using multiple data sets</w:t>
-      </w:r>
+      <w:proofErr w:type="spellStart"/>
+      <w:r>
+        <w:t>xyz</w:t>
+      </w:r>
+      <w:proofErr w:type="spellEnd"/>
       <w:r>
         <w:t>.</w:t>
       </w:r>
     </w:p>
     <w:p>
       <w:pPr>
+        <w:ind w:left="360" w:hanging="360"/>
+        <w:rPr>
+          <w:i/>
+        </w:rPr>
+      </w:pPr>
+    </w:p>
+    <w:p>
+      <w:pPr>
+        <w:ind w:left="360" w:hanging="360"/>
+        <w:rPr>
+          <w:bCs/>
+        </w:rPr>
+      </w:pPr>
+      <w:r>
+        <w:rPr>
+          <w:i/>
+        </w:rPr>
+        <w:t xml:space="preserve">Other </w:t>
+      </w:r>
+      <w:r>
+        <w:rPr>
+          <w:i/>
+        </w:rPr>
+        <w:t>Improvements</w:t>
+      </w:r>
+      <w:r>
+        <w:rPr>
+          <w:bCs/>
+        </w:rPr>
+        <w:t xml:space="preserve"> </w:t>
+      </w:r>
+    </w:p>
+    <w:p>
+      <w:pPr>
         <w:ind w:left="144" w:hanging="144"/>
-      </w:pPr>
-      <w:r>
-        <w:t xml:space="preserve">Correction </w:t>
-      </w:r>
-      <w:r>
-        <w:t xml:space="preserve">when using </w:t>
-      </w:r>
-      <w:r>
-        <w:t xml:space="preserve">the </w:t>
-      </w:r>
-      <w:r>
-        <w:t xml:space="preserve">network file </w:t>
-      </w:r>
-      <w:r>
-        <w:t>with</w:t>
-      </w:r>
-      <w:r>
-        <w:t xml:space="preserve"> multiple locations</w:t>
-      </w:r>
-      <w:r>
-        <w:t>.</w:t>
-      </w:r>
-    </w:p>
-    <w:p>
-      <w:pPr>
-        <w:ind w:left="360" w:hanging="360"/>
-        <w:rPr>
-          <w:b/>
-        </w:rPr>
-      </w:pPr>
-    </w:p>
-    <w:p>
-      <w:pPr>
-        <w:ind w:left="360" w:hanging="360"/>
-        <w:rPr>
-          <w:b/>
-        </w:rPr>
-      </w:pPr>
-      <w:r>
-        <w:rPr>
-          <w:b/>
-        </w:rPr>
-        <w:t xml:space="preserve">Version 10.3.2, </w:t>
-      </w:r>
-      <w:r>
-        <w:rPr>
-          <w:b/>
-        </w:rPr>
-        <w:t>June</w:t>
-      </w:r>
-      <w:r>
-        <w:rPr>
-          <w:b/>
-        </w:rPr>
-        <w:t xml:space="preserve"> 2025</w:t>
+        <w:rPr>
+          <w:bCs/>
+        </w:rPr>
+      </w:pPr>
+      <w:proofErr w:type="spellStart"/>
+      <w:r>
+        <w:t>x</w:t>
+      </w:r>
+      <w:r>
+        <w:t>yz</w:t>
+      </w:r>
+      <w:proofErr w:type="spellEnd"/>
+    </w:p>
+    <w:p>
+      <w:pPr>
+        <w:ind w:left="144" w:hanging="144"/>
+        <w:rPr>
+          <w:bCs/>
+        </w:rPr>
+      </w:pPr>
+    </w:p>
+    <w:p>
+      <w:pPr>
+        <w:ind w:left="360" w:hanging="360"/>
+        <w:rPr>
+          <w:i/>
+          <w:iCs/>
+        </w:rPr>
+      </w:pPr>
+      <w:r>
+        <w:rPr>
+          <w:i/>
+          <w:iCs/>
+        </w:rPr>
+        <w:t>Minor Fixes</w:t>
+      </w:r>
+    </w:p>
+    <w:p>
+      <w:pPr>
+        <w:ind w:left="360" w:hanging="360"/>
+      </w:pPr>
+      <w:proofErr w:type="spellStart"/>
+      <w:r>
+        <w:t>xyz</w:t>
+      </w:r>
+      <w:proofErr w:type="spellEnd"/>
+      <w:r>
+        <w:t xml:space="preserve"> </w:t>
+      </w:r>
+    </w:p>
+    <w:p>
+      <w:pPr>
+        <w:ind w:left="360" w:hanging="360"/>
+      </w:pPr>
+    </w:p>
+    <w:p>
+      <w:pPr>
+        <w:ind w:left="360" w:hanging="360"/>
+        <w:rPr>
+          <w:b/>
+        </w:rPr>
+      </w:pPr>
+      <w:r>
+        <w:rPr>
+          <w:b/>
+        </w:rPr>
+        <w:t>Version 10.3.3, September 2025</w:t>
       </w:r>
     </w:p>
     <w:p>
@@ -1776,14 +1913,7 @@
         <w:ind w:left="144" w:hanging="144"/>
       </w:pPr>
       <w:r>
-        <w:lastRenderedPageBreak/>
-        <w:t xml:space="preserve">Correction </w:t>
-      </w:r>
-      <w:r>
-        <w:t>in</w:t>
-      </w:r>
-      <w:r>
-        <w:t xml:space="preserve"> purely spatial Bernoulli drilldown when using line-list data.</w:t>
+        <w:t>Correction in the batched model when using multiple data sets.</w:t>
       </w:r>
     </w:p>
     <w:p>
@@ -1791,43 +1921,47 @@
         <w:ind w:left="144" w:hanging="144"/>
       </w:pPr>
       <w:r>
-        <w:t>Correction in Google Maps with performing prospective analysis and drilldown.</w:t>
-      </w:r>
-    </w:p>
-    <w:p>
-      <w:pPr>
-        <w:ind w:left="144" w:hanging="144"/>
-      </w:pPr>
-      <w:r>
-        <w:t>Updated compression library.</w:t>
-      </w:r>
-    </w:p>
-    <w:p>
-      <w:pPr>
-        <w:ind w:left="360" w:hanging="360"/>
-        <w:rPr>
-          <w:b/>
-        </w:rPr>
-      </w:pPr>
-    </w:p>
-    <w:p>
-      <w:pPr>
-        <w:ind w:left="360" w:hanging="360"/>
-        <w:rPr>
-          <w:b/>
-        </w:rPr>
-      </w:pPr>
-      <w:r>
-        <w:rPr>
-          <w:b/>
-        </w:rPr>
-        <w:t xml:space="preserve">Version 10.3.1, </w:t>
-      </w:r>
-      <w:r>
-        <w:rPr>
-          <w:b/>
-        </w:rPr>
-        <w:t>May</w:t>
+        <w:t xml:space="preserve">Correction when using </w:t>
+      </w:r>
+      <w:r>
+        <w:t xml:space="preserve">the </w:t>
+      </w:r>
+      <w:r>
+        <w:t xml:space="preserve">network file </w:t>
+      </w:r>
+      <w:r>
+        <w:t>with</w:t>
+      </w:r>
+      <w:r>
+        <w:t xml:space="preserve"> multiple locations.</w:t>
+      </w:r>
+    </w:p>
+    <w:p>
+      <w:pPr>
+        <w:ind w:left="360" w:hanging="360"/>
+        <w:rPr>
+          <w:b/>
+        </w:rPr>
+      </w:pPr>
+    </w:p>
+    <w:p>
+      <w:pPr>
+        <w:ind w:left="360" w:hanging="360"/>
+        <w:rPr>
+          <w:b/>
+        </w:rPr>
+      </w:pPr>
+      <w:r>
+        <w:rPr>
+          <w:b/>
+        </w:rPr>
+        <w:t xml:space="preserve">Version 10.3.2, </w:t>
+      </w:r>
+      <w:r>
+        <w:rPr>
+          <w:b/>
+        </w:rPr>
+        <w:t>June</w:t>
       </w:r>
       <w:r>
         <w:rPr>
@@ -1867,7 +2001,13 @@
         <w:ind w:left="144" w:hanging="144"/>
       </w:pPr>
       <w:r>
-        <w:t>Removed mistaken hardcode in purely spatial Bernoulli drilldown.</w:t>
+        <w:t xml:space="preserve">Correction </w:t>
+      </w:r>
+      <w:r>
+        <w:t>in</w:t>
+      </w:r>
+      <w:r>
+        <w:t xml:space="preserve"> purely spatial Bernoulli drilldown when using line-list data.</w:t>
       </w:r>
     </w:p>
     <w:p>
@@ -1875,7 +2015,7 @@
         <w:ind w:left="144" w:hanging="144"/>
       </w:pPr>
       <w:r>
-        <w:t>Day of week adjustment with purely spatial Bernoulli drilldown made automatic.</w:t>
+        <w:t>Correction in Google Maps with performing prospective analysis and drilldown.</w:t>
       </w:r>
     </w:p>
     <w:p>
@@ -1883,69 +2023,35 @@
         <w:ind w:left="144" w:hanging="144"/>
       </w:pPr>
       <w:r>
-        <w:t xml:space="preserve">Corrected </w:t>
-      </w:r>
-      <w:r>
-        <w:t>location dot</w:t>
-      </w:r>
-      <w:r>
-        <w:t xml:space="preserve"> color in Google Maps output.</w:t>
-      </w:r>
-    </w:p>
-    <w:p>
-      <w:pPr>
-        <w:ind w:left="144" w:hanging="144"/>
-      </w:pPr>
-      <w:r>
-        <w:t>Update</w:t>
-      </w:r>
-      <w:r>
-        <w:t>d</w:t>
-      </w:r>
-      <w:r>
-        <w:t xml:space="preserve"> temporal graph to use user specified data set names.</w:t>
-      </w:r>
-    </w:p>
-    <w:p>
-      <w:pPr>
-        <w:ind w:left="144" w:hanging="144"/>
-      </w:pPr>
-      <w:r>
-        <w:t xml:space="preserve">Corrected disabling error in </w:t>
-      </w:r>
-      <w:r>
-        <w:t>graphical interface</w:t>
-      </w:r>
-      <w:r>
-        <w:t xml:space="preserve"> for GINI option.</w:t>
-      </w:r>
-    </w:p>
-    <w:p>
-      <w:pPr>
-        <w:ind w:left="360" w:hanging="360"/>
-        <w:rPr>
-          <w:b/>
-        </w:rPr>
-      </w:pPr>
-    </w:p>
-    <w:p>
-      <w:pPr>
-        <w:ind w:left="360" w:hanging="360"/>
-        <w:rPr>
-          <w:b/>
-        </w:rPr>
-      </w:pPr>
-      <w:r>
-        <w:rPr>
-          <w:b/>
-        </w:rPr>
-        <w:t xml:space="preserve">Version 10.3, </w:t>
-      </w:r>
-      <w:r>
-        <w:rPr>
-          <w:b/>
-        </w:rPr>
-        <w:t>March</w:t>
+        <w:t>Updated compression library.</w:t>
+      </w:r>
+    </w:p>
+    <w:p>
+      <w:pPr>
+        <w:ind w:left="360" w:hanging="360"/>
+        <w:rPr>
+          <w:b/>
+        </w:rPr>
+      </w:pPr>
+    </w:p>
+    <w:p>
+      <w:pPr>
+        <w:ind w:left="360" w:hanging="360"/>
+        <w:rPr>
+          <w:b/>
+        </w:rPr>
+      </w:pPr>
+      <w:r>
+        <w:rPr>
+          <w:b/>
+        </w:rPr>
+        <w:t xml:space="preserve">Version 10.3.1, </w:t>
+      </w:r>
+      <w:r>
+        <w:rPr>
+          <w:b/>
+        </w:rPr>
+        <w:t>May</w:t>
       </w:r>
       <w:r>
         <w:rPr>
@@ -1977,7 +2083,7 @@
           <w:i/>
           <w:iCs/>
         </w:rPr>
-        <w:t>New Analytical Features</w:t>
+        <w:t>Fixes</w:t>
       </w:r>
     </w:p>
     <w:p>
@@ -1985,90 +2091,29 @@
         <w:ind w:left="144" w:hanging="144"/>
       </w:pPr>
       <w:r>
-        <w:t>Probability model for batched data, where it is only known whether there is zero or at least one positive observation in each batch.</w:t>
-      </w:r>
-    </w:p>
-    <w:p>
-      <w:pPr>
-        <w:ind w:left="360" w:hanging="360"/>
-        <w:rPr>
-          <w:i/>
-        </w:rPr>
-      </w:pPr>
-    </w:p>
-    <w:p>
-      <w:pPr>
-        <w:ind w:left="360" w:hanging="360"/>
-        <w:rPr>
-          <w:bCs/>
-        </w:rPr>
-      </w:pPr>
-      <w:r>
-        <w:rPr>
-          <w:i/>
-        </w:rPr>
-        <w:t xml:space="preserve">Other </w:t>
-      </w:r>
-      <w:r>
-        <w:rPr>
-          <w:i/>
-        </w:rPr>
-        <w:t>Improvements</w:t>
-      </w:r>
-      <w:r>
-        <w:rPr>
-          <w:bCs/>
-        </w:rPr>
-        <w:t xml:space="preserve"> </w:t>
+        <w:t>Removed mistaken hardcode in purely spatial Bernoulli drilldown.</w:t>
       </w:r>
     </w:p>
     <w:p>
       <w:pPr>
         <w:ind w:left="144" w:hanging="144"/>
-        <w:rPr>
-          <w:bCs/>
-        </w:rPr>
-      </w:pPr>
-      <w:r>
-        <w:t>Better display of location and line-list data in Google Maps output.</w:t>
+      </w:pPr>
+      <w:r>
+        <w:t>Day of week adjustment with purely spatial Bernoulli drilldown made automatic.</w:t>
       </w:r>
     </w:p>
     <w:p>
       <w:pPr>
         <w:ind w:left="144" w:hanging="144"/>
-        <w:rPr>
-          <w:bCs/>
-        </w:rPr>
-      </w:pPr>
-      <w:r>
-        <w:rPr>
-          <w:bCs/>
-        </w:rPr>
-        <w:t>Ability to name data sets when using multiple data sets.</w:t>
-      </w:r>
-    </w:p>
-    <w:p>
-      <w:pPr>
-        <w:ind w:left="360" w:hanging="360"/>
-        <w:rPr>
-          <w:bCs/>
-        </w:rPr>
-      </w:pPr>
-    </w:p>
-    <w:p>
-      <w:pPr>
-        <w:ind w:left="360" w:hanging="360"/>
-        <w:rPr>
-          <w:i/>
-          <w:iCs/>
-        </w:rPr>
-      </w:pPr>
-      <w:r>
-        <w:rPr>
-          <w:i/>
-          <w:iCs/>
-        </w:rPr>
-        <w:t>Minor Fixes</w:t>
+      </w:pPr>
+      <w:r>
+        <w:t xml:space="preserve">Corrected </w:t>
+      </w:r>
+      <w:r>
+        <w:t>location dot</w:t>
+      </w:r>
+      <w:r>
+        <w:t xml:space="preserve"> color in Google Maps output.</w:t>
       </w:r>
     </w:p>
     <w:p>
@@ -2076,7 +2121,13 @@
         <w:ind w:left="144" w:hanging="144"/>
       </w:pPr>
       <w:r>
-        <w:t>Recurrence intervals partly reported with words when greater than one thousand years.</w:t>
+        <w:t>Update</w:t>
+      </w:r>
+      <w:r>
+        <w:t>d</w:t>
+      </w:r>
+      <w:r>
+        <w:t xml:space="preserve"> temporal graph to use user specified data set names.</w:t>
       </w:r>
     </w:p>
     <w:p>
@@ -2084,69 +2135,47 @@
         <w:ind w:left="144" w:hanging="144"/>
       </w:pPr>
       <w:r>
-        <w:t>Improved layout of the main results file regarding additional output files, iterative scan statistic, and multiple data sets,</w:t>
-      </w:r>
-    </w:p>
-    <w:p>
-      <w:pPr>
-        <w:ind w:left="360" w:hanging="360"/>
-      </w:pPr>
-      <w:r>
-        <w:t>Corrected problem when including purely spatial clusters in a time-stratified adjusted analysis.</w:t>
-      </w:r>
-    </w:p>
-    <w:p>
-      <w:pPr>
-        <w:ind w:left="360" w:hanging="360"/>
-      </w:pPr>
-      <w:r>
-        <w:t>Avoids rarely occurring program crash for continuous Poisson model analyses.</w:t>
-      </w:r>
-    </w:p>
-    <w:p>
-      <w:pPr>
-        <w:ind w:left="360" w:hanging="360"/>
-      </w:pPr>
-      <w:r>
-        <w:t>Proper handling when cancelling jobs on the multiple analyses interface.</w:t>
-      </w:r>
-    </w:p>
-    <w:p>
-      <w:pPr>
-        <w:ind w:left="360" w:hanging="360"/>
-      </w:pPr>
-      <w:r>
-        <w:t>For temporal graphs, fixed export functionality and which clusters to report.</w:t>
-      </w:r>
-    </w:p>
-    <w:p>
-      <w:pPr>
-        <w:ind w:left="360" w:hanging="360"/>
-      </w:pPr>
-      <w:r>
-        <w:t>Restored run history functionality that was mistakenly removed in version 10.0.</w:t>
-      </w:r>
-    </w:p>
-    <w:p>
-      <w:pPr>
-        <w:ind w:left="360" w:hanging="360"/>
-        <w:rPr>
-          <w:b/>
-        </w:rPr>
-      </w:pPr>
-    </w:p>
-    <w:p>
-      <w:pPr>
-        <w:ind w:left="360" w:hanging="360"/>
-        <w:rPr>
-          <w:b/>
-        </w:rPr>
-      </w:pPr>
-      <w:r>
-        <w:rPr>
-          <w:b/>
-        </w:rPr>
-        <w:t>Version 10.2.5, September 2024</w:t>
+        <w:t xml:space="preserve">Corrected disabling error in </w:t>
+      </w:r>
+      <w:r>
+        <w:t>graphical interface</w:t>
+      </w:r>
+      <w:r>
+        <w:t xml:space="preserve"> for GINI option.</w:t>
+      </w:r>
+    </w:p>
+    <w:p>
+      <w:pPr>
+        <w:ind w:left="360" w:hanging="360"/>
+        <w:rPr>
+          <w:b/>
+        </w:rPr>
+      </w:pPr>
+    </w:p>
+    <w:p>
+      <w:pPr>
+        <w:ind w:left="360" w:hanging="360"/>
+        <w:rPr>
+          <w:b/>
+        </w:rPr>
+      </w:pPr>
+      <w:r>
+        <w:rPr>
+          <w:b/>
+        </w:rPr>
+        <w:t xml:space="preserve">Version 10.3, </w:t>
+      </w:r>
+      <w:r>
+        <w:rPr>
+          <w:b/>
+        </w:rPr>
+        <w:t>March</w:t>
+      </w:r>
+      <w:r>
+        <w:rPr>
+          <w:b/>
+        </w:rPr>
+        <w:t xml:space="preserve"> 2025</w:t>
       </w:r>
     </w:p>
     <w:p>
@@ -2172,7 +2201,7 @@
           <w:i/>
           <w:iCs/>
         </w:rPr>
-        <w:t>Fixes</w:t>
+        <w:t>New Analytical Features</w:t>
       </w:r>
     </w:p>
     <w:p>
@@ -2180,29 +2209,168 @@
         <w:ind w:left="144" w:hanging="144"/>
       </w:pPr>
       <w:r>
-        <w:t>Disable the Gumbel approximation when scanning for low rates or for high or low rates. When using the Default P-value option, while scanning for low rates or for high or low rates, the Gumbel approximation is no longer used to calculate cluster p-values.</w:t>
-      </w:r>
-    </w:p>
-    <w:p>
-      <w:pPr>
-        <w:ind w:left="360" w:hanging="360"/>
-        <w:rPr>
-          <w:b/>
-        </w:rPr>
-      </w:pPr>
-    </w:p>
-    <w:p>
-      <w:pPr>
-        <w:ind w:left="360" w:hanging="360"/>
-        <w:rPr>
-          <w:b/>
-        </w:rPr>
-      </w:pPr>
-      <w:r>
-        <w:rPr>
-          <w:b/>
-        </w:rPr>
-        <w:t>Version 10.2.4, August 2024</w:t>
+        <w:t>Probability model for batched data, where it is only known whether there is zero or at least one positive observation in each batch.</w:t>
+      </w:r>
+    </w:p>
+    <w:p>
+      <w:pPr>
+        <w:ind w:left="360" w:hanging="360"/>
+        <w:rPr>
+          <w:i/>
+        </w:rPr>
+      </w:pPr>
+    </w:p>
+    <w:p>
+      <w:pPr>
+        <w:ind w:left="360" w:hanging="360"/>
+        <w:rPr>
+          <w:bCs/>
+        </w:rPr>
+      </w:pPr>
+      <w:r>
+        <w:rPr>
+          <w:i/>
+        </w:rPr>
+        <w:t xml:space="preserve">Other </w:t>
+      </w:r>
+      <w:r>
+        <w:rPr>
+          <w:i/>
+        </w:rPr>
+        <w:t>Improvements</w:t>
+      </w:r>
+      <w:r>
+        <w:rPr>
+          <w:bCs/>
+        </w:rPr>
+        <w:t xml:space="preserve"> </w:t>
+      </w:r>
+    </w:p>
+    <w:p>
+      <w:pPr>
+        <w:ind w:left="144" w:hanging="144"/>
+        <w:rPr>
+          <w:bCs/>
+        </w:rPr>
+      </w:pPr>
+      <w:r>
+        <w:t>Better display of location and line-list data in Google Maps output.</w:t>
+      </w:r>
+    </w:p>
+    <w:p>
+      <w:pPr>
+        <w:ind w:left="144" w:hanging="144"/>
+        <w:rPr>
+          <w:bCs/>
+        </w:rPr>
+      </w:pPr>
+      <w:r>
+        <w:rPr>
+          <w:bCs/>
+        </w:rPr>
+        <w:t>Ability to name data sets when using multiple data sets.</w:t>
+      </w:r>
+    </w:p>
+    <w:p>
+      <w:pPr>
+        <w:ind w:left="360" w:hanging="360"/>
+        <w:rPr>
+          <w:bCs/>
+        </w:rPr>
+      </w:pPr>
+    </w:p>
+    <w:p>
+      <w:pPr>
+        <w:ind w:left="360" w:hanging="360"/>
+        <w:rPr>
+          <w:i/>
+          <w:iCs/>
+        </w:rPr>
+      </w:pPr>
+      <w:r>
+        <w:rPr>
+          <w:i/>
+          <w:iCs/>
+        </w:rPr>
+        <w:t>Minor Fixes</w:t>
+      </w:r>
+    </w:p>
+    <w:p>
+      <w:pPr>
+        <w:ind w:left="144" w:hanging="144"/>
+      </w:pPr>
+      <w:r>
+        <w:t>Recurrence intervals partly reported with words when greater than one thousand years.</w:t>
+      </w:r>
+    </w:p>
+    <w:p>
+      <w:pPr>
+        <w:ind w:left="144" w:hanging="144"/>
+      </w:pPr>
+      <w:r>
+        <w:t>Improved layout of the main results file regarding additional output files, iterative scan statistic, and multiple data sets,</w:t>
+      </w:r>
+    </w:p>
+    <w:p>
+      <w:pPr>
+        <w:ind w:left="360" w:hanging="360"/>
+      </w:pPr>
+      <w:r>
+        <w:t>Corrected problem when including purely spatial clusters in a time-stratified adjusted analysis.</w:t>
+      </w:r>
+    </w:p>
+    <w:p>
+      <w:pPr>
+        <w:ind w:left="360" w:hanging="360"/>
+      </w:pPr>
+      <w:r>
+        <w:t>Avoids rarely occurring program crash for continuous Poisson model analyses.</w:t>
+      </w:r>
+    </w:p>
+    <w:p>
+      <w:pPr>
+        <w:ind w:left="360" w:hanging="360"/>
+      </w:pPr>
+      <w:r>
+        <w:t>Proper handling when cancelling jobs on the multiple analyses interface.</w:t>
+      </w:r>
+    </w:p>
+    <w:p>
+      <w:pPr>
+        <w:ind w:left="360" w:hanging="360"/>
+      </w:pPr>
+      <w:r>
+        <w:t>For temporal graphs, fixed export functionality and which clusters to report.</w:t>
+      </w:r>
+    </w:p>
+    <w:p>
+      <w:pPr>
+        <w:ind w:left="360" w:hanging="360"/>
+      </w:pPr>
+      <w:r>
+        <w:t>Restored run history functionality that was mistakenly removed in version 10.0.</w:t>
+      </w:r>
+    </w:p>
+    <w:p>
+      <w:pPr>
+        <w:ind w:left="360" w:hanging="360"/>
+        <w:rPr>
+          <w:b/>
+        </w:rPr>
+      </w:pPr>
+    </w:p>
+    <w:p>
+      <w:pPr>
+        <w:ind w:left="360" w:hanging="360"/>
+        <w:rPr>
+          <w:b/>
+        </w:rPr>
+      </w:pPr>
+      <w:r>
+        <w:rPr>
+          <w:b/>
+        </w:rPr>
+        <w:t>Version 10.2.5, September 2024</w:t>
       </w:r>
     </w:p>
     <w:p>
@@ -2228,6 +2396,7 @@
           <w:i/>
           <w:iCs/>
         </w:rPr>
+        <w:lastRenderedPageBreak/>
         <w:t>Fixes</w:t>
       </w:r>
     </w:p>
@@ -2236,35 +2405,29 @@
         <w:ind w:left="144" w:hanging="144"/>
       </w:pPr>
       <w:r>
-        <w:t>Correction to the Location Information file when using the Multiple Locations Per Observation File</w:t>
-      </w:r>
-      <w:r>
-        <w:t xml:space="preserve"> (correction related to 10.2.2 update)</w:t>
-      </w:r>
-      <w:r>
-        <w:t>.</w:t>
-      </w:r>
-    </w:p>
-    <w:p>
-      <w:pPr>
-        <w:ind w:left="360" w:hanging="360"/>
-        <w:rPr>
-          <w:b/>
-        </w:rPr>
-      </w:pPr>
-    </w:p>
-    <w:p>
-      <w:pPr>
-        <w:ind w:left="360" w:hanging="360"/>
-        <w:rPr>
-          <w:b/>
-        </w:rPr>
-      </w:pPr>
-      <w:r>
-        <w:rPr>
-          <w:b/>
-        </w:rPr>
-        <w:t>Version 10.2.3, August 2024</w:t>
+        <w:t>Disable the Gumbel approximation when scanning for low rates or for high or low rates. When using the Default P-value option, while scanning for low rates or for high or low rates, the Gumbel approximation is no longer used to calculate cluster p-values.</w:t>
+      </w:r>
+    </w:p>
+    <w:p>
+      <w:pPr>
+        <w:ind w:left="360" w:hanging="360"/>
+        <w:rPr>
+          <w:b/>
+        </w:rPr>
+      </w:pPr>
+    </w:p>
+    <w:p>
+      <w:pPr>
+        <w:ind w:left="360" w:hanging="360"/>
+        <w:rPr>
+          <w:b/>
+        </w:rPr>
+      </w:pPr>
+      <w:r>
+        <w:rPr>
+          <w:b/>
+        </w:rPr>
+        <w:t>Version 10.2.4, August 2024</w:t>
       </w:r>
     </w:p>
     <w:p>
@@ -2290,7 +2453,6 @@
           <w:i/>
           <w:iCs/>
         </w:rPr>
-        <w:lastRenderedPageBreak/>
         <w:t>Fixes</w:t>
       </w:r>
     </w:p>
@@ -2299,29 +2461,35 @@
         <w:ind w:left="144" w:hanging="144"/>
       </w:pPr>
       <w:r>
-        <w:t>Updated graphical user interface to address 508 compliance issues.</w:t>
-      </w:r>
-    </w:p>
-    <w:p>
-      <w:pPr>
-        <w:ind w:left="360" w:hanging="360"/>
-        <w:rPr>
-          <w:b/>
-        </w:rPr>
-      </w:pPr>
-    </w:p>
-    <w:p>
-      <w:pPr>
-        <w:ind w:left="360" w:hanging="360"/>
-        <w:rPr>
-          <w:b/>
-        </w:rPr>
-      </w:pPr>
-      <w:r>
-        <w:rPr>
-          <w:b/>
-        </w:rPr>
-        <w:t>Version 10.2.2, July 2024</w:t>
+        <w:t>Correction to the Location Information file when using the Multiple Locations Per Observation File</w:t>
+      </w:r>
+      <w:r>
+        <w:t xml:space="preserve"> (correction related to 10.2.2 update)</w:t>
+      </w:r>
+      <w:r>
+        <w:t>.</w:t>
+      </w:r>
+    </w:p>
+    <w:p>
+      <w:pPr>
+        <w:ind w:left="360" w:hanging="360"/>
+        <w:rPr>
+          <w:b/>
+        </w:rPr>
+      </w:pPr>
+    </w:p>
+    <w:p>
+      <w:pPr>
+        <w:ind w:left="360" w:hanging="360"/>
+        <w:rPr>
+          <w:b/>
+        </w:rPr>
+      </w:pPr>
+      <w:r>
+        <w:rPr>
+          <w:b/>
+        </w:rPr>
+        <w:t>Version 10.2.3, August 2024</w:t>
       </w:r>
     </w:p>
     <w:p>
@@ -2355,46 +2523,29 @@
         <w:ind w:left="144" w:hanging="144"/>
       </w:pPr>
       <w:r>
-        <w:t xml:space="preserve">Correction to </w:t>
-      </w:r>
-      <w:r>
-        <w:t xml:space="preserve">the </w:t>
-      </w:r>
-      <w:r>
-        <w:t>Location Information file when using the Multiple Locations Per Observation File.</w:t>
-      </w:r>
-    </w:p>
-    <w:p>
-      <w:pPr>
-        <w:ind w:left="144" w:hanging="144"/>
-      </w:pPr>
-      <w:r>
-        <w:t>Correction to Google Earth/Maps to escape reserved characters</w:t>
-      </w:r>
-      <w:r>
-        <w:t>.</w:t>
-      </w:r>
-    </w:p>
-    <w:p>
-      <w:pPr>
-        <w:ind w:left="360" w:hanging="360"/>
-        <w:rPr>
-          <w:b/>
-        </w:rPr>
-      </w:pPr>
-    </w:p>
-    <w:p>
-      <w:pPr>
-        <w:ind w:left="360" w:hanging="360"/>
-        <w:rPr>
-          <w:b/>
-        </w:rPr>
-      </w:pPr>
-      <w:r>
-        <w:rPr>
-          <w:b/>
-        </w:rPr>
-        <w:t>Version 10.2.1, July 2024</w:t>
+        <w:t>Updated graphical user interface to address 508 compliance issues.</w:t>
+      </w:r>
+    </w:p>
+    <w:p>
+      <w:pPr>
+        <w:ind w:left="360" w:hanging="360"/>
+        <w:rPr>
+          <w:b/>
+        </w:rPr>
+      </w:pPr>
+    </w:p>
+    <w:p>
+      <w:pPr>
+        <w:ind w:left="360" w:hanging="360"/>
+        <w:rPr>
+          <w:b/>
+        </w:rPr>
+      </w:pPr>
+      <w:r>
+        <w:rPr>
+          <w:b/>
+        </w:rPr>
+        <w:t>Version 10.2.2, July 2024</w:t>
       </w:r>
     </w:p>
     <w:p>
@@ -2425,7 +2576,7 @@
     </w:p>
     <w:p>
       <w:pPr>
-        <w:ind w:left="360" w:hanging="360"/>
+        <w:ind w:left="144" w:hanging="144"/>
       </w:pPr>
       <w:r>
         <w:t xml:space="preserve">Correction to </w:t>
@@ -2434,22 +2585,15 @@
         <w:t xml:space="preserve">the </w:t>
       </w:r>
       <w:r>
-        <w:t xml:space="preserve">percentage of the cases </w:t>
-      </w:r>
-      <w:r>
-        <w:t xml:space="preserve">reported </w:t>
-      </w:r>
-      <w:r>
-        <w:t xml:space="preserve">in </w:t>
-      </w:r>
-      <w:r>
-        <w:t xml:space="preserve">the </w:t>
-      </w:r>
-      <w:r>
-        <w:t>temporal graphs</w:t>
-      </w:r>
-      <w:r>
-        <w:t xml:space="preserve"> output</w:t>
+        <w:t>Location Information file when using the Multiple Locations Per Observation File.</w:t>
+      </w:r>
+    </w:p>
+    <w:p>
+      <w:pPr>
+        <w:ind w:left="144" w:hanging="144"/>
+      </w:pPr>
+      <w:r>
+        <w:t>Correction to Google Earth/Maps to escape reserved characters</w:t>
       </w:r>
       <w:r>
         <w:t>.</w:t>
@@ -2457,47 +2601,24 @@
     </w:p>
     <w:p>
       <w:pPr>
-        <w:ind w:left="144" w:hanging="144"/>
-      </w:pPr>
-      <w:r>
-        <w:t xml:space="preserve">Correction to </w:t>
-      </w:r>
-      <w:r>
-        <w:t xml:space="preserve">Google Maps </w:t>
-      </w:r>
-      <w:r>
-        <w:t xml:space="preserve">HTML and </w:t>
-      </w:r>
-      <w:r>
-        <w:t>JavaScript</w:t>
-      </w:r>
-      <w:r>
-        <w:t xml:space="preserve"> to escape reserved characters</w:t>
-      </w:r>
-      <w:r>
-        <w:t>.</w:t>
-      </w:r>
-    </w:p>
-    <w:p>
-      <w:pPr>
-        <w:ind w:left="360" w:hanging="360"/>
-        <w:rPr>
-          <w:b/>
-        </w:rPr>
-      </w:pPr>
-    </w:p>
-    <w:p>
-      <w:pPr>
-        <w:ind w:left="360" w:hanging="360"/>
-        <w:rPr>
-          <w:b/>
-        </w:rPr>
-      </w:pPr>
-      <w:r>
-        <w:rPr>
-          <w:b/>
-        </w:rPr>
-        <w:t>Version 10.2, June 2024</w:t>
+        <w:ind w:left="360" w:hanging="360"/>
+        <w:rPr>
+          <w:b/>
+        </w:rPr>
+      </w:pPr>
+    </w:p>
+    <w:p>
+      <w:pPr>
+        <w:ind w:left="360" w:hanging="360"/>
+        <w:rPr>
+          <w:b/>
+        </w:rPr>
+      </w:pPr>
+      <w:r>
+        <w:rPr>
+          <w:b/>
+        </w:rPr>
+        <w:t>Version 10.2.1, July 2024</w:t>
       </w:r>
     </w:p>
     <w:p>
@@ -2523,26 +2644,39 @@
           <w:i/>
           <w:iCs/>
         </w:rPr>
-        <w:t>Improvements</w:t>
-      </w:r>
-    </w:p>
-    <w:p>
-      <w:pPr>
-        <w:ind w:left="360" w:hanging="360"/>
-      </w:pPr>
-      <w:r>
-        <w:t xml:space="preserve">Ability to use </w:t>
-      </w:r>
-      <w:r>
-        <w:t>multiple coordinates per location when scanning on a network.</w:t>
-      </w:r>
-    </w:p>
-    <w:p>
-      <w:pPr>
-        <w:ind w:left="360" w:hanging="360"/>
-      </w:pPr>
-      <w:r>
-        <w:t xml:space="preserve">Improved wizard for importing case files with descriptive line list data about individuals. </w:t>
+        <w:t>Fixes</w:t>
+      </w:r>
+    </w:p>
+    <w:p>
+      <w:pPr>
+        <w:ind w:left="360" w:hanging="360"/>
+      </w:pPr>
+      <w:r>
+        <w:t xml:space="preserve">Correction to </w:t>
+      </w:r>
+      <w:r>
+        <w:t xml:space="preserve">the </w:t>
+      </w:r>
+      <w:r>
+        <w:t xml:space="preserve">percentage of the cases </w:t>
+      </w:r>
+      <w:r>
+        <w:t xml:space="preserve">reported </w:t>
+      </w:r>
+      <w:r>
+        <w:t xml:space="preserve">in </w:t>
+      </w:r>
+      <w:r>
+        <w:t xml:space="preserve">the </w:t>
+      </w:r>
+      <w:r>
+        <w:t>temporal graphs</w:t>
+      </w:r>
+      <w:r>
+        <w:t xml:space="preserve"> output</w:t>
+      </w:r>
+      <w:r>
+        <w:t>.</w:t>
       </w:r>
     </w:p>
     <w:p>
@@ -2550,137 +2684,19 @@
         <w:ind w:left="144" w:hanging="144"/>
       </w:pPr>
       <w:r>
-        <w:t xml:space="preserve">Results file report the cluster </w:t>
-      </w:r>
-      <w:r>
-        <w:rPr>
-          <w:i/>
-          <w:iCs/>
-        </w:rPr>
-        <w:t>‘span’</w:t>
-      </w:r>
-      <w:r>
-        <w:t xml:space="preserve">, defined as the distance between the two cluster locations furthest away. Especially useful when scanning on a network. </w:t>
-      </w:r>
-    </w:p>
-    <w:p>
-      <w:pPr>
-        <w:ind w:left="144" w:hanging="144"/>
-      </w:pPr>
-      <w:r>
-        <w:t>For prospective analyses, user specified cut-offs for performing or reporting analyses are defined in terms of recurrence intervals instead of p-values.</w:t>
-      </w:r>
-    </w:p>
-    <w:p>
-      <w:pPr>
-        <w:ind w:left="144" w:hanging="144"/>
-      </w:pPr>
-      <w:r>
-        <w:t>For the Poisson probability model, time stratified adjustments are implemented in the same manner as for the Bernoulli model.</w:t>
-      </w:r>
-    </w:p>
-    <w:p>
-      <w:pPr>
-        <w:ind w:left="360" w:hanging="360"/>
-      </w:pPr>
-      <w:r>
-        <w:t xml:space="preserve">For space-time analyses, the </w:t>
-      </w:r>
-      <w:r>
-        <w:t xml:space="preserve">Bernoulli drilldown </w:t>
-      </w:r>
-      <w:r>
-        <w:t xml:space="preserve">uses </w:t>
-      </w:r>
-      <w:r>
-        <w:t>the iterative scan.</w:t>
-      </w:r>
-    </w:p>
-    <w:p>
-      <w:pPr>
-        <w:ind w:left="144" w:hanging="144"/>
-      </w:pPr>
-      <w:r>
-        <w:t>When reporting clusters for space-time analyses, cluster overlap in not only defined geographically but also temporally, so that two non-overlapping clusters may both be reported when they are in the same place but at different times.</w:t>
-      </w:r>
-    </w:p>
-    <w:p>
-      <w:pPr>
-        <w:ind w:left="144" w:hanging="144"/>
-      </w:pPr>
-      <w:r>
-        <w:t>Google Maps and Google Earth output can display line-list information for individuals in detected clusters, to be used in cluster investigations.</w:t>
-      </w:r>
-    </w:p>
-    <w:p>
-      <w:pPr>
-        <w:ind w:left="144" w:hanging="144"/>
-      </w:pPr>
-      <w:r>
-        <w:t>For network analyses, ability to visualize the entire network in in Google Maps, Google Earth, or for Cartesian graphs.</w:t>
-      </w:r>
-    </w:p>
-    <w:p>
-      <w:pPr>
-        <w:ind w:left="144" w:hanging="144"/>
-      </w:pPr>
-      <w:r>
-        <w:t xml:space="preserve">For temporal graphs depicting detected clusters, it now reports the percentage of the cases in the geographical cluster area that are also in the temporal cluster window, while comparing that percentage to outside the cluster. </w:t>
-      </w:r>
-    </w:p>
-    <w:p>
-      <w:pPr>
-        <w:ind w:left="360" w:hanging="360"/>
-      </w:pPr>
-      <w:r>
-        <w:t>For the space-time permutation model, temporal graphs report observed/expected.</w:t>
-      </w:r>
-    </w:p>
-    <w:p>
-      <w:pPr>
-        <w:ind w:left="144" w:hanging="144"/>
-      </w:pPr>
-      <w:r>
-        <w:t>Option to send email notifications with summary information when using the multiple analysis feature.</w:t>
-      </w:r>
-    </w:p>
-    <w:p>
-      <w:pPr>
-        <w:ind w:left="360" w:hanging="360"/>
-        <w:rPr>
-          <w:bCs/>
-        </w:rPr>
-      </w:pPr>
-    </w:p>
-    <w:p>
-      <w:pPr>
-        <w:ind w:left="360" w:hanging="360"/>
-        <w:rPr>
-          <w:i/>
-          <w:iCs/>
-        </w:rPr>
-      </w:pPr>
-      <w:r>
-        <w:rPr>
-          <w:i/>
-          <w:iCs/>
-        </w:rPr>
-        <w:t>Minor Fixes</w:t>
-      </w:r>
-    </w:p>
-    <w:p>
-      <w:pPr>
-        <w:ind w:left="360" w:hanging="360"/>
-        <w:rPr>
-          <w:i/>
-          <w:iCs/>
-        </w:rPr>
-      </w:pPr>
-      <w:r>
-        <w:t>Faster file browsing</w:t>
-      </w:r>
-      <w:r>
-        <w:t xml:space="preserve"> for certain complex situations</w:t>
+        <w:t xml:space="preserve">Correction to </w:t>
+      </w:r>
+      <w:r>
+        <w:t xml:space="preserve">Google Maps </w:t>
+      </w:r>
+      <w:r>
+        <w:t xml:space="preserve">HTML and </w:t>
+      </w:r>
+      <w:r>
+        <w:t>JavaScript</w:t>
+      </w:r>
+      <w:r>
+        <w:t xml:space="preserve"> to escape reserved characters</w:t>
       </w:r>
       <w:r>
         <w:t>.</w:t>
@@ -2689,140 +2705,23 @@
     <w:p>
       <w:pPr>
         <w:ind w:left="360" w:hanging="360"/>
-      </w:pPr>
-      <w:r>
-        <w:t xml:space="preserve">Import file wizard estimates the number of columns by sampling up to </w:t>
-      </w:r>
-      <w:r>
-        <w:t>200</w:t>
-      </w:r>
-      <w:r>
-        <w:t xml:space="preserve"> records.</w:t>
-      </w:r>
-    </w:p>
-    <w:p>
-      <w:pPr>
-        <w:ind w:left="144" w:hanging="144"/>
-      </w:pPr>
-      <w:r>
-        <w:t>M</w:t>
-      </w:r>
-      <w:r>
-        <w:t>ultiple analyses window is refreshed when the user leave</w:t>
-      </w:r>
-      <w:r>
-        <w:t>s</w:t>
-      </w:r>
-      <w:r>
-        <w:t xml:space="preserve"> it open while a background process runs the multiple analyses (crontab, scheduler, etc.).</w:t>
-      </w:r>
-    </w:p>
-    <w:p>
-      <w:pPr>
-        <w:ind w:left="360" w:hanging="360"/>
-      </w:pPr>
-      <w:r>
-        <w:t>Fixed program crash when weighted normal model was used with covariates.</w:t>
-      </w:r>
-    </w:p>
-    <w:p>
-      <w:pPr>
-        <w:ind w:left="144" w:hanging="144"/>
-      </w:pPr>
-      <w:r>
-        <w:lastRenderedPageBreak/>
-        <w:t xml:space="preserve">Updated </w:t>
-      </w:r>
-      <w:r>
-        <w:t>results</w:t>
-      </w:r>
-      <w:r>
-        <w:t xml:space="preserve"> file to report cluster population </w:t>
-      </w:r>
-      <w:r>
-        <w:t>with</w:t>
-      </w:r>
-      <w:r>
-        <w:t xml:space="preserve">in </w:t>
-      </w:r>
-      <w:r>
-        <w:t xml:space="preserve">each </w:t>
-      </w:r>
-      <w:r>
-        <w:t xml:space="preserve">data set section when using multiple data </w:t>
-      </w:r>
-      <w:r>
-        <w:t>sets.</w:t>
-      </w:r>
-    </w:p>
-    <w:p>
-      <w:pPr>
-        <w:ind w:left="144" w:hanging="144"/>
-      </w:pPr>
-      <w:r>
-        <w:t>Updated the Cartesian graph to correctly display clusters when there are multiple data sets.</w:t>
-      </w:r>
-    </w:p>
-    <w:p>
-      <w:pPr>
-        <w:ind w:left="144" w:hanging="144"/>
-      </w:pPr>
-      <w:r>
-        <w:t xml:space="preserve">Reworded </w:t>
-      </w:r>
-      <w:r>
-        <w:t>warning</w:t>
-      </w:r>
-      <w:r>
-        <w:t>s</w:t>
-      </w:r>
-      <w:r>
-        <w:t xml:space="preserve"> printed to </w:t>
-      </w:r>
-      <w:r>
-        <w:t xml:space="preserve">the </w:t>
-      </w:r>
-      <w:r>
-        <w:t>results</w:t>
-      </w:r>
-      <w:r>
-        <w:t xml:space="preserve"> file when a data set has been excluded</w:t>
-      </w:r>
-      <w:r>
-        <w:t xml:space="preserve"> from the analysis</w:t>
-      </w:r>
-      <w:r>
-        <w:t>.</w:t>
-      </w:r>
-    </w:p>
-    <w:p>
-      <w:pPr>
-        <w:ind w:left="360" w:hanging="360"/>
-      </w:pPr>
-      <w:r>
-        <w:t>Temporal graphs load quicker.</w:t>
-      </w:r>
-    </w:p>
-    <w:p>
-      <w:pPr>
-        <w:ind w:left="360" w:hanging="360"/>
-        <w:rPr>
-          <w:b/>
-        </w:rPr>
-      </w:pPr>
-    </w:p>
-    <w:p>
-      <w:pPr>
-        <w:ind w:left="360" w:hanging="360"/>
-        <w:rPr>
-          <w:b/>
-        </w:rPr>
-      </w:pPr>
-      <w:r>
-        <w:rPr>
-          <w:b/>
-        </w:rPr>
-        <w:t>Version 10.1.3, February 2024</w:t>
+        <w:rPr>
+          <w:b/>
+        </w:rPr>
+      </w:pPr>
+    </w:p>
+    <w:p>
+      <w:pPr>
+        <w:ind w:left="360" w:hanging="360"/>
+        <w:rPr>
+          <w:b/>
+        </w:rPr>
+      </w:pPr>
+      <w:r>
+        <w:rPr>
+          <w:b/>
+        </w:rPr>
+        <w:t>Version 10.2, June 2024</w:t>
       </w:r>
     </w:p>
     <w:p>
@@ -2837,6 +2736,331 @@
     </w:p>
     <w:p>
       <w:pPr>
+        <w:ind w:left="360" w:hanging="360"/>
+        <w:rPr>
+          <w:i/>
+          <w:iCs/>
+        </w:rPr>
+      </w:pPr>
+      <w:r>
+        <w:rPr>
+          <w:i/>
+          <w:iCs/>
+        </w:rPr>
+        <w:t>Improvements</w:t>
+      </w:r>
+    </w:p>
+    <w:p>
+      <w:pPr>
+        <w:ind w:left="360" w:hanging="360"/>
+      </w:pPr>
+      <w:r>
+        <w:t xml:space="preserve">Ability to use </w:t>
+      </w:r>
+      <w:r>
+        <w:t>multiple coordinates per location when scanning on a network.</w:t>
+      </w:r>
+    </w:p>
+    <w:p>
+      <w:pPr>
+        <w:ind w:left="360" w:hanging="360"/>
+      </w:pPr>
+      <w:r>
+        <w:t xml:space="preserve">Improved wizard for importing case files with descriptive line list data about individuals. </w:t>
+      </w:r>
+    </w:p>
+    <w:p>
+      <w:pPr>
+        <w:ind w:left="144" w:hanging="144"/>
+      </w:pPr>
+      <w:r>
+        <w:t xml:space="preserve">Results file report the cluster </w:t>
+      </w:r>
+      <w:r>
+        <w:rPr>
+          <w:i/>
+          <w:iCs/>
+        </w:rPr>
+        <w:t>‘span’</w:t>
+      </w:r>
+      <w:r>
+        <w:t xml:space="preserve">, defined as the distance between the two cluster locations furthest away. Especially useful when scanning on a network. </w:t>
+      </w:r>
+    </w:p>
+    <w:p>
+      <w:pPr>
+        <w:ind w:left="144" w:hanging="144"/>
+      </w:pPr>
+      <w:r>
+        <w:t>For prospective analyses, user specified cut-offs for performing or reporting analyses are defined in terms of recurrence intervals instead of p-values.</w:t>
+      </w:r>
+    </w:p>
+    <w:p>
+      <w:pPr>
+        <w:ind w:left="144" w:hanging="144"/>
+      </w:pPr>
+      <w:r>
+        <w:t>For the Poisson probability model, time stratified adjustments are implemented in the same manner as for the Bernoulli model.</w:t>
+      </w:r>
+    </w:p>
+    <w:p>
+      <w:pPr>
+        <w:ind w:left="360" w:hanging="360"/>
+      </w:pPr>
+      <w:r>
+        <w:t xml:space="preserve">For space-time analyses, the </w:t>
+      </w:r>
+      <w:r>
+        <w:t xml:space="preserve">Bernoulli drilldown </w:t>
+      </w:r>
+      <w:r>
+        <w:t xml:space="preserve">uses </w:t>
+      </w:r>
+      <w:r>
+        <w:t>the iterative scan.</w:t>
+      </w:r>
+    </w:p>
+    <w:p>
+      <w:pPr>
+        <w:ind w:left="144" w:hanging="144"/>
+      </w:pPr>
+      <w:r>
+        <w:t>When reporting clusters for space-time analyses, cluster overlap in not only defined geographically but also temporally, so that two non-overlapping clusters may both be reported when they are in the same place but at different times.</w:t>
+      </w:r>
+    </w:p>
+    <w:p>
+      <w:pPr>
+        <w:ind w:left="144" w:hanging="144"/>
+      </w:pPr>
+      <w:r>
+        <w:t>Google Maps and Google Earth output can display line-list information for individuals in detected clusters, to be used in cluster investigations.</w:t>
+      </w:r>
+    </w:p>
+    <w:p>
+      <w:pPr>
+        <w:ind w:left="144" w:hanging="144"/>
+      </w:pPr>
+      <w:r>
+        <w:t>For network analyses, ability to visualize the entire network in in Google Maps, Google Earth, or for Cartesian graphs.</w:t>
+      </w:r>
+    </w:p>
+    <w:p>
+      <w:pPr>
+        <w:ind w:left="144" w:hanging="144"/>
+      </w:pPr>
+      <w:r>
+        <w:lastRenderedPageBreak/>
+        <w:t xml:space="preserve">For temporal graphs depicting detected clusters, it now reports the percentage of the cases in the geographical cluster area that are also in the temporal cluster window, while comparing that percentage to outside the cluster. </w:t>
+      </w:r>
+    </w:p>
+    <w:p>
+      <w:pPr>
+        <w:ind w:left="360" w:hanging="360"/>
+      </w:pPr>
+      <w:r>
+        <w:t>For the space-time permutation model, temporal graphs report observed/expected.</w:t>
+      </w:r>
+    </w:p>
+    <w:p>
+      <w:pPr>
+        <w:ind w:left="144" w:hanging="144"/>
+      </w:pPr>
+      <w:r>
+        <w:t>Option to send email notifications with summary information when using the multiple analysis feature.</w:t>
+      </w:r>
+    </w:p>
+    <w:p>
+      <w:pPr>
+        <w:ind w:left="360" w:hanging="360"/>
+        <w:rPr>
+          <w:bCs/>
+        </w:rPr>
+      </w:pPr>
+    </w:p>
+    <w:p>
+      <w:pPr>
+        <w:ind w:left="360" w:hanging="360"/>
+        <w:rPr>
+          <w:i/>
+          <w:iCs/>
+        </w:rPr>
+      </w:pPr>
+      <w:r>
+        <w:rPr>
+          <w:i/>
+          <w:iCs/>
+        </w:rPr>
+        <w:t>Minor Fixes</w:t>
+      </w:r>
+    </w:p>
+    <w:p>
+      <w:pPr>
+        <w:ind w:left="360" w:hanging="360"/>
+        <w:rPr>
+          <w:i/>
+          <w:iCs/>
+        </w:rPr>
+      </w:pPr>
+      <w:r>
+        <w:t>Faster file browsing</w:t>
+      </w:r>
+      <w:r>
+        <w:t xml:space="preserve"> for certain complex situations</w:t>
+      </w:r>
+      <w:r>
+        <w:t>.</w:t>
+      </w:r>
+    </w:p>
+    <w:p>
+      <w:pPr>
+        <w:ind w:left="360" w:hanging="360"/>
+      </w:pPr>
+      <w:r>
+        <w:t xml:space="preserve">Import file wizard estimates the number of columns by sampling up to </w:t>
+      </w:r>
+      <w:r>
+        <w:t>200</w:t>
+      </w:r>
+      <w:r>
+        <w:t xml:space="preserve"> records.</w:t>
+      </w:r>
+    </w:p>
+    <w:p>
+      <w:pPr>
+        <w:ind w:left="144" w:hanging="144"/>
+      </w:pPr>
+      <w:r>
+        <w:t>M</w:t>
+      </w:r>
+      <w:r>
+        <w:t>ultiple analyses window is refreshed when the user leave</w:t>
+      </w:r>
+      <w:r>
+        <w:t>s</w:t>
+      </w:r>
+      <w:r>
+        <w:t xml:space="preserve"> it open while a background process runs the multiple analyses (crontab, scheduler, etc.).</w:t>
+      </w:r>
+    </w:p>
+    <w:p>
+      <w:pPr>
+        <w:ind w:left="360" w:hanging="360"/>
+      </w:pPr>
+      <w:r>
+        <w:t>Fixed program crash when weighted normal model was used with covariates.</w:t>
+      </w:r>
+    </w:p>
+    <w:p>
+      <w:pPr>
+        <w:ind w:left="144" w:hanging="144"/>
+      </w:pPr>
+      <w:r>
+        <w:t xml:space="preserve">Updated </w:t>
+      </w:r>
+      <w:r>
+        <w:t>results</w:t>
+      </w:r>
+      <w:r>
+        <w:t xml:space="preserve"> file to report cluster population </w:t>
+      </w:r>
+      <w:r>
+        <w:t>with</w:t>
+      </w:r>
+      <w:r>
+        <w:t xml:space="preserve">in </w:t>
+      </w:r>
+      <w:r>
+        <w:t xml:space="preserve">each </w:t>
+      </w:r>
+      <w:r>
+        <w:t xml:space="preserve">data set section when using multiple data </w:t>
+      </w:r>
+      <w:r>
+        <w:t>sets.</w:t>
+      </w:r>
+    </w:p>
+    <w:p>
+      <w:pPr>
+        <w:ind w:left="144" w:hanging="144"/>
+      </w:pPr>
+      <w:r>
+        <w:t>Updated the Cartesian graph to correctly display clusters when there are multiple data sets.</w:t>
+      </w:r>
+    </w:p>
+    <w:p>
+      <w:pPr>
+        <w:ind w:left="144" w:hanging="144"/>
+      </w:pPr>
+      <w:r>
+        <w:t xml:space="preserve">Reworded </w:t>
+      </w:r>
+      <w:r>
+        <w:t>warning</w:t>
+      </w:r>
+      <w:r>
+        <w:t>s</w:t>
+      </w:r>
+      <w:r>
+        <w:t xml:space="preserve"> printed to </w:t>
+      </w:r>
+      <w:r>
+        <w:t xml:space="preserve">the </w:t>
+      </w:r>
+      <w:r>
+        <w:t>results</w:t>
+      </w:r>
+      <w:r>
+        <w:t xml:space="preserve"> file when a data set has been excluded</w:t>
+      </w:r>
+      <w:r>
+        <w:t xml:space="preserve"> from the analysis</w:t>
+      </w:r>
+      <w:r>
+        <w:t>.</w:t>
+      </w:r>
+    </w:p>
+    <w:p>
+      <w:pPr>
+        <w:ind w:left="360" w:hanging="360"/>
+      </w:pPr>
+      <w:r>
+        <w:t>Temporal graphs load quicker.</w:t>
+      </w:r>
+    </w:p>
+    <w:p>
+      <w:pPr>
+        <w:ind w:left="360" w:hanging="360"/>
+        <w:rPr>
+          <w:b/>
+        </w:rPr>
+      </w:pPr>
+    </w:p>
+    <w:p>
+      <w:pPr>
+        <w:ind w:left="360" w:hanging="360"/>
+        <w:rPr>
+          <w:b/>
+        </w:rPr>
+      </w:pPr>
+      <w:r>
+        <w:rPr>
+          <w:b/>
+        </w:rPr>
+        <w:t>Version 10.1.3, February 2024</w:t>
+      </w:r>
+    </w:p>
+    <w:p>
+      <w:pPr>
+        <w:ind w:left="360" w:hanging="360"/>
+        <w:rPr>
+          <w:b/>
+          <w:sz w:val="12"/>
+          <w:szCs w:val="12"/>
+        </w:rPr>
+      </w:pPr>
+    </w:p>
+    <w:p>
+      <w:pPr>
         <w:rPr>
           <w:i/>
         </w:rPr>
@@ -3194,6 +3418,7 @@
         <w:rPr>
           <w:i/>
         </w:rPr>
+        <w:lastRenderedPageBreak/>
         <w:t>New Analytical Features</w:t>
       </w:r>
     </w:p>
@@ -4157,6 +4382,7 @@
         <w:rPr>
           <w:i/>
         </w:rPr>
+        <w:lastRenderedPageBreak/>
         <w:t>Minor Fixes</w:t>
       </w:r>
     </w:p>
@@ -4366,7 +4592,6 @@
         <w:ind w:left="360" w:hanging="360"/>
       </w:pPr>
       <w:r>
-        <w:lastRenderedPageBreak/>
         <w:t xml:space="preserve">Spatial output graph </w:t>
       </w:r>
       <w:r>
@@ -5217,6 +5442,7 @@
         <w:rPr>
           <w:b/>
         </w:rPr>
+        <w:lastRenderedPageBreak/>
         <w:t>Version 9.4.4, August 2016</w:t>
       </w:r>
     </w:p>
@@ -5389,7 +5615,6 @@
         <w:rPr>
           <w:bCs/>
         </w:rPr>
-        <w:lastRenderedPageBreak/>
         <w:t>Select command-line overrides caused ambiguous parameter error.</w:t>
       </w:r>
     </w:p>
@@ -5621,7 +5846,15 @@
       </w:r>
       <w:proofErr w:type="gramEnd"/>
       <w:r>
-        <w:t xml:space="preserve"> relative risks compares the risk in the step to risk outside the cluster.</w:t>
+        <w:t xml:space="preserve"> relative risks </w:t>
+      </w:r>
+      <w:proofErr w:type="gramStart"/>
+      <w:r>
+        <w:t>compares</w:t>
+      </w:r>
+      <w:proofErr w:type="gramEnd"/>
+      <w:r>
+        <w:t xml:space="preserve"> the risk in the step to risk outside the cluster.</w:t>
       </w:r>
     </w:p>
     <w:p>
@@ -5949,6 +6182,7 @@
         <w:rPr>
           <w:bCs/>
         </w:rPr>
+        <w:lastRenderedPageBreak/>
         <w:t xml:space="preserve">Ability to name the saved input files when using the import wizard. </w:t>
       </w:r>
     </w:p>
@@ -6238,7 +6472,6 @@
         <w:rPr>
           <w:color w:val="000000"/>
         </w:rPr>
-        <w:lastRenderedPageBreak/>
         <w:t>Total population reported with Iterative Scan Statistic was not adjusted for earlier iterations when using the Poisson model</w:t>
       </w:r>
       <w:r>
@@ -7199,8 +7432,8 @@
       <w:r>
         <w:t xml:space="preserve">Sequential </w:t>
       </w:r>
-      <w:smartTag w:uri="urn:schemas-microsoft-com:office:smarttags" w:element="City">
-        <w:smartTag w:uri="urn:schemas-microsoft-com:office:smarttags" w:element="place">
+      <w:smartTag w:uri="urn:schemas-microsoft-com:office:smarttags" w:element="place">
+        <w:smartTag w:uri="urn:schemas-microsoft-com:office:smarttags" w:element="City">
           <w:r>
             <w:t>Monte Carlo</w:t>
           </w:r>
@@ -7489,6 +7722,7 @@
         <w:ind w:left="360" w:hanging="360"/>
       </w:pPr>
       <w:r>
+        <w:lastRenderedPageBreak/>
         <w:t xml:space="preserve">Added missing parameter check with continuous Poisson model. </w:t>
       </w:r>
     </w:p>
@@ -7642,7 +7876,6 @@
         <w:rPr>
           <w:b/>
         </w:rPr>
-        <w:lastRenderedPageBreak/>
         <w:t>Version 8.0.2, November 9, 2009</w:t>
       </w:r>
     </w:p>
@@ -8026,6 +8259,7 @@
         <w:ind w:left="144" w:hanging="144"/>
       </w:pPr>
       <w:r>
+        <w:lastRenderedPageBreak/>
         <w:t>Correction of</w:t>
       </w:r>
       <w:r>
@@ -8533,6 +8767,7 @@
         <w:rPr>
           <w:b/>
         </w:rPr>
+        <w:lastRenderedPageBreak/>
         <w:t>Version 6.1.2, April 7, 2006</w:t>
       </w:r>
     </w:p>
@@ -8676,7 +8911,6 @@
         <w:ind w:left="144" w:hanging="144"/>
       </w:pPr>
       <w:r>
-        <w:lastRenderedPageBreak/>
         <w:t xml:space="preserve">Updated main file output to report cluster population in data set section, when using multiple data </w:t>
       </w:r>
       <w:r>
@@ -8981,6 +9215,7 @@
         <w:ind w:left="144" w:hanging="144"/>
       </w:pPr>
       <w:r>
+        <w:lastRenderedPageBreak/>
         <w:t>Utilization of parallel processors when available on the computer for faster computing times.</w:t>
       </w:r>
     </w:p>
@@ -9076,7 +9311,6 @@
         <w:rPr>
           <w:bCs/>
         </w:rPr>
-        <w:lastRenderedPageBreak/>
         <w:t>Revised reporting of cluster information multivariate analyses with multiple data sets.</w:t>
       </w:r>
     </w:p>
@@ -9395,6 +9629,7 @@
         <w:rPr>
           <w:bCs/>
         </w:rPr>
+        <w:lastRenderedPageBreak/>
         <w:t>Some dBase output fields changed to numerical.</w:t>
       </w:r>
     </w:p>
@@ -9864,6 +10099,7 @@
         <w:ind w:left="144" w:hanging="144"/>
       </w:pPr>
       <w:r>
+        <w:lastRenderedPageBreak/>
         <w:t xml:space="preserve">Adjustments for purely spatial, purely temporal or space-time clusters, using a special adjustments file with user specified relative risk adjustments for each spatial, temporal and/or space-time location. </w:t>
       </w:r>
     </w:p>
@@ -9936,7 +10172,6 @@
         <w:ind w:left="144" w:hanging="144"/>
       </w:pPr>
       <w:r>
-        <w:lastRenderedPageBreak/>
         <w:t xml:space="preserve">Option not to adjust for previous analyses when doing prospective analyses. This replaces the alive cluster option, which did the same thing but with more limited output information. </w:t>
       </w:r>
     </w:p>
@@ -10203,6 +10438,7 @@
         <w:ind w:left="360" w:hanging="360"/>
       </w:pPr>
       <w:r>
+        <w:lastRenderedPageBreak/>
         <w:t>Minor changes in the output files.</w:t>
       </w:r>
     </w:p>
@@ -10351,7 +10587,6 @@
         <w:ind w:left="144" w:hanging="144"/>
       </w:pPr>
       <w:r>
-        <w:lastRenderedPageBreak/>
         <w:t>Analysis history file created with brief information about each analysis run performed. It is automatically generated in dBase format.</w:t>
       </w:r>
     </w:p>
@@ -10592,6 +10827,7 @@
         <w:rPr>
           <w:i/>
         </w:rPr>
+        <w:lastRenderedPageBreak/>
         <w:t>Minor Fix</w:t>
       </w:r>
     </w:p>
@@ -10976,6 +11212,7 @@
         <w:ind w:left="360" w:hanging="360"/>
       </w:pPr>
       <w:r>
+        <w:lastRenderedPageBreak/>
         <w:t xml:space="preserve">Decreased memory use, leading to increased speed for some large data sets. </w:t>
       </w:r>
     </w:p>
@@ -11135,7 +11372,6 @@
         <w:rPr>
           <w:b/>
         </w:rPr>
-        <w:lastRenderedPageBreak/>
         <w:t>Version 2.1, July 29, 1998</w:t>
       </w:r>
     </w:p>
@@ -11468,6 +11704,7 @@
         <w:rPr>
           <w:bCs/>
         </w:rPr>
+        <w:lastRenderedPageBreak/>
         <w:t>SaTScan icon created</w:t>
       </w:r>
     </w:p>
@@ -11701,8 +11938,8 @@
         </w:rPr>
         <w:t xml:space="preserve">Sample data: Brain cancer incidence in </w:t>
       </w:r>
-      <w:smartTag w:uri="urn:schemas-microsoft-com:office:smarttags" w:element="place">
-        <w:smartTag w:uri="urn:schemas-microsoft-com:office:smarttags" w:element="State">
+      <w:smartTag w:uri="urn:schemas-microsoft-com:office:smarttags" w:element="State">
+        <w:smartTag w:uri="urn:schemas-microsoft-com:office:smarttags" w:element="place">
           <w:r>
             <w:rPr>
               <w:bCs/>

</xml_diff>